<commit_message>
started ui menus, task 1 doc started
</commit_message>
<xml_diff>
--- a/C950-Task-1-Sam-Merrill.docx
+++ b/C950-Task-1-Sam-Merrill.docx
@@ -363,92 +363,275 @@
     </w:p>
     <w:p>
       <w:pPr>
+        <w:pStyle w:val="Style1"/>
+      </w:pPr>
+      <w:r>
+        <w:t>A</w:t>
+      </w:r>
+      <w:r>
+        <w:t>. A</w:t>
+      </w:r>
+      <w:r>
+        <w:t>lgorithm Identification</w:t>
+      </w:r>
+    </w:p>
+    <w:p>
+      <w:pPr>
+        <w:spacing w:line="360" w:lineRule="auto"/>
+        <w:rPr>
+          <w:rFonts w:ascii="Arial" w:hAnsi="Arial" w:cs="Arial"/>
+          <w:sz w:val="28"/>
+          <w:szCs w:val="28"/>
+        </w:rPr>
+      </w:pPr>
+      <w:r>
+        <w:rPr>
+          <w:rFonts w:ascii="Arial" w:hAnsi="Arial" w:cs="Arial"/>
+          <w:sz w:val="28"/>
+          <w:szCs w:val="28"/>
+        </w:rPr>
+        <w:t>Identify a named self-adjusting algorithm (e.g., nearest neighbor algorithm, greedy algorithm) that could be used to create your program to deliver the packages.</w:t>
+      </w:r>
+    </w:p>
+    <w:p>
+      <w:pPr>
+        <w:pStyle w:val="Style1"/>
+      </w:pPr>
+      <w:r>
+        <w:t xml:space="preserve">B. </w:t>
+      </w:r>
+      <w:r>
+        <w:t>Data Structure Identification</w:t>
+      </w:r>
+    </w:p>
+    <w:p>
+      <w:pPr>
+        <w:spacing w:line="360" w:lineRule="auto"/>
+      </w:pPr>
+      <w:r>
+        <w:rPr>
+          <w:rFonts w:ascii="Arial" w:hAnsi="Arial" w:cs="Arial"/>
+          <w:sz w:val="28"/>
+          <w:szCs w:val="28"/>
+        </w:rPr>
+        <w:t>Identify a self-adjusting data structure, such as a hash table, that could be used with the algorithm identified in part A to store the package data.</w:t>
+      </w:r>
+      <w:r>
+        <w:t xml:space="preserve"> </w:t>
+      </w:r>
+    </w:p>
+    <w:p>
+      <w:pPr>
+        <w:spacing w:line="360" w:lineRule="auto"/>
+        <w:rPr>
+          <w:rFonts w:ascii="Arial" w:hAnsi="Arial" w:cs="Arial"/>
+          <w:sz w:val="28"/>
+          <w:szCs w:val="28"/>
+        </w:rPr>
+      </w:pPr>
+    </w:p>
+    <w:p>
+      <w:pPr>
+        <w:pStyle w:val="Style1"/>
+      </w:pPr>
+      <w:r>
+        <w:t>B</w:t>
+      </w:r>
+      <w:r>
+        <w:t>1</w:t>
+      </w:r>
+      <w:r>
+        <w:t xml:space="preserve">. </w:t>
+      </w:r>
+      <w:r>
+        <w:t>Explanation of Data Structure</w:t>
+      </w:r>
+    </w:p>
+    <w:p>
+      <w:pPr>
+        <w:spacing w:line="360" w:lineRule="auto"/>
+        <w:rPr>
+          <w:rFonts w:ascii="Arial" w:hAnsi="Arial" w:cs="Arial"/>
+          <w:sz w:val="28"/>
+          <w:szCs w:val="28"/>
+        </w:rPr>
+      </w:pPr>
+      <w:r>
+        <w:rPr>
+          <w:rFonts w:ascii="Arial" w:hAnsi="Arial" w:cs="Arial"/>
+          <w:sz w:val="28"/>
+          <w:szCs w:val="28"/>
+        </w:rPr>
+        <w:t xml:space="preserve">Explain how your data structure accounts for the relationship between the data components you are storing. </w:t>
+      </w:r>
+    </w:p>
+    <w:p>
+      <w:pPr>
+        <w:pStyle w:val="Style1"/>
+      </w:pPr>
+    </w:p>
+    <w:p>
+      <w:pPr>
         <w:pStyle w:val="Heading1"/>
-        <w:spacing w:line="360" w:lineRule="auto"/>
-        <w:rPr>
-          <w:rFonts w:ascii="Arial" w:hAnsi="Arial" w:cs="Arial"/>
-          <w:sz w:val="28"/>
-          <w:szCs w:val="28"/>
-        </w:rPr>
-      </w:pPr>
-      <w:r>
-        <w:rPr>
-          <w:rFonts w:ascii="Arial" w:hAnsi="Arial" w:cs="Arial"/>
-          <w:sz w:val="28"/>
-          <w:szCs w:val="28"/>
-        </w:rPr>
-        <w:t xml:space="preserve">A. </w:t>
-      </w:r>
-      <w:r>
-        <w:rPr>
-          <w:rFonts w:ascii="Arial" w:hAnsi="Arial" w:cs="Arial"/>
-          <w:sz w:val="28"/>
-          <w:szCs w:val="28"/>
-        </w:rPr>
-        <w:t>Algorithm Identification</w:t>
-      </w:r>
-    </w:p>
-    <w:p>
-      <w:pPr>
-        <w:spacing w:line="360" w:lineRule="auto"/>
-        <w:rPr>
-          <w:rFonts w:ascii="Arial" w:hAnsi="Arial" w:cs="Arial"/>
-          <w:sz w:val="28"/>
-          <w:szCs w:val="28"/>
-        </w:rPr>
-      </w:pPr>
-      <w:r>
-        <w:rPr>
-          <w:rFonts w:ascii="Arial" w:hAnsi="Arial" w:cs="Arial"/>
-          <w:sz w:val="28"/>
-          <w:szCs w:val="28"/>
-        </w:rPr>
-        <w:t>Text goes here</w:t>
-      </w:r>
-    </w:p>
+        <w:rPr>
+          <w:rFonts w:ascii="Arial" w:hAnsi="Arial" w:cs="Arial"/>
+          <w:sz w:val="28"/>
+          <w:szCs w:val="28"/>
+        </w:rPr>
+      </w:pPr>
+      <w:r>
+        <w:rPr>
+          <w:rFonts w:ascii="Arial" w:hAnsi="Arial" w:cs="Arial"/>
+          <w:sz w:val="28"/>
+          <w:szCs w:val="28"/>
+        </w:rPr>
+        <w:t>C</w:t>
+      </w:r>
+      <w:r>
+        <w:rPr>
+          <w:rFonts w:ascii="Arial" w:hAnsi="Arial" w:cs="Arial"/>
+          <w:sz w:val="28"/>
+          <w:szCs w:val="28"/>
+        </w:rPr>
+        <w:t>1</w:t>
+      </w:r>
+      <w:r>
+        <w:rPr>
+          <w:rFonts w:ascii="Arial" w:hAnsi="Arial" w:cs="Arial"/>
+          <w:sz w:val="28"/>
+          <w:szCs w:val="28"/>
+        </w:rPr>
+        <w:t xml:space="preserve">. </w:t>
+      </w:r>
+      <w:r>
+        <w:rPr>
+          <w:rFonts w:ascii="Arial" w:hAnsi="Arial" w:cs="Arial"/>
+          <w:sz w:val="28"/>
+          <w:szCs w:val="28"/>
+        </w:rPr>
+        <w:t>Algorithm’s Logic</w:t>
+      </w:r>
+    </w:p>
+    <w:p>
+      <w:pPr>
+        <w:spacing w:line="360" w:lineRule="auto"/>
+        <w:rPr>
+          <w:rFonts w:ascii="Arial" w:hAnsi="Arial" w:cs="Arial"/>
+          <w:sz w:val="28"/>
+          <w:szCs w:val="28"/>
+        </w:rPr>
+      </w:pPr>
+      <w:r>
+        <w:rPr>
+          <w:rFonts w:ascii="Arial" w:hAnsi="Arial" w:cs="Arial"/>
+          <w:sz w:val="28"/>
+          <w:szCs w:val="28"/>
+        </w:rPr>
+        <w:t>Explain the algorithm’s logic using pseudocode.</w:t>
+      </w:r>
+    </w:p>
+    <w:p>
+      <w:pPr>
+        <w:spacing w:line="360" w:lineRule="auto"/>
+        <w:rPr>
+          <w:rFonts w:ascii="Arial" w:hAnsi="Arial" w:cs="Arial"/>
+          <w:sz w:val="28"/>
+          <w:szCs w:val="28"/>
+        </w:rPr>
+      </w:pPr>
+    </w:p>
+    <w:p/>
     <w:p>
       <w:pPr>
         <w:pStyle w:val="Heading1"/>
-        <w:spacing w:line="360" w:lineRule="auto"/>
-        <w:rPr>
-          <w:rFonts w:ascii="Arial" w:hAnsi="Arial" w:cs="Arial"/>
-          <w:sz w:val="28"/>
-          <w:szCs w:val="28"/>
-        </w:rPr>
-      </w:pPr>
-      <w:r>
-        <w:rPr>
-          <w:rFonts w:ascii="Arial" w:hAnsi="Arial" w:cs="Arial"/>
-          <w:sz w:val="28"/>
-          <w:szCs w:val="28"/>
-        </w:rPr>
-        <w:t xml:space="preserve">B. </w:t>
-      </w:r>
-      <w:r>
-        <w:rPr>
-          <w:rFonts w:ascii="Arial" w:hAnsi="Arial" w:cs="Arial"/>
-          <w:sz w:val="28"/>
-          <w:szCs w:val="28"/>
-        </w:rPr>
-        <w:t>Data Structure Identification</w:t>
-      </w:r>
-    </w:p>
-    <w:p>
-      <w:pPr>
-        <w:spacing w:line="360" w:lineRule="auto"/>
-        <w:rPr>
-          <w:rFonts w:ascii="Arial" w:hAnsi="Arial" w:cs="Arial"/>
-          <w:sz w:val="28"/>
-          <w:szCs w:val="28"/>
-        </w:rPr>
-      </w:pPr>
-      <w:r>
-        <w:rPr>
-          <w:rFonts w:ascii="Arial" w:hAnsi="Arial" w:cs="Arial"/>
-          <w:sz w:val="28"/>
-          <w:szCs w:val="28"/>
-        </w:rPr>
-        <w:t>Text goes here</w:t>
+        <w:rPr>
+          <w:rFonts w:ascii="Arial" w:hAnsi="Arial" w:cs="Arial"/>
+          <w:sz w:val="28"/>
+          <w:szCs w:val="28"/>
+        </w:rPr>
+      </w:pPr>
+      <w:r>
+        <w:rPr>
+          <w:rFonts w:ascii="Arial" w:hAnsi="Arial" w:cs="Arial"/>
+          <w:sz w:val="28"/>
+          <w:szCs w:val="28"/>
+        </w:rPr>
+        <w:lastRenderedPageBreak/>
+        <w:t>C</w:t>
+      </w:r>
+      <w:r>
+        <w:rPr>
+          <w:rFonts w:ascii="Arial" w:hAnsi="Arial" w:cs="Arial"/>
+          <w:sz w:val="28"/>
+          <w:szCs w:val="28"/>
+        </w:rPr>
+        <w:t>2</w:t>
+      </w:r>
+      <w:r>
+        <w:rPr>
+          <w:rFonts w:ascii="Arial" w:hAnsi="Arial" w:cs="Arial"/>
+          <w:sz w:val="28"/>
+          <w:szCs w:val="28"/>
+        </w:rPr>
+        <w:t xml:space="preserve">. </w:t>
+      </w:r>
+      <w:r>
+        <w:rPr>
+          <w:rFonts w:ascii="Arial" w:hAnsi="Arial" w:cs="Arial"/>
+          <w:sz w:val="28"/>
+          <w:szCs w:val="28"/>
+        </w:rPr>
+        <w:t>Development Environment</w:t>
+      </w:r>
+    </w:p>
+    <w:p>
+      <w:pPr>
+        <w:spacing w:line="360" w:lineRule="auto"/>
+        <w:rPr>
+          <w:rFonts w:ascii="Arial" w:hAnsi="Arial" w:cs="Arial"/>
+          <w:sz w:val="28"/>
+          <w:szCs w:val="28"/>
+        </w:rPr>
+      </w:pPr>
+      <w:r>
+        <w:rPr>
+          <w:rFonts w:ascii="Arial" w:hAnsi="Arial" w:cs="Arial"/>
+          <w:sz w:val="28"/>
+          <w:szCs w:val="28"/>
+        </w:rPr>
+        <w:t>The programming environment I’ve chosen to use is PyCharm, as</w:t>
+      </w:r>
+      <w:r>
+        <w:rPr>
+          <w:rFonts w:ascii="Arial" w:hAnsi="Arial" w:cs="Arial"/>
+          <w:sz w:val="28"/>
+          <w:szCs w:val="28"/>
+        </w:rPr>
+        <w:t xml:space="preserve"> it ** have a multitude of features specific to Python**. It also includes a built in terminal environment which </w:t>
+      </w:r>
+      <w:r>
+        <w:rPr>
+          <w:rFonts w:ascii="Arial" w:hAnsi="Arial" w:cs="Arial"/>
+          <w:sz w:val="28"/>
+          <w:szCs w:val="28"/>
+        </w:rPr>
+        <w:t>helps with using git for version control. The hardware of my</w:t>
+      </w:r>
+      <w:r>
+        <w:rPr>
+          <w:rFonts w:ascii="Arial" w:hAnsi="Arial" w:cs="Arial"/>
+          <w:sz w:val="28"/>
+          <w:szCs w:val="28"/>
+        </w:rPr>
+        <w:t xml:space="preserve"> device (laptop) is ********</w:t>
+      </w:r>
+      <w:r>
+        <w:rPr>
+          <w:rFonts w:ascii="Arial" w:hAnsi="Arial" w:cs="Arial"/>
+          <w:sz w:val="28"/>
+          <w:szCs w:val="28"/>
+        </w:rPr>
+        <w:t xml:space="preserve"> </w:t>
       </w:r>
     </w:p>
     <w:p>
@@ -467,15 +650,15 @@
           <w:sz w:val="28"/>
           <w:szCs w:val="28"/>
         </w:rPr>
-        <w:t>B</w:t>
-      </w:r>
-      <w:r>
-        <w:rPr>
-          <w:rFonts w:ascii="Arial" w:hAnsi="Arial" w:cs="Arial"/>
-          <w:sz w:val="28"/>
-          <w:szCs w:val="28"/>
-        </w:rPr>
-        <w:t>1</w:t>
+        <w:t>C</w:t>
+      </w:r>
+      <w:r>
+        <w:rPr>
+          <w:rFonts w:ascii="Arial" w:hAnsi="Arial" w:cs="Arial"/>
+          <w:sz w:val="28"/>
+          <w:szCs w:val="28"/>
+        </w:rPr>
+        <w:t>3</w:t>
       </w:r>
       <w:r>
         <w:rPr>
@@ -491,27 +674,28 @@
           <w:sz w:val="28"/>
           <w:szCs w:val="28"/>
         </w:rPr>
-        <w:t>Explanation of Data Structure</w:t>
-      </w:r>
-    </w:p>
-    <w:p>
-      <w:pPr>
-        <w:spacing w:line="360" w:lineRule="auto"/>
-        <w:rPr>
-          <w:rFonts w:ascii="Arial" w:hAnsi="Arial" w:cs="Arial"/>
-          <w:sz w:val="28"/>
-          <w:szCs w:val="28"/>
-        </w:rPr>
-      </w:pPr>
-      <w:r>
-        <w:rPr>
-          <w:rFonts w:ascii="Arial" w:hAnsi="Arial" w:cs="Arial"/>
-          <w:sz w:val="28"/>
-          <w:szCs w:val="28"/>
-        </w:rPr>
-        <w:t>Text goes here</w:t>
-      </w:r>
-    </w:p>
+        <w:t>Space and Time complexity using Big-O notation</w:t>
+      </w:r>
+    </w:p>
+    <w:p>
+      <w:pPr>
+        <w:spacing w:line="360" w:lineRule="auto"/>
+        <w:rPr>
+          <w:rFonts w:ascii="Arial" w:hAnsi="Arial" w:cs="Arial"/>
+          <w:sz w:val="28"/>
+          <w:szCs w:val="28"/>
+        </w:rPr>
+      </w:pPr>
+      <w:r>
+        <w:rPr>
+          <w:rFonts w:ascii="Arial" w:hAnsi="Arial" w:cs="Arial"/>
+          <w:sz w:val="28"/>
+          <w:szCs w:val="28"/>
+        </w:rPr>
+        <w:t>Evaluate the space-time complexity of each major segment of the program and the entire program using big-O notation.</w:t>
+      </w:r>
+    </w:p>
+    <w:p/>
     <w:p>
       <w:pPr>
         <w:pStyle w:val="Heading1"/>
@@ -528,57 +712,25 @@
           <w:sz w:val="28"/>
           <w:szCs w:val="28"/>
         </w:rPr>
-        <w:t>C</w:t>
-      </w:r>
-      <w:r>
-        <w:rPr>
-          <w:rFonts w:ascii="Arial" w:hAnsi="Arial" w:cs="Arial"/>
-          <w:sz w:val="28"/>
-          <w:szCs w:val="28"/>
-        </w:rPr>
-        <w:t>1</w:t>
-      </w:r>
-      <w:r>
-        <w:rPr>
-          <w:rFonts w:ascii="Arial" w:hAnsi="Arial" w:cs="Arial"/>
-          <w:sz w:val="28"/>
-          <w:szCs w:val="28"/>
-        </w:rPr>
-        <w:t xml:space="preserve">. </w:t>
-      </w:r>
-      <w:r>
-        <w:rPr>
-          <w:rFonts w:ascii="Arial" w:hAnsi="Arial" w:cs="Arial"/>
-          <w:sz w:val="28"/>
-          <w:szCs w:val="28"/>
-        </w:rPr>
-        <w:t>Algorithm’s Logic</w:t>
-      </w:r>
-    </w:p>
-    <w:p>
-      <w:pPr>
-        <w:spacing w:line="360" w:lineRule="auto"/>
-        <w:rPr>
-          <w:rFonts w:ascii="Arial" w:hAnsi="Arial" w:cs="Arial"/>
-          <w:sz w:val="28"/>
-          <w:szCs w:val="28"/>
-        </w:rPr>
-      </w:pPr>
-      <w:r>
-        <w:rPr>
-          <w:rFonts w:ascii="Arial" w:hAnsi="Arial" w:cs="Arial"/>
-          <w:sz w:val="28"/>
-          <w:szCs w:val="28"/>
-        </w:rPr>
-        <w:t>Pseudocode</w:t>
-      </w:r>
-      <w:r>
-        <w:rPr>
-          <w:rFonts w:ascii="Arial" w:hAnsi="Arial" w:cs="Arial"/>
-          <w:sz w:val="28"/>
-          <w:szCs w:val="28"/>
-        </w:rPr>
-        <w:t xml:space="preserve"> goes here</w:t>
+        <w:t>C4. Scalability and Adaptability</w:t>
+      </w:r>
+    </w:p>
+    <w:p>
+      <w:pPr>
+        <w:spacing w:line="360" w:lineRule="auto"/>
+        <w:rPr>
+          <w:rFonts w:ascii="Arial" w:hAnsi="Arial" w:cs="Arial"/>
+          <w:sz w:val="28"/>
+          <w:szCs w:val="28"/>
+        </w:rPr>
+      </w:pPr>
+      <w:r>
+        <w:rPr>
+          <w:rFonts w:ascii="Arial" w:hAnsi="Arial" w:cs="Arial"/>
+          <w:sz w:val="28"/>
+          <w:szCs w:val="28"/>
+        </w:rPr>
+        <w:t>Explain the capability of your solution to scale and adapt to a growing number of packages.</w:t>
       </w:r>
     </w:p>
     <w:p>
@@ -597,49 +749,25 @@
           <w:sz w:val="28"/>
           <w:szCs w:val="28"/>
         </w:rPr>
-        <w:t>C</w:t>
-      </w:r>
-      <w:r>
-        <w:rPr>
-          <w:rFonts w:ascii="Arial" w:hAnsi="Arial" w:cs="Arial"/>
-          <w:sz w:val="28"/>
-          <w:szCs w:val="28"/>
-        </w:rPr>
-        <w:t>2</w:t>
-      </w:r>
-      <w:r>
-        <w:rPr>
-          <w:rFonts w:ascii="Arial" w:hAnsi="Arial" w:cs="Arial"/>
-          <w:sz w:val="28"/>
-          <w:szCs w:val="28"/>
-        </w:rPr>
-        <w:t xml:space="preserve">. </w:t>
-      </w:r>
-      <w:r>
-        <w:rPr>
-          <w:rFonts w:ascii="Arial" w:hAnsi="Arial" w:cs="Arial"/>
-          <w:sz w:val="28"/>
-          <w:szCs w:val="28"/>
-        </w:rPr>
-        <w:t>Development Environment</w:t>
-      </w:r>
-    </w:p>
-    <w:p>
-      <w:pPr>
-        <w:spacing w:line="360" w:lineRule="auto"/>
-        <w:rPr>
-          <w:rFonts w:ascii="Arial" w:hAnsi="Arial" w:cs="Arial"/>
-          <w:sz w:val="28"/>
-          <w:szCs w:val="28"/>
-        </w:rPr>
-      </w:pPr>
-      <w:r>
-        <w:rPr>
-          <w:rFonts w:ascii="Arial" w:hAnsi="Arial" w:cs="Arial"/>
-          <w:sz w:val="28"/>
-          <w:szCs w:val="28"/>
-        </w:rPr>
-        <w:t>Text goes here</w:t>
+        <w:t xml:space="preserve">C5. Software Efficiency and Maintainability </w:t>
+      </w:r>
+    </w:p>
+    <w:p>
+      <w:pPr>
+        <w:spacing w:line="360" w:lineRule="auto"/>
+        <w:rPr>
+          <w:rFonts w:ascii="Arial" w:hAnsi="Arial" w:cs="Arial"/>
+          <w:sz w:val="28"/>
+          <w:szCs w:val="28"/>
+        </w:rPr>
+      </w:pPr>
+      <w:r>
+        <w:rPr>
+          <w:rFonts w:ascii="Arial" w:hAnsi="Arial" w:cs="Arial"/>
+          <w:sz w:val="28"/>
+          <w:szCs w:val="28"/>
+        </w:rPr>
+        <w:t>Discuss why the software design would be efficient and easy to maintain.</w:t>
       </w:r>
     </w:p>
     <w:p>
@@ -658,50 +786,62 @@
           <w:sz w:val="28"/>
           <w:szCs w:val="28"/>
         </w:rPr>
-        <w:t>C</w:t>
-      </w:r>
-      <w:r>
-        <w:rPr>
-          <w:rFonts w:ascii="Arial" w:hAnsi="Arial" w:cs="Arial"/>
-          <w:sz w:val="28"/>
-          <w:szCs w:val="28"/>
-        </w:rPr>
-        <w:t>3</w:t>
-      </w:r>
-      <w:r>
-        <w:rPr>
-          <w:rFonts w:ascii="Arial" w:hAnsi="Arial" w:cs="Arial"/>
-          <w:sz w:val="28"/>
-          <w:szCs w:val="28"/>
-        </w:rPr>
-        <w:t xml:space="preserve">. </w:t>
-      </w:r>
-      <w:r>
-        <w:rPr>
-          <w:rFonts w:ascii="Arial" w:hAnsi="Arial" w:cs="Arial"/>
-          <w:sz w:val="28"/>
-          <w:szCs w:val="28"/>
-        </w:rPr>
-        <w:t>Space and Time complexity using Big-O notation</w:t>
-      </w:r>
-    </w:p>
-    <w:p>
-      <w:pPr>
-        <w:spacing w:line="360" w:lineRule="auto"/>
-        <w:rPr>
-          <w:rFonts w:ascii="Arial" w:hAnsi="Arial" w:cs="Arial"/>
-          <w:sz w:val="28"/>
-          <w:szCs w:val="28"/>
-        </w:rPr>
-      </w:pPr>
-      <w:r>
-        <w:rPr>
-          <w:rFonts w:ascii="Arial" w:hAnsi="Arial" w:cs="Arial"/>
-          <w:sz w:val="28"/>
-          <w:szCs w:val="28"/>
-        </w:rPr>
-        <w:t>Text goes here</w:t>
-      </w:r>
+        <w:t xml:space="preserve">C6. Self-Adjusting Data Structures </w:t>
+      </w:r>
+    </w:p>
+    <w:p>
+      <w:pPr>
+        <w:spacing w:line="360" w:lineRule="auto"/>
+        <w:rPr>
+          <w:rFonts w:ascii="Arial" w:hAnsi="Arial" w:cs="Arial"/>
+          <w:sz w:val="28"/>
+          <w:szCs w:val="28"/>
+        </w:rPr>
+      </w:pPr>
+      <w:r>
+        <w:rPr>
+          <w:rFonts w:ascii="Arial" w:hAnsi="Arial" w:cs="Arial"/>
+          <w:sz w:val="28"/>
+          <w:szCs w:val="28"/>
+        </w:rPr>
+        <w:t>Describe </w:t>
+      </w:r>
+      <w:r>
+        <w:rPr>
+          <w:rFonts w:ascii="Arial" w:hAnsi="Arial" w:cs="Arial"/>
+          <w:i/>
+          <w:iCs/>
+          <w:sz w:val="28"/>
+          <w:szCs w:val="28"/>
+        </w:rPr>
+        <w:t>both</w:t>
+      </w:r>
+      <w:r>
+        <w:rPr>
+          <w:rFonts w:ascii="Arial" w:hAnsi="Arial" w:cs="Arial"/>
+          <w:sz w:val="28"/>
+          <w:szCs w:val="28"/>
+        </w:rPr>
+        <w:t> the strengths and weaknesses of the self-adjusting data structure (e.g., the hash table).</w:t>
+      </w:r>
+      <w:r>
+        <w:rPr>
+          <w:rFonts w:ascii="Arial" w:hAnsi="Arial" w:cs="Arial"/>
+          <w:sz w:val="28"/>
+          <w:szCs w:val="28"/>
+        </w:rPr>
+        <w:t xml:space="preserve"> _ </w:t>
+      </w:r>
+    </w:p>
+    <w:p>
+      <w:pPr>
+        <w:spacing w:line="360" w:lineRule="auto"/>
+        <w:rPr>
+          <w:rFonts w:ascii="Arial" w:hAnsi="Arial" w:cs="Arial"/>
+          <w:sz w:val="28"/>
+          <w:szCs w:val="28"/>
+        </w:rPr>
+      </w:pPr>
     </w:p>
     <w:p>
       <w:pPr>
@@ -719,26 +859,152 @@
           <w:sz w:val="28"/>
           <w:szCs w:val="28"/>
         </w:rPr>
-        <w:t>C4. Scalability and Adaptability</w:t>
-      </w:r>
-    </w:p>
-    <w:p>
-      <w:pPr>
-        <w:spacing w:line="360" w:lineRule="auto"/>
-        <w:rPr>
-          <w:rFonts w:ascii="Arial" w:hAnsi="Arial" w:cs="Arial"/>
-          <w:sz w:val="28"/>
-          <w:szCs w:val="28"/>
-        </w:rPr>
-      </w:pPr>
-      <w:r>
-        <w:rPr>
-          <w:rFonts w:ascii="Arial" w:hAnsi="Arial" w:cs="Arial"/>
-          <w:sz w:val="28"/>
-          <w:szCs w:val="28"/>
-        </w:rPr>
-        <w:t>Text goes here</w:t>
-      </w:r>
+        <w:t>C7. Data Key</w:t>
+      </w:r>
+    </w:p>
+    <w:p>
+      <w:pPr>
+        <w:spacing w:line="360" w:lineRule="auto"/>
+        <w:rPr>
+          <w:rFonts w:ascii="Arial" w:hAnsi="Arial" w:cs="Arial"/>
+          <w:sz w:val="28"/>
+          <w:szCs w:val="28"/>
+        </w:rPr>
+      </w:pPr>
+      <w:r>
+        <w:rPr>
+          <w:rFonts w:ascii="Arial" w:hAnsi="Arial" w:cs="Arial"/>
+          <w:sz w:val="28"/>
+          <w:szCs w:val="28"/>
+        </w:rPr>
+        <w:t>Justify the choice of a key for efficient delivery management from the following components:</w:t>
+      </w:r>
+      <w:r>
+        <w:rPr>
+          <w:rFonts w:ascii="Arial" w:hAnsi="Arial" w:cs="Arial"/>
+          <w:sz w:val="28"/>
+          <w:szCs w:val="28"/>
+        </w:rPr>
+        <w:t xml:space="preserve"> </w:t>
+      </w:r>
+      <w:r>
+        <w:rPr>
+          <w:rFonts w:ascii="Arial" w:hAnsi="Arial" w:cs="Arial"/>
+          <w:sz w:val="28"/>
+          <w:szCs w:val="28"/>
+        </w:rPr>
+        <w:t>delivery address</w:t>
+      </w:r>
+      <w:r>
+        <w:rPr>
+          <w:rFonts w:ascii="Arial" w:hAnsi="Arial" w:cs="Arial"/>
+          <w:sz w:val="28"/>
+          <w:szCs w:val="28"/>
+        </w:rPr>
+        <w:t xml:space="preserve">, </w:t>
+      </w:r>
+      <w:r>
+        <w:rPr>
+          <w:rFonts w:ascii="Arial" w:hAnsi="Arial" w:cs="Arial"/>
+          <w:sz w:val="28"/>
+          <w:szCs w:val="28"/>
+        </w:rPr>
+        <w:t>delivery deadline</w:t>
+      </w:r>
+      <w:r>
+        <w:rPr>
+          <w:rFonts w:ascii="Arial" w:hAnsi="Arial" w:cs="Arial"/>
+          <w:sz w:val="28"/>
+          <w:szCs w:val="28"/>
+        </w:rPr>
+        <w:t xml:space="preserve">, </w:t>
+      </w:r>
+      <w:r>
+        <w:rPr>
+          <w:rFonts w:ascii="Arial" w:hAnsi="Arial" w:cs="Arial"/>
+          <w:sz w:val="28"/>
+          <w:szCs w:val="28"/>
+        </w:rPr>
+        <w:t>delivery city</w:t>
+      </w:r>
+      <w:r>
+        <w:rPr>
+          <w:rFonts w:ascii="Arial" w:hAnsi="Arial" w:cs="Arial"/>
+          <w:sz w:val="28"/>
+          <w:szCs w:val="28"/>
+        </w:rPr>
+        <w:t xml:space="preserve">, </w:t>
+      </w:r>
+      <w:r>
+        <w:rPr>
+          <w:rFonts w:ascii="Arial" w:hAnsi="Arial" w:cs="Arial"/>
+          <w:sz w:val="28"/>
+          <w:szCs w:val="28"/>
+        </w:rPr>
+        <w:lastRenderedPageBreak/>
+        <w:t>delivery zip code</w:t>
+      </w:r>
+      <w:r>
+        <w:rPr>
+          <w:rFonts w:ascii="Arial" w:hAnsi="Arial" w:cs="Arial"/>
+          <w:sz w:val="28"/>
+          <w:szCs w:val="28"/>
+        </w:rPr>
+        <w:t xml:space="preserve">, </w:t>
+      </w:r>
+      <w:r>
+        <w:rPr>
+          <w:rFonts w:ascii="Arial" w:hAnsi="Arial" w:cs="Arial"/>
+          <w:b/>
+          <w:bCs/>
+          <w:sz w:val="28"/>
+          <w:szCs w:val="28"/>
+          <w:u w:val="single"/>
+        </w:rPr>
+        <w:t>package ID</w:t>
+      </w:r>
+      <w:r>
+        <w:rPr>
+          <w:rFonts w:ascii="Arial" w:hAnsi="Arial" w:cs="Arial"/>
+          <w:sz w:val="28"/>
+          <w:szCs w:val="28"/>
+        </w:rPr>
+        <w:t xml:space="preserve">, </w:t>
+      </w:r>
+      <w:r>
+        <w:rPr>
+          <w:rFonts w:ascii="Arial" w:hAnsi="Arial" w:cs="Arial"/>
+          <w:sz w:val="28"/>
+          <w:szCs w:val="28"/>
+        </w:rPr>
+        <w:t>package weight</w:t>
+      </w:r>
+      <w:r>
+        <w:rPr>
+          <w:rFonts w:ascii="Arial" w:hAnsi="Arial" w:cs="Arial"/>
+          <w:sz w:val="28"/>
+          <w:szCs w:val="28"/>
+        </w:rPr>
+        <w:t xml:space="preserve">, </w:t>
+      </w:r>
+      <w:r>
+        <w:rPr>
+          <w:rFonts w:ascii="Arial" w:hAnsi="Arial" w:cs="Arial"/>
+          <w:sz w:val="28"/>
+          <w:szCs w:val="28"/>
+        </w:rPr>
+        <w:t>delivery status (i.e., delayed, at the hub, en route, or delivered), including the delivery time</w:t>
+      </w:r>
+    </w:p>
+    <w:p>
+      <w:pPr>
+        <w:spacing w:line="360" w:lineRule="auto"/>
+        <w:rPr>
+          <w:rFonts w:ascii="Arial" w:hAnsi="Arial" w:cs="Arial"/>
+          <w:sz w:val="28"/>
+          <w:szCs w:val="28"/>
+        </w:rPr>
+      </w:pPr>
     </w:p>
     <w:p>
       <w:pPr>
@@ -756,128 +1022,6 @@
           <w:sz w:val="28"/>
           <w:szCs w:val="28"/>
         </w:rPr>
-        <w:lastRenderedPageBreak/>
-        <w:t xml:space="preserve">C5. Software Efficiency and Maintainability </w:t>
-      </w:r>
-    </w:p>
-    <w:p>
-      <w:pPr>
-        <w:spacing w:line="360" w:lineRule="auto"/>
-        <w:rPr>
-          <w:rFonts w:ascii="Arial" w:hAnsi="Arial" w:cs="Arial"/>
-          <w:sz w:val="28"/>
-          <w:szCs w:val="28"/>
-        </w:rPr>
-      </w:pPr>
-      <w:r>
-        <w:rPr>
-          <w:rFonts w:ascii="Arial" w:hAnsi="Arial" w:cs="Arial"/>
-          <w:sz w:val="28"/>
-          <w:szCs w:val="28"/>
-        </w:rPr>
-        <w:t>Text goes here</w:t>
-      </w:r>
-    </w:p>
-    <w:p>
-      <w:pPr>
-        <w:pStyle w:val="Heading1"/>
-        <w:spacing w:line="360" w:lineRule="auto"/>
-        <w:rPr>
-          <w:rFonts w:ascii="Arial" w:hAnsi="Arial" w:cs="Arial"/>
-          <w:sz w:val="28"/>
-          <w:szCs w:val="28"/>
-        </w:rPr>
-      </w:pPr>
-      <w:r>
-        <w:rPr>
-          <w:rFonts w:ascii="Arial" w:hAnsi="Arial" w:cs="Arial"/>
-          <w:sz w:val="28"/>
-          <w:szCs w:val="28"/>
-        </w:rPr>
-        <w:t xml:space="preserve">C6. Self-Adjusting Data Structures </w:t>
-      </w:r>
-    </w:p>
-    <w:p>
-      <w:pPr>
-        <w:spacing w:line="360" w:lineRule="auto"/>
-        <w:rPr>
-          <w:rFonts w:ascii="Arial" w:hAnsi="Arial" w:cs="Arial"/>
-          <w:sz w:val="28"/>
-          <w:szCs w:val="28"/>
-        </w:rPr>
-      </w:pPr>
-      <w:r>
-        <w:rPr>
-          <w:rFonts w:ascii="Arial" w:hAnsi="Arial" w:cs="Arial"/>
-          <w:sz w:val="28"/>
-          <w:szCs w:val="28"/>
-        </w:rPr>
-        <w:t>Text goes here</w:t>
-      </w:r>
-    </w:p>
-    <w:p>
-      <w:pPr>
-        <w:pStyle w:val="Heading1"/>
-        <w:spacing w:line="360" w:lineRule="auto"/>
-        <w:rPr>
-          <w:rFonts w:ascii="Arial" w:hAnsi="Arial" w:cs="Arial"/>
-          <w:sz w:val="28"/>
-          <w:szCs w:val="28"/>
-        </w:rPr>
-      </w:pPr>
-      <w:r>
-        <w:rPr>
-          <w:rFonts w:ascii="Arial" w:hAnsi="Arial" w:cs="Arial"/>
-          <w:sz w:val="28"/>
-          <w:szCs w:val="28"/>
-        </w:rPr>
-        <w:t>C7. Data Key</w:t>
-      </w:r>
-    </w:p>
-    <w:p>
-      <w:pPr>
-        <w:spacing w:line="360" w:lineRule="auto"/>
-        <w:rPr>
-          <w:rFonts w:ascii="Arial" w:hAnsi="Arial" w:cs="Arial"/>
-          <w:sz w:val="28"/>
-          <w:szCs w:val="28"/>
-        </w:rPr>
-      </w:pPr>
-      <w:r>
-        <w:rPr>
-          <w:rFonts w:ascii="Arial" w:hAnsi="Arial" w:cs="Arial"/>
-          <w:sz w:val="28"/>
-          <w:szCs w:val="28"/>
-        </w:rPr>
-        <w:t>Text goes here</w:t>
-      </w:r>
-    </w:p>
-    <w:p>
-      <w:pPr>
-        <w:spacing w:line="360" w:lineRule="auto"/>
-        <w:rPr>
-          <w:rFonts w:ascii="Arial" w:hAnsi="Arial" w:cs="Arial"/>
-          <w:sz w:val="28"/>
-          <w:szCs w:val="28"/>
-        </w:rPr>
-      </w:pPr>
-    </w:p>
-    <w:p>
-      <w:pPr>
-        <w:pStyle w:val="Heading1"/>
-        <w:spacing w:line="360" w:lineRule="auto"/>
-        <w:rPr>
-          <w:rFonts w:ascii="Arial" w:hAnsi="Arial" w:cs="Arial"/>
-          <w:sz w:val="28"/>
-          <w:szCs w:val="28"/>
-        </w:rPr>
-      </w:pPr>
-      <w:r>
-        <w:rPr>
-          <w:rFonts w:ascii="Arial" w:hAnsi="Arial" w:cs="Arial"/>
-          <w:sz w:val="28"/>
-          <w:szCs w:val="28"/>
-        </w:rPr>
         <w:t>D. Sources</w:t>
       </w:r>
     </w:p>
@@ -896,7 +1040,7 @@
           <w:sz w:val="28"/>
           <w:szCs w:val="28"/>
         </w:rPr>
-        <w:t>Text goes here</w:t>
+        <w:t>Acknowledge sources, using in-text citations and references, for content that is quoted, paraphrased, or summarized.</w:t>
       </w:r>
     </w:p>
     <w:p>
@@ -1193,14 +1337,27 @@
             <w:r>
               <w:t xml:space="preserve"> of </w:t>
             </w:r>
-            <w:fldSimple w:instr=" NUMPAGES  ">
-              <w:r>
-                <w:rPr>
-                  <w:noProof/>
-                </w:rPr>
-                <w:t>2</w:t>
-              </w:r>
-            </w:fldSimple>
+            <w:r>
+              <w:fldChar w:fldCharType="begin"/>
+            </w:r>
+            <w:r>
+              <w:instrText xml:space="preserve"> NUMPAGES  </w:instrText>
+            </w:r>
+            <w:r>
+              <w:fldChar w:fldCharType="separate"/>
+            </w:r>
+            <w:r>
+              <w:rPr>
+                <w:noProof/>
+              </w:rPr>
+              <w:t>2</w:t>
+            </w:r>
+            <w:r>
+              <w:rPr>
+                <w:noProof/>
+              </w:rPr>
+              <w:fldChar w:fldCharType="end"/>
+            </w:r>
           </w:p>
         </w:sdtContent>
       </w:sdt>
@@ -1416,6 +1573,95 @@
     </w:lvl>
   </w:abstractNum>
   <w:abstractNum w:abstractNumId="1" w15:restartNumberingAfterBreak="0">
+    <w:nsid w:val="290F5EB4"/>
+    <w:multiLevelType w:val="hybridMultilevel"/>
+    <w:tmpl w:val="15DAADC8"/>
+    <w:lvl w:ilvl="0" w:tplc="04090015">
+      <w:start w:val="1"/>
+      <w:numFmt w:val="upperLetter"/>
+      <w:lvlText w:val="%1."/>
+      <w:lvlJc w:val="left"/>
+      <w:pPr>
+        <w:ind w:left="720" w:hanging="360"/>
+      </w:pPr>
+      <w:rPr>
+        <w:rFonts w:hint="default"/>
+      </w:rPr>
+    </w:lvl>
+    <w:lvl w:ilvl="1" w:tplc="04090019" w:tentative="1">
+      <w:start w:val="1"/>
+      <w:numFmt w:val="lowerLetter"/>
+      <w:lvlText w:val="%2."/>
+      <w:lvlJc w:val="left"/>
+      <w:pPr>
+        <w:ind w:left="1440" w:hanging="360"/>
+      </w:pPr>
+    </w:lvl>
+    <w:lvl w:ilvl="2" w:tplc="0409001B" w:tentative="1">
+      <w:start w:val="1"/>
+      <w:numFmt w:val="lowerRoman"/>
+      <w:lvlText w:val="%3."/>
+      <w:lvlJc w:val="right"/>
+      <w:pPr>
+        <w:ind w:left="2160" w:hanging="180"/>
+      </w:pPr>
+    </w:lvl>
+    <w:lvl w:ilvl="3" w:tplc="0409000F" w:tentative="1">
+      <w:start w:val="1"/>
+      <w:numFmt w:val="decimal"/>
+      <w:lvlText w:val="%4."/>
+      <w:lvlJc w:val="left"/>
+      <w:pPr>
+        <w:ind w:left="2880" w:hanging="360"/>
+      </w:pPr>
+    </w:lvl>
+    <w:lvl w:ilvl="4" w:tplc="04090019" w:tentative="1">
+      <w:start w:val="1"/>
+      <w:numFmt w:val="lowerLetter"/>
+      <w:lvlText w:val="%5."/>
+      <w:lvlJc w:val="left"/>
+      <w:pPr>
+        <w:ind w:left="3600" w:hanging="360"/>
+      </w:pPr>
+    </w:lvl>
+    <w:lvl w:ilvl="5" w:tplc="0409001B" w:tentative="1">
+      <w:start w:val="1"/>
+      <w:numFmt w:val="lowerRoman"/>
+      <w:lvlText w:val="%6."/>
+      <w:lvlJc w:val="right"/>
+      <w:pPr>
+        <w:ind w:left="4320" w:hanging="180"/>
+      </w:pPr>
+    </w:lvl>
+    <w:lvl w:ilvl="6" w:tplc="0409000F" w:tentative="1">
+      <w:start w:val="1"/>
+      <w:numFmt w:val="decimal"/>
+      <w:lvlText w:val="%7."/>
+      <w:lvlJc w:val="left"/>
+      <w:pPr>
+        <w:ind w:left="5040" w:hanging="360"/>
+      </w:pPr>
+    </w:lvl>
+    <w:lvl w:ilvl="7" w:tplc="04090019" w:tentative="1">
+      <w:start w:val="1"/>
+      <w:numFmt w:val="lowerLetter"/>
+      <w:lvlText w:val="%8."/>
+      <w:lvlJc w:val="left"/>
+      <w:pPr>
+        <w:ind w:left="5760" w:hanging="360"/>
+      </w:pPr>
+    </w:lvl>
+    <w:lvl w:ilvl="8" w:tplc="0409001B" w:tentative="1">
+      <w:start w:val="1"/>
+      <w:numFmt w:val="lowerRoman"/>
+      <w:lvlText w:val="%9."/>
+      <w:lvlJc w:val="right"/>
+      <w:pPr>
+        <w:ind w:left="6480" w:hanging="180"/>
+      </w:pPr>
+    </w:lvl>
+  </w:abstractNum>
+  <w:abstractNum w:abstractNumId="2" w15:restartNumberingAfterBreak="0">
     <w:nsid w:val="368C5B5F"/>
     <w:multiLevelType w:val="hybridMultilevel"/>
     <w:tmpl w:val="15FCAD22"/>
@@ -1504,7 +1750,7 @@
       </w:pPr>
     </w:lvl>
   </w:abstractNum>
-  <w:abstractNum w:abstractNumId="2" w15:restartNumberingAfterBreak="0">
+  <w:abstractNum w:abstractNumId="3" w15:restartNumberingAfterBreak="0">
     <w:nsid w:val="59B25C2A"/>
     <w:multiLevelType w:val="hybridMultilevel"/>
     <w:tmpl w:val="49303F0E"/>
@@ -1594,10 +1840,10 @@
     <w:abstractNumId w:val="0"/>
   </w:num>
   <w:num w:numId="2" w16cid:durableId="961112551">
-    <w:abstractNumId w:val="1"/>
+    <w:abstractNumId w:val="2"/>
   </w:num>
   <w:num w:numId="3" w16cid:durableId="462161879">
-    <w:abstractNumId w:val="2"/>
+    <w:abstractNumId w:val="3"/>
     <w:lvlOverride w:ilvl="0">
       <w:startOverride w:val="1"/>
     </w:lvlOverride>
@@ -1625,6 +1871,9 @@
     <w:lvlOverride w:ilvl="8">
       <w:startOverride w:val="1"/>
     </w:lvlOverride>
+  </w:num>
+  <w:num w:numId="4" w16cid:durableId="2001273942">
+    <w:abstractNumId w:val="1"/>
   </w:num>
 </w:numbering>
 </file>
@@ -2238,7 +2487,6 @@
   <w:style w:type="character" w:default="1" w:styleId="DefaultParagraphFont">
     <w:name w:val="Default Paragraph Font"/>
     <w:uiPriority w:val="1"/>
-    <w:semiHidden/>
     <w:unhideWhenUsed/>
   </w:style>
   <w:style w:type="table" w:default="1" w:styleId="TableNormal">
@@ -2722,6 +2970,33 @@
       <w:rFonts w:eastAsiaTheme="minorHAnsi"/>
       <w:sz w:val="24"/>
       <w:szCs w:val="24"/>
+    </w:rPr>
+  </w:style>
+  <w:style w:type="paragraph" w:customStyle="1" w:styleId="Style1">
+    <w:name w:val="Style1"/>
+    <w:basedOn w:val="Heading1"/>
+    <w:link w:val="Style1Char"/>
+    <w:qFormat/>
+    <w:rsid w:val="00BF5333"/>
+    <w:pPr>
+      <w:spacing w:line="360" w:lineRule="auto"/>
+    </w:pPr>
+    <w:rPr>
+      <w:rFonts w:ascii="Arial" w:hAnsi="Arial" w:cs="Arial"/>
+      <w:sz w:val="28"/>
+      <w:szCs w:val="28"/>
+    </w:rPr>
+  </w:style>
+  <w:style w:type="character" w:customStyle="1" w:styleId="Style1Char">
+    <w:name w:val="Style1 Char"/>
+    <w:basedOn w:val="Heading1Char"/>
+    <w:link w:val="Style1"/>
+    <w:rsid w:val="00BF5333"/>
+    <w:rPr>
+      <w:rFonts w:ascii="Arial" w:eastAsiaTheme="majorEastAsia" w:hAnsi="Arial" w:cs="Arial"/>
+      <w:color w:val="2F5496" w:themeColor="accent1" w:themeShade="BF"/>
+      <w:sz w:val="28"/>
+      <w:szCs w:val="28"/>
     </w:rPr>
   </w:style>
 </w:styles>

</xml_diff>

<commit_message>
ctd task 1 doc
</commit_message>
<xml_diff>
--- a/C950-Task-1-Sam-Merrill.docx
+++ b/C950-Task-1-Sam-Merrill.docx
@@ -209,7 +209,15 @@
           <w:sz w:val="28"/>
           <w:szCs w:val="28"/>
         </w:rPr>
-        <w:t>ID #xxxxxxxx</w:t>
+        <w:t>ID #</w:t>
+      </w:r>
+      <w:r>
+        <w:rPr>
+          <w:rFonts w:ascii="Arial" w:hAnsi="Arial" w:cs="Arial"/>
+          <w:sz w:val="28"/>
+          <w:szCs w:val="28"/>
+        </w:rPr>
+        <w:t>012638734</w:t>
       </w:r>
     </w:p>
     <w:p>
@@ -607,15 +615,79 @@
           <w:sz w:val="28"/>
           <w:szCs w:val="28"/>
         </w:rPr>
-        <w:t xml:space="preserve"> it ** have a multitude of features specific to Python**. It also includes a built in terminal environment which </w:t>
-      </w:r>
-      <w:r>
-        <w:rPr>
-          <w:rFonts w:ascii="Arial" w:hAnsi="Arial" w:cs="Arial"/>
-          <w:sz w:val="28"/>
-          <w:szCs w:val="28"/>
-        </w:rPr>
-        <w:t>helps with using git for version control. The hardware of my</w:t>
+        <w:t xml:space="preserve"> it ** ha</w:t>
+      </w:r>
+      <w:r>
+        <w:rPr>
+          <w:rFonts w:ascii="Arial" w:hAnsi="Arial" w:cs="Arial"/>
+          <w:sz w:val="28"/>
+          <w:szCs w:val="28"/>
+        </w:rPr>
+        <w:t>s</w:t>
+      </w:r>
+      <w:r>
+        <w:rPr>
+          <w:rFonts w:ascii="Arial" w:hAnsi="Arial" w:cs="Arial"/>
+          <w:sz w:val="28"/>
+          <w:szCs w:val="28"/>
+        </w:rPr>
+        <w:t xml:space="preserve"> a multitude of features specific to Python**. It also includes a built</w:t>
+      </w:r>
+      <w:r>
+        <w:rPr>
+          <w:rFonts w:ascii="Arial" w:hAnsi="Arial" w:cs="Arial"/>
+          <w:sz w:val="28"/>
+          <w:szCs w:val="28"/>
+        </w:rPr>
+        <w:t>-</w:t>
+      </w:r>
+      <w:r>
+        <w:rPr>
+          <w:rFonts w:ascii="Arial" w:hAnsi="Arial" w:cs="Arial"/>
+          <w:sz w:val="28"/>
+          <w:szCs w:val="28"/>
+        </w:rPr>
+        <w:t>in terminal environment</w:t>
+      </w:r>
+      <w:r>
+        <w:rPr>
+          <w:rFonts w:ascii="Arial" w:hAnsi="Arial" w:cs="Arial"/>
+          <w:sz w:val="28"/>
+          <w:szCs w:val="28"/>
+        </w:rPr>
+        <w:t>,</w:t>
+      </w:r>
+      <w:r>
+        <w:rPr>
+          <w:rFonts w:ascii="Arial" w:hAnsi="Arial" w:cs="Arial"/>
+          <w:sz w:val="28"/>
+          <w:szCs w:val="28"/>
+        </w:rPr>
+        <w:t xml:space="preserve"> which </w:t>
+      </w:r>
+      <w:r>
+        <w:rPr>
+          <w:rFonts w:ascii="Arial" w:hAnsi="Arial" w:cs="Arial"/>
+          <w:sz w:val="28"/>
+          <w:szCs w:val="28"/>
+        </w:rPr>
+        <w:t xml:space="preserve">helps with using </w:t>
+      </w:r>
+      <w:r>
+        <w:rPr>
+          <w:rFonts w:ascii="Arial" w:hAnsi="Arial" w:cs="Arial"/>
+          <w:sz w:val="28"/>
+          <w:szCs w:val="28"/>
+        </w:rPr>
+        <w:t>G</w:t>
+      </w:r>
+      <w:r>
+        <w:rPr>
+          <w:rFonts w:ascii="Arial" w:hAnsi="Arial" w:cs="Arial"/>
+          <w:sz w:val="28"/>
+          <w:szCs w:val="28"/>
+        </w:rPr>
+        <w:t>it for version control. The hardware of my</w:t>
       </w:r>
       <w:r>
         <w:rPr>
@@ -804,44 +876,385 @@
           <w:sz w:val="28"/>
           <w:szCs w:val="28"/>
         </w:rPr>
-        <w:t>Describe </w:t>
-      </w:r>
-      <w:r>
-        <w:rPr>
-          <w:rFonts w:ascii="Arial" w:hAnsi="Arial" w:cs="Arial"/>
-          <w:i/>
-          <w:iCs/>
-          <w:sz w:val="28"/>
-          <w:szCs w:val="28"/>
-        </w:rPr>
-        <w:t>both</w:t>
-      </w:r>
-      <w:r>
-        <w:rPr>
-          <w:rFonts w:ascii="Arial" w:hAnsi="Arial" w:cs="Arial"/>
-          <w:sz w:val="28"/>
-          <w:szCs w:val="28"/>
-        </w:rPr>
-        <w:t> the strengths and weaknesses of the self-adjusting data structure (e.g., the hash table).</w:t>
-      </w:r>
-      <w:r>
-        <w:rPr>
-          <w:rFonts w:ascii="Arial" w:hAnsi="Arial" w:cs="Arial"/>
-          <w:sz w:val="28"/>
-          <w:szCs w:val="28"/>
-        </w:rPr>
-        <w:t xml:space="preserve"> _ </w:t>
-      </w:r>
-    </w:p>
-    <w:p>
-      <w:pPr>
-        <w:spacing w:line="360" w:lineRule="auto"/>
-        <w:rPr>
-          <w:rFonts w:ascii="Arial" w:hAnsi="Arial" w:cs="Arial"/>
-          <w:sz w:val="28"/>
-          <w:szCs w:val="28"/>
-        </w:rPr>
-      </w:pPr>
+        <w:t>A strength of using a hash table</w:t>
+      </w:r>
+      <w:r>
+        <w:rPr>
+          <w:rFonts w:ascii="Arial" w:hAnsi="Arial" w:cs="Arial"/>
+          <w:sz w:val="28"/>
+          <w:szCs w:val="28"/>
+        </w:rPr>
+        <w:t>/hash map is the versatility in key</w:t>
+      </w:r>
+      <w:r>
+        <w:rPr>
+          <w:rFonts w:ascii="Arial" w:hAnsi="Arial" w:cs="Arial"/>
+          <w:sz w:val="28"/>
+          <w:szCs w:val="28"/>
+        </w:rPr>
+        <w:t xml:space="preserve"> data types</w:t>
+      </w:r>
+      <w:r>
+        <w:rPr>
+          <w:rFonts w:ascii="Arial" w:hAnsi="Arial" w:cs="Arial"/>
+          <w:sz w:val="28"/>
+          <w:szCs w:val="28"/>
+        </w:rPr>
+        <w:t xml:space="preserve"> instead of only integers.</w:t>
+      </w:r>
+      <w:r>
+        <w:rPr>
+          <w:rFonts w:ascii="Arial" w:hAnsi="Arial" w:cs="Arial"/>
+          <w:sz w:val="28"/>
+          <w:szCs w:val="28"/>
+        </w:rPr>
+        <w:t xml:space="preserve"> A name, email, or other information can be used as a key to directly link to </w:t>
+      </w:r>
+      <w:r>
+        <w:rPr>
+          <w:rFonts w:ascii="Arial" w:hAnsi="Arial" w:cs="Arial"/>
+          <w:sz w:val="28"/>
+          <w:szCs w:val="28"/>
+        </w:rPr>
+        <w:t xml:space="preserve">its value pair. </w:t>
+      </w:r>
+      <w:r>
+        <w:rPr>
+          <w:rFonts w:ascii="Arial" w:hAnsi="Arial" w:cs="Arial"/>
+          <w:sz w:val="28"/>
+          <w:szCs w:val="28"/>
+        </w:rPr>
+        <w:t>A</w:t>
+      </w:r>
+      <w:r>
+        <w:rPr>
+          <w:rFonts w:ascii="Arial" w:hAnsi="Arial" w:cs="Arial"/>
+          <w:sz w:val="28"/>
+          <w:szCs w:val="28"/>
+        </w:rPr>
+        <w:t>nother</w:t>
+      </w:r>
+      <w:r>
+        <w:rPr>
+          <w:rFonts w:ascii="Arial" w:hAnsi="Arial" w:cs="Arial"/>
+          <w:sz w:val="28"/>
+          <w:szCs w:val="28"/>
+        </w:rPr>
+        <w:t xml:space="preserve"> strength</w:t>
+      </w:r>
+      <w:r>
+        <w:rPr>
+          <w:rFonts w:ascii="Arial" w:hAnsi="Arial" w:cs="Arial"/>
+          <w:sz w:val="28"/>
+          <w:szCs w:val="28"/>
+        </w:rPr>
+        <w:t xml:space="preserve"> of using a hash table</w:t>
+      </w:r>
+      <w:r>
+        <w:rPr>
+          <w:rFonts w:ascii="Arial" w:hAnsi="Arial" w:cs="Arial"/>
+          <w:sz w:val="28"/>
+          <w:szCs w:val="28"/>
+        </w:rPr>
+        <w:t xml:space="preserve"> as a self-adjusting data structure is the efficiency of </w:t>
+      </w:r>
+      <w:r>
+        <w:rPr>
+          <w:rFonts w:ascii="Arial" w:hAnsi="Arial" w:cs="Arial"/>
+          <w:sz w:val="28"/>
+          <w:szCs w:val="28"/>
+        </w:rPr>
+        <w:t>changing/removing elements</w:t>
+      </w:r>
+      <w:r>
+        <w:rPr>
+          <w:rFonts w:ascii="Arial" w:hAnsi="Arial" w:cs="Arial"/>
+          <w:sz w:val="28"/>
+          <w:szCs w:val="28"/>
+        </w:rPr>
+        <w:t xml:space="preserve">. The time complexity of </w:t>
+      </w:r>
+      <w:r>
+        <w:rPr>
+          <w:rFonts w:ascii="Arial" w:hAnsi="Arial" w:cs="Arial"/>
+          <w:sz w:val="28"/>
+          <w:szCs w:val="28"/>
+        </w:rPr>
+        <w:t xml:space="preserve">searching, </w:t>
+      </w:r>
+      <w:r>
+        <w:rPr>
+          <w:rFonts w:ascii="Arial" w:hAnsi="Arial" w:cs="Arial"/>
+          <w:sz w:val="28"/>
+          <w:szCs w:val="28"/>
+        </w:rPr>
+        <w:t xml:space="preserve">adding, </w:t>
+      </w:r>
+      <w:r>
+        <w:rPr>
+          <w:rFonts w:ascii="Arial" w:hAnsi="Arial" w:cs="Arial"/>
+          <w:sz w:val="28"/>
+          <w:szCs w:val="28"/>
+        </w:rPr>
+        <w:t>modifying</w:t>
+      </w:r>
+      <w:r>
+        <w:rPr>
+          <w:rFonts w:ascii="Arial" w:hAnsi="Arial" w:cs="Arial"/>
+          <w:sz w:val="28"/>
+          <w:szCs w:val="28"/>
+        </w:rPr>
+        <w:t>,</w:t>
+      </w:r>
+      <w:r>
+        <w:rPr>
+          <w:rFonts w:ascii="Arial" w:hAnsi="Arial" w:cs="Arial"/>
+          <w:sz w:val="28"/>
+          <w:szCs w:val="28"/>
+        </w:rPr>
+        <w:t xml:space="preserve"> or removing</w:t>
+      </w:r>
+      <w:r>
+        <w:rPr>
+          <w:rFonts w:ascii="Arial" w:hAnsi="Arial" w:cs="Arial"/>
+          <w:sz w:val="28"/>
+          <w:szCs w:val="28"/>
+        </w:rPr>
+        <w:t xml:space="preserve"> a value is </w:t>
+      </w:r>
+      <w:r>
+        <w:rPr>
+          <w:rFonts w:ascii="Arial" w:hAnsi="Arial" w:cs="Arial"/>
+          <w:sz w:val="28"/>
+          <w:szCs w:val="28"/>
+        </w:rPr>
+        <w:t xml:space="preserve">on </w:t>
+      </w:r>
+      <w:r>
+        <w:rPr>
+          <w:rFonts w:ascii="Arial" w:hAnsi="Arial" w:cs="Arial"/>
+          <w:sz w:val="28"/>
+          <w:szCs w:val="28"/>
+        </w:rPr>
+        <w:t xml:space="preserve">average </w:t>
+      </w:r>
+      <w:r>
+        <w:rPr>
+          <w:rFonts w:ascii="Arial" w:hAnsi="Arial" w:cs="Arial"/>
+          <w:sz w:val="28"/>
+          <w:szCs w:val="28"/>
+        </w:rPr>
+        <w:t>O(1)</w:t>
+      </w:r>
+      <w:r>
+        <w:rPr>
+          <w:rFonts w:ascii="Arial" w:hAnsi="Arial" w:cs="Arial"/>
+          <w:sz w:val="28"/>
+          <w:szCs w:val="28"/>
+        </w:rPr>
+        <w:t xml:space="preserve">. </w:t>
+      </w:r>
+      <w:r>
+        <w:rPr>
+          <w:rFonts w:ascii="Arial" w:hAnsi="Arial" w:cs="Arial"/>
+          <w:sz w:val="28"/>
+          <w:szCs w:val="28"/>
+        </w:rPr>
+        <w:t>However</w:t>
+      </w:r>
+      <w:r>
+        <w:rPr>
+          <w:rFonts w:ascii="Arial" w:hAnsi="Arial" w:cs="Arial"/>
+          <w:sz w:val="28"/>
+          <w:szCs w:val="28"/>
+        </w:rPr>
+        <w:t xml:space="preserve">, the </w:t>
+      </w:r>
+      <w:r>
+        <w:rPr>
+          <w:rFonts w:ascii="Arial" w:hAnsi="Arial" w:cs="Arial"/>
+          <w:sz w:val="28"/>
+          <w:szCs w:val="28"/>
+        </w:rPr>
+        <w:t xml:space="preserve">time complexity can reach linear O(n) time </w:t>
+      </w:r>
+      <w:r>
+        <w:rPr>
+          <w:rFonts w:ascii="Arial" w:hAnsi="Arial" w:cs="Arial"/>
+          <w:sz w:val="28"/>
+          <w:szCs w:val="28"/>
+        </w:rPr>
+        <w:t xml:space="preserve">depending on the </w:t>
+      </w:r>
+      <w:r>
+        <w:rPr>
+          <w:rFonts w:ascii="Arial" w:hAnsi="Arial" w:cs="Arial"/>
+          <w:sz w:val="28"/>
+          <w:szCs w:val="28"/>
+        </w:rPr>
+        <w:t>number</w:t>
+      </w:r>
+      <w:r>
+        <w:rPr>
+          <w:rFonts w:ascii="Arial" w:hAnsi="Arial" w:cs="Arial"/>
+          <w:sz w:val="28"/>
+          <w:szCs w:val="28"/>
+        </w:rPr>
+        <w:t xml:space="preserve"> of collisions, or </w:t>
+      </w:r>
+      <w:r>
+        <w:rPr>
+          <w:rFonts w:ascii="Arial" w:hAnsi="Arial" w:cs="Arial"/>
+          <w:sz w:val="28"/>
+          <w:szCs w:val="28"/>
+        </w:rPr>
+        <w:t>elements in the same bucket</w:t>
+      </w:r>
+      <w:r>
+        <w:rPr>
+          <w:rFonts w:ascii="Arial" w:hAnsi="Arial" w:cs="Arial"/>
+          <w:sz w:val="28"/>
+          <w:szCs w:val="28"/>
+        </w:rPr>
+        <w:t>, which ca</w:t>
+      </w:r>
+      <w:r>
+        <w:rPr>
+          <w:rFonts w:ascii="Arial" w:hAnsi="Arial" w:cs="Arial"/>
+          <w:sz w:val="28"/>
+          <w:szCs w:val="28"/>
+        </w:rPr>
+        <w:t>n</w:t>
+      </w:r>
+      <w:r>
+        <w:rPr>
+          <w:rFonts w:ascii="Arial" w:hAnsi="Arial" w:cs="Arial"/>
+          <w:sz w:val="28"/>
+          <w:szCs w:val="28"/>
+        </w:rPr>
+        <w:t xml:space="preserve"> be a weakness</w:t>
+      </w:r>
+      <w:r>
+        <w:rPr>
+          <w:rFonts w:ascii="Arial" w:hAnsi="Arial" w:cs="Arial"/>
+          <w:sz w:val="28"/>
+          <w:szCs w:val="28"/>
+        </w:rPr>
+        <w:t xml:space="preserve"> in a </w:t>
+      </w:r>
+      <w:r>
+        <w:rPr>
+          <w:rFonts w:ascii="Arial" w:hAnsi="Arial" w:cs="Arial"/>
+          <w:sz w:val="28"/>
+          <w:szCs w:val="28"/>
+        </w:rPr>
+        <w:lastRenderedPageBreak/>
+        <w:t>poorly designed system</w:t>
+      </w:r>
+      <w:r>
+        <w:rPr>
+          <w:rFonts w:ascii="Arial" w:hAnsi="Arial" w:cs="Arial"/>
+          <w:sz w:val="28"/>
+          <w:szCs w:val="28"/>
+        </w:rPr>
+        <w:t>.</w:t>
+      </w:r>
+      <w:r>
+        <w:rPr>
+          <w:rFonts w:ascii="Arial" w:hAnsi="Arial" w:cs="Arial"/>
+          <w:sz w:val="28"/>
+          <w:szCs w:val="28"/>
+        </w:rPr>
+        <w:t xml:space="preserve"> Another weakness of a hash table/hash map could be the load factor</w:t>
+      </w:r>
+      <w:r>
+        <w:rPr>
+          <w:rFonts w:ascii="Arial" w:hAnsi="Arial" w:cs="Arial"/>
+          <w:sz w:val="28"/>
+          <w:szCs w:val="28"/>
+        </w:rPr>
+        <w:t xml:space="preserve"> and unused allocated memory. A hash table m</w:t>
+      </w:r>
+      <w:r>
+        <w:rPr>
+          <w:rFonts w:ascii="Arial" w:hAnsi="Arial" w:cs="Arial"/>
+          <w:sz w:val="28"/>
+          <w:szCs w:val="28"/>
+        </w:rPr>
+        <w:t xml:space="preserve">ight not </w:t>
+      </w:r>
+      <w:r>
+        <w:rPr>
+          <w:rFonts w:ascii="Arial" w:hAnsi="Arial" w:cs="Arial"/>
+          <w:sz w:val="28"/>
+          <w:szCs w:val="28"/>
+        </w:rPr>
+        <w:t>fill</w:t>
+      </w:r>
+      <w:r>
+        <w:rPr>
+          <w:rFonts w:ascii="Arial" w:hAnsi="Arial" w:cs="Arial"/>
+          <w:sz w:val="28"/>
+          <w:szCs w:val="28"/>
+        </w:rPr>
+        <w:t xml:space="preserve"> every single bucket</w:t>
+      </w:r>
+      <w:r>
+        <w:rPr>
+          <w:rFonts w:ascii="Arial" w:hAnsi="Arial" w:cs="Arial"/>
+          <w:sz w:val="28"/>
+          <w:szCs w:val="28"/>
+        </w:rPr>
+        <w:t xml:space="preserve"> with elements</w:t>
+      </w:r>
+      <w:r>
+        <w:rPr>
+          <w:rFonts w:ascii="Arial" w:hAnsi="Arial" w:cs="Arial"/>
+          <w:sz w:val="28"/>
+          <w:szCs w:val="28"/>
+        </w:rPr>
+        <w:t xml:space="preserve">, </w:t>
+      </w:r>
+      <w:r>
+        <w:rPr>
+          <w:rFonts w:ascii="Arial" w:hAnsi="Arial" w:cs="Arial"/>
+          <w:sz w:val="28"/>
+          <w:szCs w:val="28"/>
+        </w:rPr>
+        <w:t>wasting</w:t>
+      </w:r>
+      <w:r>
+        <w:rPr>
+          <w:rFonts w:ascii="Arial" w:hAnsi="Arial" w:cs="Arial"/>
+          <w:sz w:val="28"/>
+          <w:szCs w:val="28"/>
+        </w:rPr>
+        <w:t xml:space="preserve"> memory. The hash table may also need to reallocate</w:t>
+      </w:r>
+      <w:r>
+        <w:rPr>
+          <w:rFonts w:ascii="Arial" w:hAnsi="Arial" w:cs="Arial"/>
+          <w:sz w:val="28"/>
+          <w:szCs w:val="28"/>
+        </w:rPr>
+        <w:t xml:space="preserve"> to a new array if the load factor is exceeded, requiring every element in the array to be rehashed</w:t>
+      </w:r>
+      <w:r>
+        <w:rPr>
+          <w:rFonts w:ascii="Arial" w:hAnsi="Arial" w:cs="Arial"/>
+          <w:sz w:val="28"/>
+          <w:szCs w:val="28"/>
+        </w:rPr>
+        <w:t>/reindexed</w:t>
+      </w:r>
+      <w:r>
+        <w:rPr>
+          <w:rFonts w:ascii="Arial" w:hAnsi="Arial" w:cs="Arial"/>
+          <w:sz w:val="28"/>
+          <w:szCs w:val="28"/>
+        </w:rPr>
+        <w:t>.</w:t>
+      </w:r>
     </w:p>
     <w:p>
       <w:pPr>
@@ -877,7 +1290,23 @@
           <w:sz w:val="28"/>
           <w:szCs w:val="28"/>
         </w:rPr>
-        <w:t>Justify the choice of a key for efficient delivery management from the following components:</w:t>
+        <w:t>The package ID was chosen as</w:t>
+      </w:r>
+      <w:r>
+        <w:rPr>
+          <w:rFonts w:ascii="Arial" w:hAnsi="Arial" w:cs="Arial"/>
+          <w:sz w:val="28"/>
+          <w:szCs w:val="28"/>
+        </w:rPr>
+        <w:t xml:space="preserve"> the key for the package data components. The IDs could utilize a modulo function to sort each ID number into a bucket based on its remainder.</w:t>
+      </w:r>
+      <w:r>
+        <w:rPr>
+          <w:rFonts w:ascii="Arial" w:hAnsi="Arial" w:cs="Arial"/>
+          <w:sz w:val="28"/>
+          <w:szCs w:val="28"/>
+        </w:rPr>
+        <w:t xml:space="preserve"> This allows for a hash table of up to 100 elements, more than enough for the 40 required packages.</w:t>
       </w:r>
       <w:r>
         <w:rPr>
@@ -887,124 +1316,6 @@
         </w:rPr>
         <w:t xml:space="preserve"> </w:t>
       </w:r>
-      <w:r>
-        <w:rPr>
-          <w:rFonts w:ascii="Arial" w:hAnsi="Arial" w:cs="Arial"/>
-          <w:sz w:val="28"/>
-          <w:szCs w:val="28"/>
-        </w:rPr>
-        <w:t>delivery address</w:t>
-      </w:r>
-      <w:r>
-        <w:rPr>
-          <w:rFonts w:ascii="Arial" w:hAnsi="Arial" w:cs="Arial"/>
-          <w:sz w:val="28"/>
-          <w:szCs w:val="28"/>
-        </w:rPr>
-        <w:t xml:space="preserve">, </w:t>
-      </w:r>
-      <w:r>
-        <w:rPr>
-          <w:rFonts w:ascii="Arial" w:hAnsi="Arial" w:cs="Arial"/>
-          <w:sz w:val="28"/>
-          <w:szCs w:val="28"/>
-        </w:rPr>
-        <w:t>delivery deadline</w:t>
-      </w:r>
-      <w:r>
-        <w:rPr>
-          <w:rFonts w:ascii="Arial" w:hAnsi="Arial" w:cs="Arial"/>
-          <w:sz w:val="28"/>
-          <w:szCs w:val="28"/>
-        </w:rPr>
-        <w:t xml:space="preserve">, </w:t>
-      </w:r>
-      <w:r>
-        <w:rPr>
-          <w:rFonts w:ascii="Arial" w:hAnsi="Arial" w:cs="Arial"/>
-          <w:sz w:val="28"/>
-          <w:szCs w:val="28"/>
-        </w:rPr>
-        <w:t>delivery city</w:t>
-      </w:r>
-      <w:r>
-        <w:rPr>
-          <w:rFonts w:ascii="Arial" w:hAnsi="Arial" w:cs="Arial"/>
-          <w:sz w:val="28"/>
-          <w:szCs w:val="28"/>
-        </w:rPr>
-        <w:t xml:space="preserve">, </w:t>
-      </w:r>
-      <w:r>
-        <w:rPr>
-          <w:rFonts w:ascii="Arial" w:hAnsi="Arial" w:cs="Arial"/>
-          <w:sz w:val="28"/>
-          <w:szCs w:val="28"/>
-        </w:rPr>
-        <w:lastRenderedPageBreak/>
-        <w:t>delivery zip code</w:t>
-      </w:r>
-      <w:r>
-        <w:rPr>
-          <w:rFonts w:ascii="Arial" w:hAnsi="Arial" w:cs="Arial"/>
-          <w:sz w:val="28"/>
-          <w:szCs w:val="28"/>
-        </w:rPr>
-        <w:t xml:space="preserve">, </w:t>
-      </w:r>
-      <w:r>
-        <w:rPr>
-          <w:rFonts w:ascii="Arial" w:hAnsi="Arial" w:cs="Arial"/>
-          <w:b/>
-          <w:bCs/>
-          <w:sz w:val="28"/>
-          <w:szCs w:val="28"/>
-          <w:u w:val="single"/>
-        </w:rPr>
-        <w:t>package ID</w:t>
-      </w:r>
-      <w:r>
-        <w:rPr>
-          <w:rFonts w:ascii="Arial" w:hAnsi="Arial" w:cs="Arial"/>
-          <w:sz w:val="28"/>
-          <w:szCs w:val="28"/>
-        </w:rPr>
-        <w:t xml:space="preserve">, </w:t>
-      </w:r>
-      <w:r>
-        <w:rPr>
-          <w:rFonts w:ascii="Arial" w:hAnsi="Arial" w:cs="Arial"/>
-          <w:sz w:val="28"/>
-          <w:szCs w:val="28"/>
-        </w:rPr>
-        <w:t>package weight</w:t>
-      </w:r>
-      <w:r>
-        <w:rPr>
-          <w:rFonts w:ascii="Arial" w:hAnsi="Arial" w:cs="Arial"/>
-          <w:sz w:val="28"/>
-          <w:szCs w:val="28"/>
-        </w:rPr>
-        <w:t xml:space="preserve">, </w:t>
-      </w:r>
-      <w:r>
-        <w:rPr>
-          <w:rFonts w:ascii="Arial" w:hAnsi="Arial" w:cs="Arial"/>
-          <w:sz w:val="28"/>
-          <w:szCs w:val="28"/>
-        </w:rPr>
-        <w:t>delivery status (i.e., delayed, at the hub, en route, or delivered), including the delivery time</w:t>
-      </w:r>
-    </w:p>
-    <w:p>
-      <w:pPr>
-        <w:spacing w:line="360" w:lineRule="auto"/>
-        <w:rPr>
-          <w:rFonts w:ascii="Arial" w:hAnsi="Arial" w:cs="Arial"/>
-          <w:sz w:val="28"/>
-          <w:szCs w:val="28"/>
-        </w:rPr>
-      </w:pPr>
     </w:p>
     <w:p>
       <w:pPr>
@@ -1041,6 +1352,42 @@
           <w:szCs w:val="28"/>
         </w:rPr>
         <w:t>Acknowledge sources, using in-text citations and references, for content that is quoted, paraphrased, or summarized.</w:t>
+      </w:r>
+    </w:p>
+    <w:p>
+      <w:pPr>
+        <w:spacing w:line="360" w:lineRule="auto"/>
+        <w:rPr>
+          <w:rFonts w:ascii="Arial" w:hAnsi="Arial" w:cs="Arial"/>
+          <w:sz w:val="28"/>
+          <w:szCs w:val="28"/>
+        </w:rPr>
+      </w:pPr>
+      <w:r>
+        <w:rPr>
+          <w:rFonts w:ascii="Arial" w:hAnsi="Arial" w:cs="Arial"/>
+          <w:sz w:val="28"/>
+          <w:szCs w:val="28"/>
+        </w:rPr>
+        <w:t>SOURCES: w3 schools hash table, graph, DSA time complexity</w:t>
+      </w:r>
+    </w:p>
+    <w:p>
+      <w:pPr>
+        <w:spacing w:line="360" w:lineRule="auto"/>
+        <w:rPr>
+          <w:rFonts w:ascii="Arial" w:hAnsi="Arial" w:cs="Arial"/>
+          <w:sz w:val="28"/>
+          <w:szCs w:val="28"/>
+        </w:rPr>
+      </w:pPr>
+      <w:r>
+        <w:rPr>
+          <w:rFonts w:ascii="Arial" w:hAnsi="Arial" w:cs="Arial"/>
+          <w:sz w:val="28"/>
+          <w:szCs w:val="28"/>
+        </w:rPr>
+        <w:t>YouTube video for graph/BFS DFS SPAs</w:t>
       </w:r>
     </w:p>
     <w:p>
@@ -1281,6 +1628,7 @@
         <w:docPartUnique/>
       </w:docPartObj>
     </w:sdtPr>
+    <w:sdtEndPr/>
     <w:sdtContent>
       <w:sdt>
         <w:sdtPr>
@@ -1290,6 +1638,7 @@
             <w:docPartUnique/>
           </w:docPartObj>
         </w:sdtPr>
+        <w:sdtEndPr/>
         <w:sdtContent>
           <w:p>
             <w:pPr>
@@ -1337,27 +1686,14 @@
             <w:r>
               <w:t xml:space="preserve"> of </w:t>
             </w:r>
-            <w:r>
-              <w:fldChar w:fldCharType="begin"/>
-            </w:r>
-            <w:r>
-              <w:instrText xml:space="preserve"> NUMPAGES  </w:instrText>
-            </w:r>
-            <w:r>
-              <w:fldChar w:fldCharType="separate"/>
-            </w:r>
-            <w:r>
-              <w:rPr>
-                <w:noProof/>
-              </w:rPr>
-              <w:t>2</w:t>
-            </w:r>
-            <w:r>
-              <w:rPr>
-                <w:noProof/>
-              </w:rPr>
-              <w:fldChar w:fldCharType="end"/>
-            </w:r>
+            <w:fldSimple w:instr=" NUMPAGES  ">
+              <w:r>
+                <w:rPr>
+                  <w:noProof/>
+                </w:rPr>
+                <w:t>2</w:t>
+              </w:r>
+            </w:fldSimple>
           </w:p>
         </w:sdtContent>
       </w:sdt>

</xml_diff>

<commit_message>
started filling out task 1
</commit_message>
<xml_diff>
--- a/C950-Task-1-Sam-Merrill.docx
+++ b/C950-Task-1-Sam-Merrill.docx
@@ -398,7 +398,63 @@
           <w:sz w:val="28"/>
           <w:szCs w:val="28"/>
         </w:rPr>
-        <w:t>Identify a named self-adjusting algorithm (e.g., nearest neighbor algorithm, greedy algorithm) that could be used to create your program to deliver the packages.</w:t>
+        <w:t xml:space="preserve">The nearest neighbor algorithm </w:t>
+      </w:r>
+      <w:r>
+        <w:rPr>
+          <w:rFonts w:ascii="Arial" w:hAnsi="Arial" w:cs="Arial"/>
+          <w:sz w:val="28"/>
+          <w:szCs w:val="28"/>
+        </w:rPr>
+        <w:t xml:space="preserve">(NN) </w:t>
+      </w:r>
+      <w:r>
+        <w:rPr>
+          <w:rFonts w:ascii="Arial" w:hAnsi="Arial" w:cs="Arial"/>
+          <w:sz w:val="28"/>
+          <w:szCs w:val="28"/>
+        </w:rPr>
+        <w:t>could be used to create the delivery driver program</w:t>
+      </w:r>
+      <w:r>
+        <w:rPr>
+          <w:rFonts w:ascii="Arial" w:hAnsi="Arial" w:cs="Arial"/>
+          <w:sz w:val="28"/>
+          <w:szCs w:val="28"/>
+        </w:rPr>
+        <w:t>. This self-adjusting algorithm finds the shortest distance between the current location and all other locations</w:t>
+      </w:r>
+      <w:r>
+        <w:rPr>
+          <w:rFonts w:ascii="Arial" w:hAnsi="Arial" w:cs="Arial"/>
+          <w:sz w:val="28"/>
+          <w:szCs w:val="28"/>
+        </w:rPr>
+        <w:t>. It can then move the truck</w:t>
+      </w:r>
+      <w:r>
+        <w:rPr>
+          <w:rFonts w:ascii="Arial" w:hAnsi="Arial" w:cs="Arial"/>
+          <w:sz w:val="28"/>
+          <w:szCs w:val="28"/>
+        </w:rPr>
+        <w:t xml:space="preserve"> to the next closest location until all </w:t>
+      </w:r>
+      <w:r>
+        <w:rPr>
+          <w:rFonts w:ascii="Arial" w:hAnsi="Arial" w:cs="Arial"/>
+          <w:sz w:val="28"/>
+          <w:szCs w:val="28"/>
+        </w:rPr>
+        <w:t>locations have been</w:t>
+      </w:r>
+      <w:r>
+        <w:rPr>
+          <w:rFonts w:ascii="Arial" w:hAnsi="Arial" w:cs="Arial"/>
+          <w:sz w:val="28"/>
+          <w:szCs w:val="28"/>
+        </w:rPr>
+        <w:t xml:space="preserve"> visited.</w:t>
       </w:r>
     </w:p>
     <w:p>
@@ -415,138 +471,707 @@
     <w:p>
       <w:pPr>
         <w:spacing w:line="360" w:lineRule="auto"/>
-      </w:pPr>
-      <w:r>
-        <w:rPr>
-          <w:rFonts w:ascii="Arial" w:hAnsi="Arial" w:cs="Arial"/>
-          <w:sz w:val="28"/>
-          <w:szCs w:val="28"/>
-        </w:rPr>
-        <w:t>Identify a self-adjusting data structure, such as a hash table, that could be used with the algorithm identified in part A to store the package data.</w:t>
-      </w:r>
-      <w:r>
+        <w:rPr>
+          <w:rFonts w:ascii="Arial" w:hAnsi="Arial" w:cs="Arial"/>
+          <w:sz w:val="28"/>
+          <w:szCs w:val="28"/>
+        </w:rPr>
+      </w:pPr>
+      <w:r>
+        <w:rPr>
+          <w:rFonts w:ascii="Arial" w:hAnsi="Arial" w:cs="Arial"/>
+          <w:sz w:val="28"/>
+          <w:szCs w:val="28"/>
+        </w:rPr>
+        <w:t>A Hash Table, specifically a Hash Map, can store the package data. It can take the package ID as the key and store the entire package object as the value. The nearest neighbor algorithm (NN)</w:t>
+      </w:r>
+      <w:r>
+        <w:rPr>
+          <w:rFonts w:ascii="Arial" w:hAnsi="Arial" w:cs="Arial"/>
+          <w:sz w:val="28"/>
+          <w:szCs w:val="28"/>
+        </w:rPr>
+        <w:t xml:space="preserve"> can access the package data and distance data to determine </w:t>
+      </w:r>
+      <w:r>
+        <w:rPr>
+          <w:rFonts w:ascii="Arial" w:hAnsi="Arial" w:cs="Arial"/>
+          <w:sz w:val="28"/>
+          <w:szCs w:val="28"/>
+        </w:rPr>
+        <w:t>the order of the route.</w:t>
+      </w:r>
+    </w:p>
+    <w:p>
+      <w:pPr>
+        <w:pStyle w:val="Style1"/>
+      </w:pPr>
+      <w:r>
+        <w:t>B</w:t>
+      </w:r>
+      <w:r>
+        <w:t>1</w:t>
+      </w:r>
+      <w:r>
+        <w:t xml:space="preserve">. </w:t>
+      </w:r>
+      <w:r>
+        <w:t>Explanation of Data Structure</w:t>
+      </w:r>
+    </w:p>
+    <w:p>
+      <w:pPr>
+        <w:spacing w:line="360" w:lineRule="auto"/>
+        <w:rPr>
+          <w:rFonts w:ascii="Arial" w:hAnsi="Arial" w:cs="Arial"/>
+          <w:sz w:val="28"/>
+          <w:szCs w:val="28"/>
+        </w:rPr>
+      </w:pPr>
+      <w:r>
+        <w:rPr>
+          <w:rFonts w:ascii="Arial" w:hAnsi="Arial" w:cs="Arial"/>
+          <w:sz w:val="28"/>
+          <w:szCs w:val="28"/>
+        </w:rPr>
+        <w:t>The Hash Map stores the package ID as the key, and the entire package object</w:t>
+      </w:r>
+      <w:r>
+        <w:rPr>
+          <w:rFonts w:ascii="Arial" w:hAnsi="Arial" w:cs="Arial"/>
+          <w:sz w:val="28"/>
+          <w:szCs w:val="28"/>
+        </w:rPr>
+        <w:t>, with all package information, as the value. The package class itself</w:t>
+      </w:r>
+      <w:r>
+        <w:rPr>
+          <w:rFonts w:ascii="Arial" w:hAnsi="Arial" w:cs="Arial"/>
+          <w:sz w:val="28"/>
+          <w:szCs w:val="28"/>
+        </w:rPr>
+        <w:t xml:space="preserve"> establishes the individual data for each package, but the hash map stores all packages accord</w:t>
+      </w:r>
+      <w:r>
+        <w:rPr>
+          <w:rFonts w:ascii="Arial" w:hAnsi="Arial" w:cs="Arial"/>
+          <w:sz w:val="28"/>
+          <w:szCs w:val="28"/>
+        </w:rPr>
+        <w:t>ingly.</w:t>
+      </w:r>
+    </w:p>
+    <w:p>
+      <w:pPr>
+        <w:pStyle w:val="Style1"/>
+      </w:pPr>
+    </w:p>
+    <w:p>
+      <w:pPr>
+        <w:pStyle w:val="Heading1"/>
+        <w:rPr>
+          <w:rFonts w:ascii="Arial" w:hAnsi="Arial" w:cs="Arial"/>
+          <w:sz w:val="28"/>
+          <w:szCs w:val="28"/>
+        </w:rPr>
+      </w:pPr>
+      <w:r>
+        <w:rPr>
+          <w:rFonts w:ascii="Arial" w:hAnsi="Arial" w:cs="Arial"/>
+          <w:sz w:val="28"/>
+          <w:szCs w:val="28"/>
+        </w:rPr>
+        <w:t>C</w:t>
+      </w:r>
+      <w:r>
+        <w:rPr>
+          <w:rFonts w:ascii="Arial" w:hAnsi="Arial" w:cs="Arial"/>
+          <w:sz w:val="28"/>
+          <w:szCs w:val="28"/>
+        </w:rPr>
+        <w:t>1</w:t>
+      </w:r>
+      <w:r>
+        <w:rPr>
+          <w:rFonts w:ascii="Arial" w:hAnsi="Arial" w:cs="Arial"/>
+          <w:sz w:val="28"/>
+          <w:szCs w:val="28"/>
+        </w:rPr>
+        <w:t xml:space="preserve">. </w:t>
+      </w:r>
+      <w:r>
+        <w:rPr>
+          <w:rFonts w:ascii="Arial" w:hAnsi="Arial" w:cs="Arial"/>
+          <w:sz w:val="28"/>
+          <w:szCs w:val="28"/>
+        </w:rPr>
+        <w:t>Algorithm’s Logic</w:t>
+      </w:r>
+    </w:p>
+    <w:p>
+      <w:pPr>
+        <w:spacing w:line="360" w:lineRule="auto"/>
+        <w:rPr>
+          <w:rFonts w:ascii="Arial" w:hAnsi="Arial" w:cs="Arial"/>
+          <w:sz w:val="28"/>
+          <w:szCs w:val="28"/>
+        </w:rPr>
+      </w:pPr>
+      <w:r>
+        <w:rPr>
+          <w:rFonts w:ascii="Arial" w:hAnsi="Arial" w:cs="Arial"/>
+          <w:sz w:val="28"/>
+          <w:szCs w:val="28"/>
+        </w:rPr>
+        <w:t>Explain the algorithm’s logic using pseudocode.</w:t>
+      </w:r>
+    </w:p>
+    <w:p>
+      <w:pPr>
+        <w:spacing w:line="360" w:lineRule="auto"/>
+        <w:rPr>
+          <w:rFonts w:ascii="Arial" w:hAnsi="Arial" w:cs="Arial"/>
+          <w:sz w:val="28"/>
+          <w:szCs w:val="28"/>
+        </w:rPr>
+      </w:pPr>
+      <w:r>
+        <w:rPr>
+          <w:rFonts w:ascii="Arial" w:hAnsi="Arial" w:cs="Arial"/>
+          <w:sz w:val="28"/>
+          <w:szCs w:val="28"/>
+        </w:rPr>
+        <w:lastRenderedPageBreak/>
+        <w:t>Nearest_Neighbor</w:t>
+      </w:r>
+      <w:r>
+        <w:rPr>
+          <w:rFonts w:ascii="Arial" w:hAnsi="Arial" w:cs="Arial"/>
+          <w:sz w:val="28"/>
+          <w:szCs w:val="28"/>
+        </w:rPr>
+        <w:t>()</w:t>
+      </w:r>
+      <w:r>
+        <w:rPr>
+          <w:rFonts w:ascii="Arial" w:hAnsi="Arial" w:cs="Arial"/>
+          <w:sz w:val="28"/>
+          <w:szCs w:val="28"/>
+        </w:rPr>
         <w:t xml:space="preserve"> </w:t>
       </w:r>
-    </w:p>
-    <w:p>
-      <w:pPr>
-        <w:spacing w:line="360" w:lineRule="auto"/>
-        <w:rPr>
-          <w:rFonts w:ascii="Arial" w:hAnsi="Arial" w:cs="Arial"/>
-          <w:sz w:val="28"/>
-          <w:szCs w:val="28"/>
-        </w:rPr>
-      </w:pPr>
-    </w:p>
-    <w:p>
-      <w:pPr>
-        <w:pStyle w:val="Style1"/>
-      </w:pPr>
-      <w:r>
-        <w:t>B</w:t>
-      </w:r>
-      <w:r>
-        <w:t>1</w:t>
-      </w:r>
-      <w:r>
-        <w:t xml:space="preserve">. </w:t>
-      </w:r>
-      <w:r>
-        <w:t>Explanation of Data Structure</w:t>
-      </w:r>
-    </w:p>
-    <w:p>
-      <w:pPr>
-        <w:spacing w:line="360" w:lineRule="auto"/>
-        <w:rPr>
-          <w:rFonts w:ascii="Arial" w:hAnsi="Arial" w:cs="Arial"/>
-          <w:sz w:val="28"/>
-          <w:szCs w:val="28"/>
-        </w:rPr>
-      </w:pPr>
-      <w:r>
-        <w:rPr>
-          <w:rFonts w:ascii="Arial" w:hAnsi="Arial" w:cs="Arial"/>
-          <w:sz w:val="28"/>
-          <w:szCs w:val="28"/>
-        </w:rPr>
-        <w:t xml:space="preserve">Explain how your data structure accounts for the relationship between the data components you are storing. </w:t>
-      </w:r>
-    </w:p>
-    <w:p>
-      <w:pPr>
-        <w:pStyle w:val="Style1"/>
-      </w:pPr>
-    </w:p>
-    <w:p>
-      <w:pPr>
-        <w:pStyle w:val="Heading1"/>
-        <w:rPr>
-          <w:rFonts w:ascii="Arial" w:hAnsi="Arial" w:cs="Arial"/>
-          <w:sz w:val="28"/>
-          <w:szCs w:val="28"/>
-        </w:rPr>
-      </w:pPr>
-      <w:r>
-        <w:rPr>
-          <w:rFonts w:ascii="Arial" w:hAnsi="Arial" w:cs="Arial"/>
-          <w:sz w:val="28"/>
-          <w:szCs w:val="28"/>
-        </w:rPr>
-        <w:t>C</w:t>
-      </w:r>
-      <w:r>
-        <w:rPr>
-          <w:rFonts w:ascii="Arial" w:hAnsi="Arial" w:cs="Arial"/>
-          <w:sz w:val="28"/>
-          <w:szCs w:val="28"/>
-        </w:rPr>
-        <w:t>1</w:t>
-      </w:r>
-      <w:r>
-        <w:rPr>
-          <w:rFonts w:ascii="Arial" w:hAnsi="Arial" w:cs="Arial"/>
-          <w:sz w:val="28"/>
-          <w:szCs w:val="28"/>
-        </w:rPr>
-        <w:t xml:space="preserve">. </w:t>
-      </w:r>
-      <w:r>
-        <w:rPr>
-          <w:rFonts w:ascii="Arial" w:hAnsi="Arial" w:cs="Arial"/>
-          <w:sz w:val="28"/>
-          <w:szCs w:val="28"/>
-        </w:rPr>
-        <w:t>Algorithm’s Logic</w:t>
-      </w:r>
-    </w:p>
-    <w:p>
-      <w:pPr>
-        <w:spacing w:line="360" w:lineRule="auto"/>
-        <w:rPr>
-          <w:rFonts w:ascii="Arial" w:hAnsi="Arial" w:cs="Arial"/>
-          <w:sz w:val="28"/>
-          <w:szCs w:val="28"/>
-        </w:rPr>
-      </w:pPr>
-      <w:r>
-        <w:rPr>
-          <w:rFonts w:ascii="Arial" w:hAnsi="Arial" w:cs="Arial"/>
-          <w:sz w:val="28"/>
-          <w:szCs w:val="28"/>
-        </w:rPr>
-        <w:t>Explain the algorithm’s logic using pseudocode.</w:t>
-      </w:r>
-    </w:p>
-    <w:p>
-      <w:pPr>
-        <w:spacing w:line="360" w:lineRule="auto"/>
-        <w:rPr>
-          <w:rFonts w:ascii="Arial" w:hAnsi="Arial" w:cs="Arial"/>
-          <w:sz w:val="28"/>
-          <w:szCs w:val="28"/>
-        </w:rPr>
-      </w:pPr>
+      <w:r>
+        <w:rPr>
+          <w:rFonts w:ascii="Arial" w:hAnsi="Arial" w:cs="Arial"/>
+          <w:sz w:val="28"/>
+          <w:szCs w:val="28"/>
+        </w:rPr>
+        <w:t xml:space="preserve">Pseudocode: </w:t>
+      </w:r>
+    </w:p>
+    <w:p>
+      <w:pPr>
+        <w:spacing w:line="360" w:lineRule="auto"/>
+        <w:rPr>
+          <w:rFonts w:ascii="Arial" w:hAnsi="Arial" w:cs="Arial"/>
+          <w:sz w:val="28"/>
+          <w:szCs w:val="28"/>
+        </w:rPr>
+      </w:pPr>
+      <w:r>
+        <w:rPr>
+          <w:rFonts w:ascii="Arial" w:hAnsi="Arial" w:cs="Arial"/>
+          <w:sz w:val="28"/>
+          <w:szCs w:val="28"/>
+        </w:rPr>
+        <w:t xml:space="preserve">Assign shortest_path to </w:t>
+      </w:r>
+      <w:r>
+        <w:rPr>
+          <w:rFonts w:ascii="Arial" w:hAnsi="Arial" w:cs="Arial"/>
+          <w:sz w:val="28"/>
+          <w:szCs w:val="28"/>
+        </w:rPr>
+        <w:t xml:space="preserve">a </w:t>
+      </w:r>
+      <w:r>
+        <w:rPr>
+          <w:rFonts w:ascii="Arial" w:hAnsi="Arial" w:cs="Arial"/>
+          <w:sz w:val="28"/>
+          <w:szCs w:val="28"/>
+        </w:rPr>
+        <w:t>high value.</w:t>
+      </w:r>
+    </w:p>
+    <w:p>
+      <w:pPr>
+        <w:spacing w:line="360" w:lineRule="auto"/>
+        <w:rPr>
+          <w:rFonts w:ascii="Arial" w:hAnsi="Arial" w:cs="Arial"/>
+          <w:sz w:val="28"/>
+          <w:szCs w:val="28"/>
+        </w:rPr>
+      </w:pPr>
+      <w:r>
+        <w:rPr>
+          <w:rFonts w:ascii="Arial" w:hAnsi="Arial" w:cs="Arial"/>
+          <w:sz w:val="28"/>
+          <w:szCs w:val="28"/>
+        </w:rPr>
+        <w:t>Assign closest</w:t>
+      </w:r>
+      <w:r>
+        <w:rPr>
+          <w:rFonts w:ascii="Arial" w:hAnsi="Arial" w:cs="Arial"/>
+          <w:sz w:val="28"/>
+          <w:szCs w:val="28"/>
+        </w:rPr>
+        <w:t>_</w:t>
+      </w:r>
+      <w:r>
+        <w:rPr>
+          <w:rFonts w:ascii="Arial" w:hAnsi="Arial" w:cs="Arial"/>
+          <w:sz w:val="28"/>
+          <w:szCs w:val="28"/>
+        </w:rPr>
+        <w:t>package to None.</w:t>
+      </w:r>
+    </w:p>
+    <w:p>
+      <w:pPr>
+        <w:spacing w:line="360" w:lineRule="auto"/>
+        <w:rPr>
+          <w:rFonts w:ascii="Arial" w:hAnsi="Arial" w:cs="Arial"/>
+          <w:sz w:val="28"/>
+          <w:szCs w:val="28"/>
+        </w:rPr>
+      </w:pPr>
+      <w:r>
+        <w:rPr>
+          <w:rFonts w:ascii="Arial" w:hAnsi="Arial" w:cs="Arial"/>
+          <w:sz w:val="28"/>
+          <w:szCs w:val="28"/>
+        </w:rPr>
+        <w:t>For packages in the list of packages:</w:t>
+      </w:r>
+    </w:p>
+    <w:p>
+      <w:pPr>
+        <w:pStyle w:val="ListParagraph"/>
+        <w:numPr>
+          <w:ilvl w:val="0"/>
+          <w:numId w:val="5"/>
+        </w:numPr>
+        <w:spacing w:line="360" w:lineRule="auto"/>
+        <w:rPr>
+          <w:rFonts w:ascii="Arial" w:hAnsi="Arial" w:cs="Arial"/>
+          <w:sz w:val="28"/>
+          <w:szCs w:val="28"/>
+        </w:rPr>
+      </w:pPr>
+      <w:r>
+        <w:rPr>
+          <w:rFonts w:ascii="Arial" w:hAnsi="Arial" w:cs="Arial"/>
+          <w:sz w:val="28"/>
+          <w:szCs w:val="28"/>
+        </w:rPr>
+        <w:t>Get the address of the package</w:t>
+      </w:r>
+    </w:p>
+    <w:p>
+      <w:pPr>
+        <w:pStyle w:val="ListParagraph"/>
+        <w:numPr>
+          <w:ilvl w:val="0"/>
+          <w:numId w:val="5"/>
+        </w:numPr>
+        <w:spacing w:line="360" w:lineRule="auto"/>
+        <w:rPr>
+          <w:rFonts w:ascii="Arial" w:hAnsi="Arial" w:cs="Arial"/>
+          <w:sz w:val="28"/>
+          <w:szCs w:val="28"/>
+        </w:rPr>
+      </w:pPr>
+      <w:r>
+        <w:rPr>
+          <w:rFonts w:ascii="Arial" w:hAnsi="Arial" w:cs="Arial"/>
+          <w:sz w:val="28"/>
+          <w:szCs w:val="28"/>
+        </w:rPr>
+        <w:t xml:space="preserve">Get the </w:t>
+      </w:r>
+      <w:r>
+        <w:rPr>
+          <w:rFonts w:ascii="Arial" w:hAnsi="Arial" w:cs="Arial"/>
+          <w:sz w:val="28"/>
+          <w:szCs w:val="28"/>
+        </w:rPr>
+        <w:t>D</w:t>
+      </w:r>
+      <w:r>
+        <w:rPr>
+          <w:rFonts w:ascii="Arial" w:hAnsi="Arial" w:cs="Arial"/>
+          <w:sz w:val="28"/>
+          <w:szCs w:val="28"/>
+        </w:rPr>
+        <w:t>istance</w:t>
+      </w:r>
+      <w:r>
+        <w:rPr>
+          <w:rFonts w:ascii="Arial" w:hAnsi="Arial" w:cs="Arial"/>
+          <w:sz w:val="28"/>
+          <w:szCs w:val="28"/>
+        </w:rPr>
+        <w:t>()</w:t>
+      </w:r>
+      <w:r>
+        <w:rPr>
+          <w:rFonts w:ascii="Arial" w:hAnsi="Arial" w:cs="Arial"/>
+          <w:sz w:val="28"/>
+          <w:szCs w:val="28"/>
+        </w:rPr>
+        <w:t xml:space="preserve"> between </w:t>
+      </w:r>
+      <w:r>
+        <w:rPr>
+          <w:rFonts w:ascii="Arial" w:hAnsi="Arial" w:cs="Arial"/>
+          <w:sz w:val="28"/>
+          <w:szCs w:val="28"/>
+        </w:rPr>
+        <w:t xml:space="preserve">the </w:t>
+      </w:r>
+      <w:r>
+        <w:rPr>
+          <w:rFonts w:ascii="Arial" w:hAnsi="Arial" w:cs="Arial"/>
+          <w:sz w:val="28"/>
+          <w:szCs w:val="28"/>
+        </w:rPr>
+        <w:t>address</w:t>
+      </w:r>
+      <w:r>
+        <w:rPr>
+          <w:rFonts w:ascii="Arial" w:hAnsi="Arial" w:cs="Arial"/>
+          <w:sz w:val="28"/>
+          <w:szCs w:val="28"/>
+        </w:rPr>
+        <w:t xml:space="preserve"> and current location</w:t>
+      </w:r>
+    </w:p>
+    <w:p>
+      <w:pPr>
+        <w:pStyle w:val="ListParagraph"/>
+        <w:numPr>
+          <w:ilvl w:val="0"/>
+          <w:numId w:val="5"/>
+        </w:numPr>
+        <w:spacing w:line="360" w:lineRule="auto"/>
+        <w:rPr>
+          <w:rFonts w:ascii="Arial" w:hAnsi="Arial" w:cs="Arial"/>
+          <w:sz w:val="28"/>
+          <w:szCs w:val="28"/>
+        </w:rPr>
+      </w:pPr>
+      <w:r>
+        <w:rPr>
+          <w:rFonts w:ascii="Arial" w:hAnsi="Arial" w:cs="Arial"/>
+          <w:sz w:val="28"/>
+          <w:szCs w:val="28"/>
+        </w:rPr>
+        <w:t>If distance is shorter than current shortest_path:</w:t>
+      </w:r>
+    </w:p>
+    <w:p>
+      <w:pPr>
+        <w:pStyle w:val="ListParagraph"/>
+        <w:numPr>
+          <w:ilvl w:val="1"/>
+          <w:numId w:val="5"/>
+        </w:numPr>
+        <w:spacing w:line="360" w:lineRule="auto"/>
+        <w:rPr>
+          <w:rFonts w:ascii="Arial" w:hAnsi="Arial" w:cs="Arial"/>
+          <w:sz w:val="28"/>
+          <w:szCs w:val="28"/>
+        </w:rPr>
+      </w:pPr>
+      <w:r>
+        <w:rPr>
+          <w:rFonts w:ascii="Arial" w:hAnsi="Arial" w:cs="Arial"/>
+          <w:sz w:val="28"/>
+          <w:szCs w:val="28"/>
+        </w:rPr>
+        <w:t>Shortest_path is now that distance</w:t>
+      </w:r>
+    </w:p>
+    <w:p>
+      <w:pPr>
+        <w:pStyle w:val="ListParagraph"/>
+        <w:numPr>
+          <w:ilvl w:val="1"/>
+          <w:numId w:val="5"/>
+        </w:numPr>
+        <w:spacing w:line="360" w:lineRule="auto"/>
+        <w:rPr>
+          <w:rFonts w:ascii="Arial" w:hAnsi="Arial" w:cs="Arial"/>
+          <w:sz w:val="28"/>
+          <w:szCs w:val="28"/>
+        </w:rPr>
+      </w:pPr>
+      <w:r>
+        <w:rPr>
+          <w:rFonts w:ascii="Arial" w:hAnsi="Arial" w:cs="Arial"/>
+          <w:sz w:val="28"/>
+          <w:szCs w:val="28"/>
+        </w:rPr>
+        <w:t>Closest_package is now that package</w:t>
+      </w:r>
+    </w:p>
+    <w:p>
+      <w:pPr>
+        <w:spacing w:line="360" w:lineRule="auto"/>
+        <w:rPr>
+          <w:rFonts w:ascii="Arial" w:hAnsi="Arial" w:cs="Arial"/>
+          <w:sz w:val="28"/>
+          <w:szCs w:val="28"/>
+        </w:rPr>
+      </w:pPr>
+      <w:r>
+        <w:rPr>
+          <w:rFonts w:ascii="Arial" w:hAnsi="Arial" w:cs="Arial"/>
+          <w:sz w:val="28"/>
+          <w:szCs w:val="28"/>
+        </w:rPr>
+        <w:t>Return the shortest_path and the closest_package</w:t>
+      </w:r>
+    </w:p>
+    <w:p>
+      <w:pPr>
+        <w:spacing w:line="360" w:lineRule="auto"/>
+        <w:rPr>
+          <w:rFonts w:ascii="Arial" w:hAnsi="Arial" w:cs="Arial"/>
+          <w:sz w:val="28"/>
+          <w:szCs w:val="28"/>
+        </w:rPr>
+      </w:pPr>
+    </w:p>
+    <w:p>
+      <w:pPr>
+        <w:spacing w:line="360" w:lineRule="auto"/>
+        <w:rPr>
+          <w:rFonts w:ascii="Arial" w:hAnsi="Arial" w:cs="Arial"/>
+          <w:sz w:val="28"/>
+          <w:szCs w:val="28"/>
+        </w:rPr>
+      </w:pPr>
+      <w:r>
+        <w:rPr>
+          <w:rFonts w:ascii="Arial" w:hAnsi="Arial" w:cs="Arial"/>
+          <w:sz w:val="28"/>
+          <w:szCs w:val="28"/>
+        </w:rPr>
+        <w:t>Distance() Pseudocode:</w:t>
+      </w:r>
+    </w:p>
+    <w:p>
+      <w:pPr>
+        <w:spacing w:line="360" w:lineRule="auto"/>
+        <w:rPr>
+          <w:rFonts w:ascii="Arial" w:hAnsi="Arial" w:cs="Arial"/>
+          <w:sz w:val="28"/>
+          <w:szCs w:val="28"/>
+        </w:rPr>
+      </w:pPr>
+      <w:r>
+        <w:rPr>
+          <w:rFonts w:ascii="Arial" w:hAnsi="Arial" w:cs="Arial"/>
+          <w:sz w:val="28"/>
+          <w:szCs w:val="28"/>
+        </w:rPr>
+        <w:t>Take a list of address</w:t>
+      </w:r>
+      <w:r>
+        <w:rPr>
+          <w:rFonts w:ascii="Arial" w:hAnsi="Arial" w:cs="Arial"/>
+          <w:sz w:val="28"/>
+          <w:szCs w:val="28"/>
+        </w:rPr>
+        <w:t>es</w:t>
+      </w:r>
+    </w:p>
+    <w:p>
+      <w:pPr>
+        <w:spacing w:line="360" w:lineRule="auto"/>
+        <w:rPr>
+          <w:rFonts w:ascii="Arial" w:hAnsi="Arial" w:cs="Arial"/>
+          <w:sz w:val="28"/>
+          <w:szCs w:val="28"/>
+        </w:rPr>
+      </w:pPr>
+      <w:r>
+        <w:rPr>
+          <w:rFonts w:ascii="Arial" w:hAnsi="Arial" w:cs="Arial"/>
+          <w:sz w:val="28"/>
+          <w:szCs w:val="28"/>
+        </w:rPr>
+        <w:t xml:space="preserve">If from_address is </w:t>
+      </w:r>
+      <w:r>
+        <w:rPr>
+          <w:rFonts w:ascii="Arial" w:hAnsi="Arial" w:cs="Arial"/>
+          <w:sz w:val="28"/>
+          <w:szCs w:val="28"/>
+        </w:rPr>
+        <w:t>same as to_address</w:t>
+      </w:r>
+    </w:p>
+    <w:p>
+      <w:pPr>
+        <w:spacing w:line="360" w:lineRule="auto"/>
+        <w:rPr>
+          <w:rFonts w:ascii="Arial" w:hAnsi="Arial" w:cs="Arial"/>
+          <w:sz w:val="28"/>
+          <w:szCs w:val="28"/>
+        </w:rPr>
+      </w:pPr>
+      <w:r>
+        <w:rPr>
+          <w:rFonts w:ascii="Arial" w:hAnsi="Arial" w:cs="Arial"/>
+          <w:sz w:val="28"/>
+          <w:szCs w:val="28"/>
+        </w:rPr>
+        <w:tab/>
+        <w:t>Return 0 (same location)</w:t>
+      </w:r>
+    </w:p>
+    <w:p>
+      <w:pPr>
+        <w:spacing w:line="360" w:lineRule="auto"/>
+        <w:rPr>
+          <w:rFonts w:ascii="Arial" w:hAnsi="Arial" w:cs="Arial"/>
+          <w:sz w:val="28"/>
+          <w:szCs w:val="28"/>
+        </w:rPr>
+      </w:pPr>
+      <w:r>
+        <w:rPr>
+          <w:rFonts w:ascii="Arial" w:hAnsi="Arial" w:cs="Arial"/>
+          <w:sz w:val="28"/>
+          <w:szCs w:val="28"/>
+        </w:rPr>
+        <w:t xml:space="preserve">If </w:t>
+      </w:r>
+      <w:r>
+        <w:rPr>
+          <w:rFonts w:ascii="Arial" w:hAnsi="Arial" w:cs="Arial"/>
+          <w:sz w:val="28"/>
+          <w:szCs w:val="28"/>
+        </w:rPr>
+        <w:t>from_addresses index is greater then to_addresses index</w:t>
+      </w:r>
+    </w:p>
+    <w:p>
+      <w:pPr>
+        <w:spacing w:line="360" w:lineRule="auto"/>
+        <w:rPr>
+          <w:rFonts w:ascii="Arial" w:hAnsi="Arial" w:cs="Arial"/>
+          <w:sz w:val="28"/>
+          <w:szCs w:val="28"/>
+        </w:rPr>
+      </w:pPr>
+      <w:r>
+        <w:rPr>
+          <w:rFonts w:ascii="Arial" w:hAnsi="Arial" w:cs="Arial"/>
+          <w:sz w:val="28"/>
+          <w:szCs w:val="28"/>
+        </w:rPr>
+        <w:tab/>
+      </w:r>
+      <w:r>
+        <w:rPr>
+          <w:rFonts w:ascii="Arial" w:hAnsi="Arial" w:cs="Arial"/>
+          <w:sz w:val="28"/>
+          <w:szCs w:val="28"/>
+        </w:rPr>
+        <w:t>Distance is</w:t>
+      </w:r>
+      <w:r>
+        <w:rPr>
+          <w:rFonts w:ascii="Arial" w:hAnsi="Arial" w:cs="Arial"/>
+          <w:sz w:val="28"/>
+          <w:szCs w:val="28"/>
+        </w:rPr>
+        <w:t xml:space="preserve"> from_addresses distance at to_addresses index</w:t>
+      </w:r>
+    </w:p>
+    <w:p>
+      <w:pPr>
+        <w:spacing w:line="360" w:lineRule="auto"/>
+        <w:rPr>
+          <w:rFonts w:ascii="Arial" w:hAnsi="Arial" w:cs="Arial"/>
+          <w:sz w:val="28"/>
+          <w:szCs w:val="28"/>
+        </w:rPr>
+      </w:pPr>
+      <w:r>
+        <w:rPr>
+          <w:rFonts w:ascii="Arial" w:hAnsi="Arial" w:cs="Arial"/>
+          <w:sz w:val="28"/>
+          <w:szCs w:val="28"/>
+        </w:rPr>
+        <w:t>Otherwise (to_addresses index is greater then from_addresses)</w:t>
+      </w:r>
+    </w:p>
+    <w:p>
+      <w:pPr>
+        <w:spacing w:line="360" w:lineRule="auto"/>
+        <w:rPr>
+          <w:rFonts w:ascii="Arial" w:hAnsi="Arial" w:cs="Arial"/>
+          <w:sz w:val="28"/>
+          <w:szCs w:val="28"/>
+        </w:rPr>
+      </w:pPr>
+      <w:r>
+        <w:rPr>
+          <w:rFonts w:ascii="Arial" w:hAnsi="Arial" w:cs="Arial"/>
+          <w:sz w:val="28"/>
+          <w:szCs w:val="28"/>
+        </w:rPr>
+        <w:tab/>
+      </w:r>
+      <w:r>
+        <w:rPr>
+          <w:rFonts w:ascii="Arial" w:hAnsi="Arial" w:cs="Arial"/>
+          <w:sz w:val="28"/>
+          <w:szCs w:val="28"/>
+        </w:rPr>
+        <w:t>Distance</w:t>
+      </w:r>
+      <w:r>
+        <w:rPr>
+          <w:rFonts w:ascii="Arial" w:hAnsi="Arial" w:cs="Arial"/>
+          <w:sz w:val="28"/>
+          <w:szCs w:val="28"/>
+        </w:rPr>
+        <w:t xml:space="preserve"> to_addresses distance at from_addresses index</w:t>
+      </w:r>
+    </w:p>
+    <w:p>
+      <w:pPr>
+        <w:spacing w:line="360" w:lineRule="auto"/>
+        <w:rPr>
+          <w:rFonts w:ascii="Arial" w:hAnsi="Arial" w:cs="Arial"/>
+          <w:sz w:val="28"/>
+          <w:szCs w:val="28"/>
+        </w:rPr>
+      </w:pPr>
+      <w:r>
+        <w:rPr>
+          <w:rFonts w:ascii="Arial" w:hAnsi="Arial" w:cs="Arial"/>
+          <w:sz w:val="28"/>
+          <w:szCs w:val="28"/>
+        </w:rPr>
+        <w:t>Return Distance</w:t>
+      </w:r>
     </w:p>
     <w:p/>
     <w:p>
@@ -876,25 +1501,7 @@
           <w:sz w:val="28"/>
           <w:szCs w:val="28"/>
         </w:rPr>
-        <w:t xml:space="preserve">The versatility of using various data types as the assigned key in a hash table instead of only </w:t>
-      </w:r>
-      <w:proofErr w:type="gramStart"/>
-      <w:r>
-        <w:rPr>
-          <w:rFonts w:ascii="Arial" w:hAnsi="Arial" w:cs="Arial"/>
-          <w:sz w:val="28"/>
-          <w:szCs w:val="28"/>
-        </w:rPr>
-        <w:t>an</w:t>
-      </w:r>
-      <w:proofErr w:type="gramEnd"/>
-      <w:r>
-        <w:rPr>
-          <w:rFonts w:ascii="Arial" w:hAnsi="Arial" w:cs="Arial"/>
-          <w:sz w:val="28"/>
-          <w:szCs w:val="28"/>
-        </w:rPr>
-        <w:t xml:space="preserve"> integer can be considered a strength. </w:t>
+        <w:t xml:space="preserve">The versatility of using various data types as the assigned key in a hash table instead of only an integer can be considered a strength. </w:t>
       </w:r>
       <w:r>
         <w:rPr>
@@ -1032,23 +1639,13 @@
         </w:rPr>
         <w:t xml:space="preserve">average </w:t>
       </w:r>
-      <w:proofErr w:type="gramStart"/>
-      <w:r>
-        <w:rPr>
-          <w:rFonts w:ascii="Arial" w:hAnsi="Arial" w:cs="Arial"/>
-          <w:sz w:val="28"/>
-          <w:szCs w:val="28"/>
-        </w:rPr>
-        <w:t>O(</w:t>
-      </w:r>
-      <w:proofErr w:type="gramEnd"/>
-      <w:r>
-        <w:rPr>
-          <w:rFonts w:ascii="Arial" w:hAnsi="Arial" w:cs="Arial"/>
-          <w:sz w:val="28"/>
-          <w:szCs w:val="28"/>
-        </w:rPr>
-        <w:t>1)</w:t>
+      <w:r>
+        <w:rPr>
+          <w:rFonts w:ascii="Arial" w:hAnsi="Arial" w:cs="Arial"/>
+          <w:sz w:val="28"/>
+          <w:szCs w:val="28"/>
+        </w:rPr>
+        <w:t>O(1)</w:t>
       </w:r>
       <w:r>
         <w:rPr>
@@ -1434,25 +2031,7 @@
           <w:sz w:val="28"/>
           <w:szCs w:val="28"/>
         </w:rPr>
-        <w:t xml:space="preserve"> </w:t>
-      </w:r>
-      <w:proofErr w:type="gramStart"/>
-      <w:r>
-        <w:rPr>
-          <w:rFonts w:ascii="Arial" w:hAnsi="Arial" w:cs="Arial"/>
-          <w:sz w:val="28"/>
-          <w:szCs w:val="28"/>
-        </w:rPr>
-        <w:t>edition</w:t>
-      </w:r>
-      <w:proofErr w:type="gramEnd"/>
-      <w:r>
-        <w:rPr>
-          <w:rFonts w:ascii="Arial" w:hAnsi="Arial" w:cs="Arial"/>
-          <w:sz w:val="28"/>
-          <w:szCs w:val="28"/>
-        </w:rPr>
-        <w:t xml:space="preserve"> but requirements may be different)</w:t>
+        <w:t xml:space="preserve"> edition but requirements may be different)</w:t>
       </w:r>
     </w:p>
     <w:p>
@@ -1488,25 +2067,7 @@
           <w:sz w:val="28"/>
           <w:szCs w:val="28"/>
         </w:rPr>
-        <w:t xml:space="preserve">. </w:t>
-      </w:r>
-      <w:proofErr w:type="spellStart"/>
-      <w:r>
-        <w:rPr>
-          <w:rFonts w:ascii="Arial" w:hAnsi="Arial" w:cs="Arial"/>
-          <w:sz w:val="28"/>
-          <w:szCs w:val="28"/>
-        </w:rPr>
-        <w:t>zyBooks</w:t>
-      </w:r>
-      <w:proofErr w:type="spellEnd"/>
-      <w:r>
-        <w:rPr>
-          <w:rFonts w:ascii="Arial" w:hAnsi="Arial" w:cs="Arial"/>
-          <w:sz w:val="28"/>
-          <w:szCs w:val="28"/>
-        </w:rPr>
-        <w:t>.</w:t>
+        <w:t>. zyBooks.</w:t>
       </w:r>
     </w:p>
     <w:p>
@@ -1668,6 +2229,7 @@
         <w:docPartUnique/>
       </w:docPartObj>
     </w:sdtPr>
+    <w:sdtEndPr/>
     <w:sdtContent>
       <w:sdt>
         <w:sdtPr>
@@ -1677,6 +2239,7 @@
             <w:docPartUnique/>
           </w:docPartObj>
         </w:sdtPr>
+        <w:sdtEndPr/>
         <w:sdtContent>
           <w:p>
             <w:pPr>
@@ -2125,6 +2688,119 @@
     </w:lvl>
   </w:abstractNum>
   <w:abstractNum w:abstractNumId="3" w15:restartNumberingAfterBreak="0">
+    <w:nsid w:val="3D8F4B30"/>
+    <w:multiLevelType w:val="hybridMultilevel"/>
+    <w:tmpl w:val="968A93FE"/>
+    <w:lvl w:ilvl="0" w:tplc="8E061554">
+      <w:start w:val="2"/>
+      <w:numFmt w:val="bullet"/>
+      <w:lvlText w:val="-"/>
+      <w:lvlJc w:val="left"/>
+      <w:pPr>
+        <w:ind w:left="1080" w:hanging="360"/>
+      </w:pPr>
+      <w:rPr>
+        <w:rFonts w:ascii="Arial" w:eastAsiaTheme="minorEastAsia" w:hAnsi="Arial" w:cs="Arial" w:hint="default"/>
+      </w:rPr>
+    </w:lvl>
+    <w:lvl w:ilvl="1" w:tplc="04090003">
+      <w:start w:val="1"/>
+      <w:numFmt w:val="bullet"/>
+      <w:lvlText w:val="o"/>
+      <w:lvlJc w:val="left"/>
+      <w:pPr>
+        <w:ind w:left="1800" w:hanging="360"/>
+      </w:pPr>
+      <w:rPr>
+        <w:rFonts w:ascii="Courier New" w:hAnsi="Courier New" w:cs="Courier New" w:hint="default"/>
+      </w:rPr>
+    </w:lvl>
+    <w:lvl w:ilvl="2" w:tplc="04090005" w:tentative="1">
+      <w:start w:val="1"/>
+      <w:numFmt w:val="bullet"/>
+      <w:lvlText w:val=""/>
+      <w:lvlJc w:val="left"/>
+      <w:pPr>
+        <w:ind w:left="2520" w:hanging="360"/>
+      </w:pPr>
+      <w:rPr>
+        <w:rFonts w:ascii="Wingdings" w:hAnsi="Wingdings" w:hint="default"/>
+      </w:rPr>
+    </w:lvl>
+    <w:lvl w:ilvl="3" w:tplc="04090001" w:tentative="1">
+      <w:start w:val="1"/>
+      <w:numFmt w:val="bullet"/>
+      <w:lvlText w:val=""/>
+      <w:lvlJc w:val="left"/>
+      <w:pPr>
+        <w:ind w:left="3240" w:hanging="360"/>
+      </w:pPr>
+      <w:rPr>
+        <w:rFonts w:ascii="Symbol" w:hAnsi="Symbol" w:hint="default"/>
+      </w:rPr>
+    </w:lvl>
+    <w:lvl w:ilvl="4" w:tplc="04090003" w:tentative="1">
+      <w:start w:val="1"/>
+      <w:numFmt w:val="bullet"/>
+      <w:lvlText w:val="o"/>
+      <w:lvlJc w:val="left"/>
+      <w:pPr>
+        <w:ind w:left="3960" w:hanging="360"/>
+      </w:pPr>
+      <w:rPr>
+        <w:rFonts w:ascii="Courier New" w:hAnsi="Courier New" w:cs="Courier New" w:hint="default"/>
+      </w:rPr>
+    </w:lvl>
+    <w:lvl w:ilvl="5" w:tplc="04090005" w:tentative="1">
+      <w:start w:val="1"/>
+      <w:numFmt w:val="bullet"/>
+      <w:lvlText w:val=""/>
+      <w:lvlJc w:val="left"/>
+      <w:pPr>
+        <w:ind w:left="4680" w:hanging="360"/>
+      </w:pPr>
+      <w:rPr>
+        <w:rFonts w:ascii="Wingdings" w:hAnsi="Wingdings" w:hint="default"/>
+      </w:rPr>
+    </w:lvl>
+    <w:lvl w:ilvl="6" w:tplc="04090001" w:tentative="1">
+      <w:start w:val="1"/>
+      <w:numFmt w:val="bullet"/>
+      <w:lvlText w:val=""/>
+      <w:lvlJc w:val="left"/>
+      <w:pPr>
+        <w:ind w:left="5400" w:hanging="360"/>
+      </w:pPr>
+      <w:rPr>
+        <w:rFonts w:ascii="Symbol" w:hAnsi="Symbol" w:hint="default"/>
+      </w:rPr>
+    </w:lvl>
+    <w:lvl w:ilvl="7" w:tplc="04090003" w:tentative="1">
+      <w:start w:val="1"/>
+      <w:numFmt w:val="bullet"/>
+      <w:lvlText w:val="o"/>
+      <w:lvlJc w:val="left"/>
+      <w:pPr>
+        <w:ind w:left="6120" w:hanging="360"/>
+      </w:pPr>
+      <w:rPr>
+        <w:rFonts w:ascii="Courier New" w:hAnsi="Courier New" w:cs="Courier New" w:hint="default"/>
+      </w:rPr>
+    </w:lvl>
+    <w:lvl w:ilvl="8" w:tplc="04090005" w:tentative="1">
+      <w:start w:val="1"/>
+      <w:numFmt w:val="bullet"/>
+      <w:lvlText w:val=""/>
+      <w:lvlJc w:val="left"/>
+      <w:pPr>
+        <w:ind w:left="6840" w:hanging="360"/>
+      </w:pPr>
+      <w:rPr>
+        <w:rFonts w:ascii="Wingdings" w:hAnsi="Wingdings" w:hint="default"/>
+      </w:rPr>
+    </w:lvl>
+  </w:abstractNum>
+  <w:abstractNum w:abstractNumId="4" w15:restartNumberingAfterBreak="0">
     <w:nsid w:val="59B25C2A"/>
     <w:multiLevelType w:val="hybridMultilevel"/>
     <w:tmpl w:val="49303F0E"/>
@@ -2217,7 +2893,7 @@
     <w:abstractNumId w:val="2"/>
   </w:num>
   <w:num w:numId="3" w16cid:durableId="462161879">
-    <w:abstractNumId w:val="3"/>
+    <w:abstractNumId w:val="4"/>
     <w:lvlOverride w:ilvl="0">
       <w:startOverride w:val="1"/>
     </w:lvlOverride>
@@ -2248,6 +2924,9 @@
   </w:num>
   <w:num w:numId="4" w16cid:durableId="2001273942">
     <w:abstractNumId w:val="1"/>
+  </w:num>
+  <w:num w:numId="5" w16cid:durableId="1916745639">
+    <w:abstractNumId w:val="3"/>
   </w:num>
 </w:numbering>
 </file>

</xml_diff>

<commit_message>
finishing up, im tired :(
</commit_message>
<xml_diff>
--- a/C950-Task-1-Sam-Merrill.docx
+++ b/C950-Task-1-Sam-Merrill.docx
@@ -366,7 +366,115 @@
           <w:sz w:val="28"/>
           <w:szCs w:val="28"/>
         </w:rPr>
-        <w:t>Text goes here</w:t>
+        <w:t>The following program runs a delivery driver simulation for “WGU</w:t>
+      </w:r>
+      <w:r>
+        <w:rPr>
+          <w:rFonts w:ascii="Arial" w:hAnsi="Arial" w:cs="Arial"/>
+          <w:sz w:val="28"/>
+          <w:szCs w:val="28"/>
+        </w:rPr>
+        <w:t xml:space="preserve">PS”, which contains 40 packages with various constraints. The Nearest Neighbor algorithm is used to implement </w:t>
+      </w:r>
+      <w:proofErr w:type="gramStart"/>
+      <w:r>
+        <w:rPr>
+          <w:rFonts w:ascii="Arial" w:hAnsi="Arial" w:cs="Arial"/>
+          <w:sz w:val="28"/>
+          <w:szCs w:val="28"/>
+        </w:rPr>
+        <w:t>the truck</w:t>
+      </w:r>
+      <w:proofErr w:type="gramEnd"/>
+      <w:r>
+        <w:rPr>
+          <w:rFonts w:ascii="Arial" w:hAnsi="Arial" w:cs="Arial"/>
+          <w:sz w:val="28"/>
+          <w:szCs w:val="28"/>
+        </w:rPr>
+        <w:t xml:space="preserve"> routes. Package information can be </w:t>
+      </w:r>
+      <w:r>
+        <w:rPr>
+          <w:rFonts w:ascii="Arial" w:hAnsi="Arial" w:cs="Arial"/>
+          <w:sz w:val="28"/>
+          <w:szCs w:val="28"/>
+        </w:rPr>
+        <w:t>searche</w:t>
+      </w:r>
+      <w:r>
+        <w:rPr>
+          <w:rFonts w:ascii="Arial" w:hAnsi="Arial" w:cs="Arial"/>
+          <w:sz w:val="28"/>
+          <w:szCs w:val="28"/>
+        </w:rPr>
+        <w:t xml:space="preserve">d </w:t>
+      </w:r>
+      <w:r>
+        <w:rPr>
+          <w:rFonts w:ascii="Arial" w:hAnsi="Arial" w:cs="Arial"/>
+          <w:sz w:val="28"/>
+          <w:szCs w:val="28"/>
+        </w:rPr>
+        <w:t>for</w:t>
+      </w:r>
+      <w:r>
+        <w:rPr>
+          <w:rFonts w:ascii="Arial" w:hAnsi="Arial" w:cs="Arial"/>
+          <w:sz w:val="28"/>
+          <w:szCs w:val="28"/>
+        </w:rPr>
+        <w:t xml:space="preserve"> by entering an </w:t>
+      </w:r>
+      <w:r>
+        <w:rPr>
+          <w:rFonts w:ascii="Arial" w:hAnsi="Arial" w:cs="Arial"/>
+          <w:sz w:val="28"/>
+          <w:szCs w:val="28"/>
+        </w:rPr>
+        <w:t>ID</w:t>
+      </w:r>
+      <w:r>
+        <w:rPr>
+          <w:rFonts w:ascii="Arial" w:hAnsi="Arial" w:cs="Arial"/>
+          <w:sz w:val="28"/>
+          <w:szCs w:val="28"/>
+        </w:rPr>
+        <w:t xml:space="preserve">. </w:t>
+      </w:r>
+      <w:r>
+        <w:rPr>
+          <w:rFonts w:ascii="Arial" w:hAnsi="Arial" w:cs="Arial"/>
+          <w:sz w:val="28"/>
+          <w:szCs w:val="28"/>
+        </w:rPr>
+        <w:t xml:space="preserve">Statuses and package information can also be viewed </w:t>
+      </w:r>
+      <w:proofErr w:type="gramStart"/>
+      <w:r>
+        <w:rPr>
+          <w:rFonts w:ascii="Arial" w:hAnsi="Arial" w:cs="Arial"/>
+          <w:sz w:val="28"/>
+          <w:szCs w:val="28"/>
+        </w:rPr>
+        <w:t>by</w:t>
+      </w:r>
+      <w:proofErr w:type="gramEnd"/>
+      <w:r>
+        <w:rPr>
+          <w:rFonts w:ascii="Arial" w:hAnsi="Arial" w:cs="Arial"/>
+          <w:sz w:val="28"/>
+          <w:szCs w:val="28"/>
+        </w:rPr>
+        <w:t xml:space="preserve"> time of day by entering the minute value of the </w:t>
+      </w:r>
+      <w:r>
+        <w:rPr>
+          <w:rFonts w:ascii="Arial" w:hAnsi="Arial" w:cs="Arial"/>
+          <w:sz w:val="28"/>
+          <w:szCs w:val="28"/>
+        </w:rPr>
+        <w:t>desired time. The total mileage can also be viewed for all trucks and collective totals.</w:t>
       </w:r>
     </w:p>
     <w:p>
@@ -550,7 +658,16 @@
           <w:sz w:val="28"/>
           <w:szCs w:val="28"/>
         </w:rPr>
-        <w:t xml:space="preserve"> establishes the individual data for each package, but the hash map stores all packages accord</w:t>
+        <w:t xml:space="preserve"> </w:t>
+      </w:r>
+      <w:r>
+        <w:rPr>
+          <w:rFonts w:ascii="Arial" w:hAnsi="Arial" w:cs="Arial"/>
+          <w:sz w:val="28"/>
+          <w:szCs w:val="28"/>
+        </w:rPr>
+        <w:lastRenderedPageBreak/>
+        <w:t>establishes the individual data for each package, but the hash map stores all packages accord</w:t>
       </w:r>
       <w:r>
         <w:rPr>
@@ -613,58 +730,59 @@
         <w:spacing w:line="360" w:lineRule="auto"/>
         <w:rPr>
           <w:rFonts w:ascii="Arial" w:hAnsi="Arial" w:cs="Arial"/>
-          <w:sz w:val="28"/>
-          <w:szCs w:val="28"/>
-        </w:rPr>
-      </w:pPr>
-      <w:r>
-        <w:rPr>
-          <w:rFonts w:ascii="Arial" w:hAnsi="Arial" w:cs="Arial"/>
-          <w:sz w:val="28"/>
-          <w:szCs w:val="28"/>
-        </w:rPr>
-        <w:t>Explain the algorithm’s logic using pseudocode.</w:t>
-      </w:r>
-    </w:p>
-    <w:p>
-      <w:pPr>
-        <w:spacing w:line="360" w:lineRule="auto"/>
-        <w:rPr>
-          <w:rFonts w:ascii="Arial" w:hAnsi="Arial" w:cs="Arial"/>
-          <w:sz w:val="28"/>
-          <w:szCs w:val="28"/>
-        </w:rPr>
-      </w:pPr>
-      <w:r>
-        <w:rPr>
-          <w:rFonts w:ascii="Arial" w:hAnsi="Arial" w:cs="Arial"/>
-          <w:sz w:val="28"/>
-          <w:szCs w:val="28"/>
-        </w:rPr>
-        <w:lastRenderedPageBreak/>
-        <w:t>Nearest_Neighbor</w:t>
-      </w:r>
-      <w:r>
-        <w:rPr>
-          <w:rFonts w:ascii="Arial" w:hAnsi="Arial" w:cs="Arial"/>
-          <w:sz w:val="28"/>
-          <w:szCs w:val="28"/>
-        </w:rPr>
-        <w:t>()</w:t>
-      </w:r>
-      <w:r>
-        <w:rPr>
-          <w:rFonts w:ascii="Arial" w:hAnsi="Arial" w:cs="Arial"/>
-          <w:sz w:val="28"/>
-          <w:szCs w:val="28"/>
+          <w:sz w:val="24"/>
+          <w:szCs w:val="24"/>
+        </w:rPr>
+      </w:pPr>
+      <w:proofErr w:type="spellStart"/>
+      <w:r>
+        <w:rPr>
+          <w:rFonts w:ascii="Arial" w:hAnsi="Arial" w:cs="Arial"/>
+          <w:sz w:val="24"/>
+          <w:szCs w:val="24"/>
+        </w:rPr>
+        <w:t>Nearest_</w:t>
+      </w:r>
+      <w:proofErr w:type="gramStart"/>
+      <w:r>
+        <w:rPr>
+          <w:rFonts w:ascii="Arial" w:hAnsi="Arial" w:cs="Arial"/>
+          <w:sz w:val="24"/>
+          <w:szCs w:val="24"/>
+        </w:rPr>
+        <w:t>Neighbor</w:t>
+      </w:r>
+      <w:proofErr w:type="spellEnd"/>
+      <w:r>
+        <w:rPr>
+          <w:rFonts w:ascii="Arial" w:hAnsi="Arial" w:cs="Arial"/>
+          <w:sz w:val="24"/>
+          <w:szCs w:val="24"/>
+        </w:rPr>
+        <w:t>(</w:t>
+      </w:r>
+      <w:proofErr w:type="gramEnd"/>
+      <w:r>
+        <w:rPr>
+          <w:rFonts w:ascii="Arial" w:hAnsi="Arial" w:cs="Arial"/>
+          <w:sz w:val="24"/>
+          <w:szCs w:val="24"/>
+        </w:rPr>
+        <w:t>)</w:t>
+      </w:r>
+      <w:r>
+        <w:rPr>
+          <w:rFonts w:ascii="Arial" w:hAnsi="Arial" w:cs="Arial"/>
+          <w:sz w:val="24"/>
+          <w:szCs w:val="24"/>
         </w:rPr>
         <w:t xml:space="preserve"> </w:t>
       </w:r>
       <w:r>
         <w:rPr>
           <w:rFonts w:ascii="Arial" w:hAnsi="Arial" w:cs="Arial"/>
-          <w:sz w:val="28"/>
-          <w:szCs w:val="28"/>
+          <w:sz w:val="24"/>
+          <w:szCs w:val="24"/>
         </w:rPr>
         <w:t xml:space="preserve">Pseudocode: </w:t>
       </w:r>
@@ -674,31 +792,49 @@
         <w:spacing w:line="360" w:lineRule="auto"/>
         <w:rPr>
           <w:rFonts w:ascii="Arial" w:hAnsi="Arial" w:cs="Arial"/>
-          <w:sz w:val="28"/>
-          <w:szCs w:val="28"/>
-        </w:rPr>
-      </w:pPr>
-      <w:r>
-        <w:rPr>
-          <w:rFonts w:ascii="Arial" w:hAnsi="Arial" w:cs="Arial"/>
-          <w:sz w:val="28"/>
-          <w:szCs w:val="28"/>
-        </w:rPr>
-        <w:t xml:space="preserve">Assign shortest_path to </w:t>
-      </w:r>
-      <w:r>
-        <w:rPr>
-          <w:rFonts w:ascii="Arial" w:hAnsi="Arial" w:cs="Arial"/>
-          <w:sz w:val="28"/>
-          <w:szCs w:val="28"/>
+          <w:sz w:val="24"/>
+          <w:szCs w:val="24"/>
+        </w:rPr>
+      </w:pPr>
+      <w:r>
+        <w:rPr>
+          <w:rFonts w:ascii="Arial" w:hAnsi="Arial" w:cs="Arial"/>
+          <w:sz w:val="24"/>
+          <w:szCs w:val="24"/>
+        </w:rPr>
+        <w:t xml:space="preserve">Assign </w:t>
+      </w:r>
+      <w:proofErr w:type="spellStart"/>
+      <w:r>
+        <w:rPr>
+          <w:rFonts w:ascii="Arial" w:hAnsi="Arial" w:cs="Arial"/>
+          <w:sz w:val="24"/>
+          <w:szCs w:val="24"/>
+        </w:rPr>
+        <w:t>shortest_path</w:t>
+      </w:r>
+      <w:proofErr w:type="spellEnd"/>
+      <w:r>
+        <w:rPr>
+          <w:rFonts w:ascii="Arial" w:hAnsi="Arial" w:cs="Arial"/>
+          <w:sz w:val="24"/>
+          <w:szCs w:val="24"/>
+        </w:rPr>
+        <w:t xml:space="preserve"> to </w:t>
+      </w:r>
+      <w:r>
+        <w:rPr>
+          <w:rFonts w:ascii="Arial" w:hAnsi="Arial" w:cs="Arial"/>
+          <w:sz w:val="24"/>
+          <w:szCs w:val="24"/>
         </w:rPr>
         <w:t xml:space="preserve">a </w:t>
       </w:r>
       <w:r>
         <w:rPr>
           <w:rFonts w:ascii="Arial" w:hAnsi="Arial" w:cs="Arial"/>
-          <w:sz w:val="28"/>
-          <w:szCs w:val="28"/>
+          <w:sz w:val="24"/>
+          <w:szCs w:val="24"/>
         </w:rPr>
         <w:t>high value.</w:t>
       </w:r>
@@ -708,49 +844,67 @@
         <w:spacing w:line="360" w:lineRule="auto"/>
         <w:rPr>
           <w:rFonts w:ascii="Arial" w:hAnsi="Arial" w:cs="Arial"/>
-          <w:sz w:val="28"/>
-          <w:szCs w:val="28"/>
-        </w:rPr>
-      </w:pPr>
-      <w:r>
-        <w:rPr>
-          <w:rFonts w:ascii="Arial" w:hAnsi="Arial" w:cs="Arial"/>
-          <w:sz w:val="28"/>
-          <w:szCs w:val="28"/>
-        </w:rPr>
-        <w:t>Assign closest</w:t>
-      </w:r>
-      <w:r>
-        <w:rPr>
-          <w:rFonts w:ascii="Arial" w:hAnsi="Arial" w:cs="Arial"/>
-          <w:sz w:val="28"/>
-          <w:szCs w:val="28"/>
+          <w:sz w:val="24"/>
+          <w:szCs w:val="24"/>
+        </w:rPr>
+      </w:pPr>
+      <w:r>
+        <w:rPr>
+          <w:rFonts w:ascii="Arial" w:hAnsi="Arial" w:cs="Arial"/>
+          <w:sz w:val="24"/>
+          <w:szCs w:val="24"/>
+        </w:rPr>
+        <w:t xml:space="preserve">Assign </w:t>
+      </w:r>
+      <w:proofErr w:type="spellStart"/>
+      <w:r>
+        <w:rPr>
+          <w:rFonts w:ascii="Arial" w:hAnsi="Arial" w:cs="Arial"/>
+          <w:sz w:val="24"/>
+          <w:szCs w:val="24"/>
+        </w:rPr>
+        <w:t>closest</w:t>
+      </w:r>
+      <w:r>
+        <w:rPr>
+          <w:rFonts w:ascii="Arial" w:hAnsi="Arial" w:cs="Arial"/>
+          <w:sz w:val="24"/>
+          <w:szCs w:val="24"/>
         </w:rPr>
         <w:t>_</w:t>
       </w:r>
       <w:r>
         <w:rPr>
           <w:rFonts w:ascii="Arial" w:hAnsi="Arial" w:cs="Arial"/>
-          <w:sz w:val="28"/>
-          <w:szCs w:val="28"/>
-        </w:rPr>
-        <w:t>package to None.</w:t>
-      </w:r>
-    </w:p>
-    <w:p>
-      <w:pPr>
-        <w:spacing w:line="360" w:lineRule="auto"/>
-        <w:rPr>
-          <w:rFonts w:ascii="Arial" w:hAnsi="Arial" w:cs="Arial"/>
-          <w:sz w:val="28"/>
-          <w:szCs w:val="28"/>
-        </w:rPr>
-      </w:pPr>
-      <w:r>
-        <w:rPr>
-          <w:rFonts w:ascii="Arial" w:hAnsi="Arial" w:cs="Arial"/>
-          <w:sz w:val="28"/>
-          <w:szCs w:val="28"/>
+          <w:sz w:val="24"/>
+          <w:szCs w:val="24"/>
+        </w:rPr>
+        <w:t>package</w:t>
+      </w:r>
+      <w:proofErr w:type="spellEnd"/>
+      <w:r>
+        <w:rPr>
+          <w:rFonts w:ascii="Arial" w:hAnsi="Arial" w:cs="Arial"/>
+          <w:sz w:val="24"/>
+          <w:szCs w:val="24"/>
+        </w:rPr>
+        <w:t xml:space="preserve"> to None.</w:t>
+      </w:r>
+    </w:p>
+    <w:p>
+      <w:pPr>
+        <w:spacing w:line="360" w:lineRule="auto"/>
+        <w:rPr>
+          <w:rFonts w:ascii="Arial" w:hAnsi="Arial" w:cs="Arial"/>
+          <w:sz w:val="24"/>
+          <w:szCs w:val="24"/>
+        </w:rPr>
+      </w:pPr>
+      <w:r>
+        <w:rPr>
+          <w:rFonts w:ascii="Arial" w:hAnsi="Arial" w:cs="Arial"/>
+          <w:sz w:val="24"/>
+          <w:szCs w:val="24"/>
         </w:rPr>
         <w:t>For packages in the list of packages:</w:t>
       </w:r>
@@ -765,15 +919,11 @@
         <w:spacing w:line="360" w:lineRule="auto"/>
         <w:rPr>
           <w:rFonts w:ascii="Arial" w:hAnsi="Arial" w:cs="Arial"/>
-          <w:sz w:val="28"/>
-          <w:szCs w:val="28"/>
-        </w:rPr>
-      </w:pPr>
-      <w:r>
-        <w:rPr>
-          <w:rFonts w:ascii="Arial" w:hAnsi="Arial" w:cs="Arial"/>
-          <w:sz w:val="28"/>
-          <w:szCs w:val="28"/>
+        </w:rPr>
+      </w:pPr>
+      <w:r>
+        <w:rPr>
+          <w:rFonts w:ascii="Arial" w:hAnsi="Arial" w:cs="Arial"/>
         </w:rPr>
         <w:t>Get the address of the package</w:t>
       </w:r>
@@ -788,71 +938,61 @@
         <w:spacing w:line="360" w:lineRule="auto"/>
         <w:rPr>
           <w:rFonts w:ascii="Arial" w:hAnsi="Arial" w:cs="Arial"/>
-          <w:sz w:val="28"/>
-          <w:szCs w:val="28"/>
-        </w:rPr>
-      </w:pPr>
-      <w:r>
-        <w:rPr>
-          <w:rFonts w:ascii="Arial" w:hAnsi="Arial" w:cs="Arial"/>
-          <w:sz w:val="28"/>
-          <w:szCs w:val="28"/>
+        </w:rPr>
+      </w:pPr>
+      <w:r>
+        <w:rPr>
+          <w:rFonts w:ascii="Arial" w:hAnsi="Arial" w:cs="Arial"/>
         </w:rPr>
         <w:t xml:space="preserve">Get the </w:t>
       </w:r>
-      <w:r>
-        <w:rPr>
-          <w:rFonts w:ascii="Arial" w:hAnsi="Arial" w:cs="Arial"/>
-          <w:sz w:val="28"/>
-          <w:szCs w:val="28"/>
+      <w:proofErr w:type="gramStart"/>
+      <w:r>
+        <w:rPr>
+          <w:rFonts w:ascii="Arial" w:hAnsi="Arial" w:cs="Arial"/>
         </w:rPr>
         <w:t>D</w:t>
       </w:r>
       <w:r>
         <w:rPr>
           <w:rFonts w:ascii="Arial" w:hAnsi="Arial" w:cs="Arial"/>
-          <w:sz w:val="28"/>
-          <w:szCs w:val="28"/>
         </w:rPr>
         <w:t>istance</w:t>
       </w:r>
       <w:r>
         <w:rPr>
           <w:rFonts w:ascii="Arial" w:hAnsi="Arial" w:cs="Arial"/>
-          <w:sz w:val="28"/>
-          <w:szCs w:val="28"/>
-        </w:rPr>
-        <w:t>()</w:t>
-      </w:r>
-      <w:r>
-        <w:rPr>
-          <w:rFonts w:ascii="Arial" w:hAnsi="Arial" w:cs="Arial"/>
-          <w:sz w:val="28"/>
-          <w:szCs w:val="28"/>
+        </w:rPr>
+        <w:t>(</w:t>
+      </w:r>
+      <w:proofErr w:type="gramEnd"/>
+      <w:r>
+        <w:rPr>
+          <w:rFonts w:ascii="Arial" w:hAnsi="Arial" w:cs="Arial"/>
+        </w:rPr>
+        <w:t>)</w:t>
+      </w:r>
+      <w:r>
+        <w:rPr>
+          <w:rFonts w:ascii="Arial" w:hAnsi="Arial" w:cs="Arial"/>
         </w:rPr>
         <w:t xml:space="preserve"> between </w:t>
       </w:r>
       <w:r>
         <w:rPr>
           <w:rFonts w:ascii="Arial" w:hAnsi="Arial" w:cs="Arial"/>
-          <w:sz w:val="28"/>
-          <w:szCs w:val="28"/>
         </w:rPr>
         <w:t xml:space="preserve">the </w:t>
       </w:r>
       <w:r>
         <w:rPr>
           <w:rFonts w:ascii="Arial" w:hAnsi="Arial" w:cs="Arial"/>
-          <w:sz w:val="28"/>
-          <w:szCs w:val="28"/>
         </w:rPr>
         <w:t>address</w:t>
       </w:r>
       <w:r>
         <w:rPr>
           <w:rFonts w:ascii="Arial" w:hAnsi="Arial" w:cs="Arial"/>
-          <w:sz w:val="28"/>
-          <w:szCs w:val="28"/>
         </w:rPr>
         <w:t xml:space="preserve"> and current location</w:t>
       </w:r>
@@ -867,17 +1007,27 @@
         <w:spacing w:line="360" w:lineRule="auto"/>
         <w:rPr>
           <w:rFonts w:ascii="Arial" w:hAnsi="Arial" w:cs="Arial"/>
-          <w:sz w:val="28"/>
-          <w:szCs w:val="28"/>
-        </w:rPr>
-      </w:pPr>
-      <w:r>
-        <w:rPr>
-          <w:rFonts w:ascii="Arial" w:hAnsi="Arial" w:cs="Arial"/>
-          <w:sz w:val="28"/>
-          <w:szCs w:val="28"/>
-        </w:rPr>
-        <w:t>If distance is shorter than current shortest_path:</w:t>
+        </w:rPr>
+      </w:pPr>
+      <w:r>
+        <w:rPr>
+          <w:rFonts w:ascii="Arial" w:hAnsi="Arial" w:cs="Arial"/>
+        </w:rPr>
+        <w:t xml:space="preserve">If distance is shorter than current </w:t>
+      </w:r>
+      <w:proofErr w:type="spellStart"/>
+      <w:r>
+        <w:rPr>
+          <w:rFonts w:ascii="Arial" w:hAnsi="Arial" w:cs="Arial"/>
+        </w:rPr>
+        <w:t>shortest_path</w:t>
+      </w:r>
+      <w:proofErr w:type="spellEnd"/>
+      <w:r>
+        <w:rPr>
+          <w:rFonts w:ascii="Arial" w:hAnsi="Arial" w:cs="Arial"/>
+        </w:rPr>
+        <w:t>:</w:t>
       </w:r>
     </w:p>
     <w:p>
@@ -890,17 +1040,21 @@
         <w:spacing w:line="360" w:lineRule="auto"/>
         <w:rPr>
           <w:rFonts w:ascii="Arial" w:hAnsi="Arial" w:cs="Arial"/>
-          <w:sz w:val="28"/>
-          <w:szCs w:val="28"/>
-        </w:rPr>
-      </w:pPr>
-      <w:r>
-        <w:rPr>
-          <w:rFonts w:ascii="Arial" w:hAnsi="Arial" w:cs="Arial"/>
-          <w:sz w:val="28"/>
-          <w:szCs w:val="28"/>
-        </w:rPr>
-        <w:t>Shortest_path is now that distance</w:t>
+        </w:rPr>
+      </w:pPr>
+      <w:proofErr w:type="spellStart"/>
+      <w:r>
+        <w:rPr>
+          <w:rFonts w:ascii="Arial" w:hAnsi="Arial" w:cs="Arial"/>
+        </w:rPr>
+        <w:t>Shortest_path</w:t>
+      </w:r>
+      <w:proofErr w:type="spellEnd"/>
+      <w:r>
+        <w:rPr>
+          <w:rFonts w:ascii="Arial" w:hAnsi="Arial" w:cs="Arial"/>
+        </w:rPr>
+        <w:t xml:space="preserve"> is now that distance</w:t>
       </w:r>
     </w:p>
     <w:p>
@@ -913,87 +1067,129 @@
         <w:spacing w:line="360" w:lineRule="auto"/>
         <w:rPr>
           <w:rFonts w:ascii="Arial" w:hAnsi="Arial" w:cs="Arial"/>
-          <w:sz w:val="28"/>
-          <w:szCs w:val="28"/>
-        </w:rPr>
-      </w:pPr>
-      <w:r>
-        <w:rPr>
-          <w:rFonts w:ascii="Arial" w:hAnsi="Arial" w:cs="Arial"/>
-          <w:sz w:val="28"/>
-          <w:szCs w:val="28"/>
-        </w:rPr>
-        <w:t>Closest_package is now that package</w:t>
-      </w:r>
-    </w:p>
-    <w:p>
-      <w:pPr>
-        <w:spacing w:line="360" w:lineRule="auto"/>
-        <w:rPr>
-          <w:rFonts w:ascii="Arial" w:hAnsi="Arial" w:cs="Arial"/>
-          <w:sz w:val="28"/>
-          <w:szCs w:val="28"/>
-        </w:rPr>
-      </w:pPr>
-      <w:r>
-        <w:rPr>
-          <w:rFonts w:ascii="Arial" w:hAnsi="Arial" w:cs="Arial"/>
-          <w:sz w:val="28"/>
-          <w:szCs w:val="28"/>
-        </w:rPr>
-        <w:t>Return the shortest_path and the closest_package</w:t>
-      </w:r>
-    </w:p>
-    <w:p>
-      <w:pPr>
-        <w:spacing w:line="360" w:lineRule="auto"/>
-        <w:rPr>
-          <w:rFonts w:ascii="Arial" w:hAnsi="Arial" w:cs="Arial"/>
-          <w:sz w:val="28"/>
-          <w:szCs w:val="28"/>
-        </w:rPr>
-      </w:pPr>
-    </w:p>
-    <w:p>
-      <w:pPr>
-        <w:spacing w:line="360" w:lineRule="auto"/>
-        <w:rPr>
-          <w:rFonts w:ascii="Arial" w:hAnsi="Arial" w:cs="Arial"/>
-          <w:sz w:val="28"/>
-          <w:szCs w:val="28"/>
-        </w:rPr>
-      </w:pPr>
-      <w:r>
-        <w:rPr>
-          <w:rFonts w:ascii="Arial" w:hAnsi="Arial" w:cs="Arial"/>
-          <w:sz w:val="28"/>
-          <w:szCs w:val="28"/>
-        </w:rPr>
-        <w:t>Distance() Pseudocode:</w:t>
-      </w:r>
-    </w:p>
-    <w:p>
-      <w:pPr>
-        <w:spacing w:line="360" w:lineRule="auto"/>
-        <w:rPr>
-          <w:rFonts w:ascii="Arial" w:hAnsi="Arial" w:cs="Arial"/>
-          <w:sz w:val="28"/>
-          <w:szCs w:val="28"/>
-        </w:rPr>
-      </w:pPr>
-      <w:r>
-        <w:rPr>
-          <w:rFonts w:ascii="Arial" w:hAnsi="Arial" w:cs="Arial"/>
-          <w:sz w:val="28"/>
-          <w:szCs w:val="28"/>
+        </w:rPr>
+      </w:pPr>
+      <w:proofErr w:type="spellStart"/>
+      <w:r>
+        <w:rPr>
+          <w:rFonts w:ascii="Arial" w:hAnsi="Arial" w:cs="Arial"/>
+        </w:rPr>
+        <w:t>Closest_package</w:t>
+      </w:r>
+      <w:proofErr w:type="spellEnd"/>
+      <w:r>
+        <w:rPr>
+          <w:rFonts w:ascii="Arial" w:hAnsi="Arial" w:cs="Arial"/>
+        </w:rPr>
+        <w:t xml:space="preserve"> is now that package</w:t>
+      </w:r>
+    </w:p>
+    <w:p>
+      <w:pPr>
+        <w:spacing w:line="360" w:lineRule="auto"/>
+        <w:rPr>
+          <w:rFonts w:ascii="Arial" w:hAnsi="Arial" w:cs="Arial"/>
+          <w:sz w:val="24"/>
+          <w:szCs w:val="24"/>
+        </w:rPr>
+      </w:pPr>
+      <w:r>
+        <w:rPr>
+          <w:rFonts w:ascii="Arial" w:hAnsi="Arial" w:cs="Arial"/>
+          <w:sz w:val="24"/>
+          <w:szCs w:val="24"/>
+        </w:rPr>
+        <w:t xml:space="preserve">Return the </w:t>
+      </w:r>
+      <w:proofErr w:type="spellStart"/>
+      <w:r>
+        <w:rPr>
+          <w:rFonts w:ascii="Arial" w:hAnsi="Arial" w:cs="Arial"/>
+          <w:sz w:val="24"/>
+          <w:szCs w:val="24"/>
+        </w:rPr>
+        <w:t>shortest_path</w:t>
+      </w:r>
+      <w:proofErr w:type="spellEnd"/>
+      <w:r>
+        <w:rPr>
+          <w:rFonts w:ascii="Arial" w:hAnsi="Arial" w:cs="Arial"/>
+          <w:sz w:val="24"/>
+          <w:szCs w:val="24"/>
+        </w:rPr>
+        <w:t xml:space="preserve"> and the </w:t>
+      </w:r>
+      <w:proofErr w:type="spellStart"/>
+      <w:r>
+        <w:rPr>
+          <w:rFonts w:ascii="Arial" w:hAnsi="Arial" w:cs="Arial"/>
+          <w:sz w:val="24"/>
+          <w:szCs w:val="24"/>
+        </w:rPr>
+        <w:t>closest_package</w:t>
+      </w:r>
+      <w:proofErr w:type="spellEnd"/>
+    </w:p>
+    <w:p>
+      <w:pPr>
+        <w:spacing w:line="360" w:lineRule="auto"/>
+        <w:rPr>
+          <w:rFonts w:ascii="Arial" w:hAnsi="Arial" w:cs="Arial"/>
+          <w:sz w:val="24"/>
+          <w:szCs w:val="24"/>
+        </w:rPr>
+      </w:pPr>
+    </w:p>
+    <w:p>
+      <w:pPr>
+        <w:spacing w:line="360" w:lineRule="auto"/>
+        <w:rPr>
+          <w:rFonts w:ascii="Arial" w:hAnsi="Arial" w:cs="Arial"/>
+          <w:sz w:val="24"/>
+          <w:szCs w:val="24"/>
+        </w:rPr>
+      </w:pPr>
+      <w:proofErr w:type="gramStart"/>
+      <w:r>
+        <w:rPr>
+          <w:rFonts w:ascii="Arial" w:hAnsi="Arial" w:cs="Arial"/>
+          <w:sz w:val="24"/>
+          <w:szCs w:val="24"/>
+        </w:rPr>
+        <w:t>Distance(</w:t>
+      </w:r>
+      <w:proofErr w:type="gramEnd"/>
+      <w:r>
+        <w:rPr>
+          <w:rFonts w:ascii="Arial" w:hAnsi="Arial" w:cs="Arial"/>
+          <w:sz w:val="24"/>
+          <w:szCs w:val="24"/>
+        </w:rPr>
+        <w:t>) Pseudocode:</w:t>
+      </w:r>
+    </w:p>
+    <w:p>
+      <w:pPr>
+        <w:spacing w:line="360" w:lineRule="auto"/>
+        <w:rPr>
+          <w:rFonts w:ascii="Arial" w:hAnsi="Arial" w:cs="Arial"/>
+          <w:sz w:val="24"/>
+          <w:szCs w:val="24"/>
+        </w:rPr>
+      </w:pPr>
+      <w:r>
+        <w:rPr>
+          <w:rFonts w:ascii="Arial" w:hAnsi="Arial" w:cs="Arial"/>
+          <w:sz w:val="24"/>
+          <w:szCs w:val="24"/>
         </w:rPr>
         <w:t>Take a list of address</w:t>
       </w:r>
       <w:r>
         <w:rPr>
           <w:rFonts w:ascii="Arial" w:hAnsi="Arial" w:cs="Arial"/>
-          <w:sz w:val="28"/>
-          <w:szCs w:val="28"/>
+          <w:sz w:val="24"/>
+          <w:szCs w:val="24"/>
         </w:rPr>
         <w:t>es</w:t>
       </w:r>
@@ -1003,41 +1199,77 @@
         <w:spacing w:line="360" w:lineRule="auto"/>
         <w:rPr>
           <w:rFonts w:ascii="Arial" w:hAnsi="Arial" w:cs="Arial"/>
-          <w:sz w:val="28"/>
-          <w:szCs w:val="28"/>
-        </w:rPr>
-      </w:pPr>
-      <w:r>
-        <w:rPr>
-          <w:rFonts w:ascii="Arial" w:hAnsi="Arial" w:cs="Arial"/>
-          <w:sz w:val="28"/>
-          <w:szCs w:val="28"/>
-        </w:rPr>
-        <w:t xml:space="preserve">If from_address is </w:t>
-      </w:r>
-      <w:r>
-        <w:rPr>
-          <w:rFonts w:ascii="Arial" w:hAnsi="Arial" w:cs="Arial"/>
-          <w:sz w:val="28"/>
-          <w:szCs w:val="28"/>
-        </w:rPr>
-        <w:t>same as to_address</w:t>
-      </w:r>
-    </w:p>
-    <w:p>
-      <w:pPr>
-        <w:spacing w:line="360" w:lineRule="auto"/>
-        <w:rPr>
-          <w:rFonts w:ascii="Arial" w:hAnsi="Arial" w:cs="Arial"/>
-          <w:sz w:val="28"/>
-          <w:szCs w:val="28"/>
-        </w:rPr>
-      </w:pPr>
-      <w:r>
-        <w:rPr>
-          <w:rFonts w:ascii="Arial" w:hAnsi="Arial" w:cs="Arial"/>
-          <w:sz w:val="28"/>
-          <w:szCs w:val="28"/>
+          <w:sz w:val="24"/>
+          <w:szCs w:val="24"/>
+        </w:rPr>
+      </w:pPr>
+      <w:r>
+        <w:rPr>
+          <w:rFonts w:ascii="Arial" w:hAnsi="Arial" w:cs="Arial"/>
+          <w:sz w:val="24"/>
+          <w:szCs w:val="24"/>
+        </w:rPr>
+        <w:t xml:space="preserve">If </w:t>
+      </w:r>
+      <w:proofErr w:type="spellStart"/>
+      <w:r>
+        <w:rPr>
+          <w:rFonts w:ascii="Arial" w:hAnsi="Arial" w:cs="Arial"/>
+          <w:sz w:val="24"/>
+          <w:szCs w:val="24"/>
+        </w:rPr>
+        <w:t>from_address</w:t>
+      </w:r>
+      <w:proofErr w:type="spellEnd"/>
+      <w:r>
+        <w:rPr>
+          <w:rFonts w:ascii="Arial" w:hAnsi="Arial" w:cs="Arial"/>
+          <w:sz w:val="24"/>
+          <w:szCs w:val="24"/>
+        </w:rPr>
+        <w:t xml:space="preserve"> </w:t>
+      </w:r>
+      <w:r>
+        <w:rPr>
+          <w:rFonts w:ascii="Arial" w:hAnsi="Arial" w:cs="Arial"/>
+          <w:sz w:val="24"/>
+          <w:szCs w:val="24"/>
+        </w:rPr>
+        <w:t>=</w:t>
+      </w:r>
+      <w:r>
+        <w:rPr>
+          <w:rFonts w:ascii="Arial" w:hAnsi="Arial" w:cs="Arial"/>
+          <w:sz w:val="24"/>
+          <w:szCs w:val="24"/>
+        </w:rPr>
+        <w:t xml:space="preserve"> </w:t>
+      </w:r>
+      <w:proofErr w:type="spellStart"/>
+      <w:r>
+        <w:rPr>
+          <w:rFonts w:ascii="Arial" w:hAnsi="Arial" w:cs="Arial"/>
+          <w:sz w:val="24"/>
+          <w:szCs w:val="24"/>
+        </w:rPr>
+        <w:t>to_address</w:t>
+      </w:r>
+      <w:proofErr w:type="spellEnd"/>
+    </w:p>
+    <w:p>
+      <w:pPr>
+        <w:spacing w:line="360" w:lineRule="auto"/>
+        <w:rPr>
+          <w:rFonts w:ascii="Arial" w:hAnsi="Arial" w:cs="Arial"/>
+          <w:sz w:val="24"/>
+          <w:szCs w:val="24"/>
+        </w:rPr>
+      </w:pPr>
+      <w:r>
+        <w:rPr>
+          <w:rFonts w:ascii="Arial" w:hAnsi="Arial" w:cs="Arial"/>
+          <w:sz w:val="24"/>
+          <w:szCs w:val="24"/>
         </w:rPr>
         <w:tab/>
         <w:t>Return 0 (same location)</w:t>
@@ -1048,127 +1280,399 @@
         <w:spacing w:line="360" w:lineRule="auto"/>
         <w:rPr>
           <w:rFonts w:ascii="Arial" w:hAnsi="Arial" w:cs="Arial"/>
-          <w:sz w:val="28"/>
-          <w:szCs w:val="28"/>
-        </w:rPr>
-      </w:pPr>
-      <w:r>
-        <w:rPr>
-          <w:rFonts w:ascii="Arial" w:hAnsi="Arial" w:cs="Arial"/>
-          <w:sz w:val="28"/>
-          <w:szCs w:val="28"/>
+          <w:sz w:val="24"/>
+          <w:szCs w:val="24"/>
+        </w:rPr>
+      </w:pPr>
+      <w:r>
+        <w:rPr>
+          <w:rFonts w:ascii="Arial" w:hAnsi="Arial" w:cs="Arial"/>
+          <w:sz w:val="24"/>
+          <w:szCs w:val="24"/>
         </w:rPr>
         <w:t xml:space="preserve">If </w:t>
       </w:r>
-      <w:r>
-        <w:rPr>
-          <w:rFonts w:ascii="Arial" w:hAnsi="Arial" w:cs="Arial"/>
-          <w:sz w:val="28"/>
-          <w:szCs w:val="28"/>
-        </w:rPr>
-        <w:t>from_addresses index is greater then to_addresses index</w:t>
-      </w:r>
-    </w:p>
-    <w:p>
-      <w:pPr>
-        <w:spacing w:line="360" w:lineRule="auto"/>
-        <w:rPr>
-          <w:rFonts w:ascii="Arial" w:hAnsi="Arial" w:cs="Arial"/>
-          <w:sz w:val="28"/>
-          <w:szCs w:val="28"/>
-        </w:rPr>
-      </w:pPr>
-      <w:r>
-        <w:rPr>
-          <w:rFonts w:ascii="Arial" w:hAnsi="Arial" w:cs="Arial"/>
-          <w:sz w:val="28"/>
-          <w:szCs w:val="28"/>
+      <w:proofErr w:type="spellStart"/>
+      <w:r>
+        <w:rPr>
+          <w:rFonts w:ascii="Arial" w:hAnsi="Arial" w:cs="Arial"/>
+          <w:sz w:val="24"/>
+          <w:szCs w:val="24"/>
+        </w:rPr>
+        <w:t>from_address’s</w:t>
+      </w:r>
+      <w:proofErr w:type="spellEnd"/>
+      <w:r>
+        <w:rPr>
+          <w:rFonts w:ascii="Arial" w:hAnsi="Arial" w:cs="Arial"/>
+          <w:sz w:val="24"/>
+          <w:szCs w:val="24"/>
+        </w:rPr>
+        <w:t xml:space="preserve"> index is greater </w:t>
+      </w:r>
+      <w:r>
+        <w:rPr>
+          <w:rFonts w:ascii="Arial" w:hAnsi="Arial" w:cs="Arial"/>
+          <w:sz w:val="24"/>
+          <w:szCs w:val="24"/>
+        </w:rPr>
+        <w:t xml:space="preserve">than </w:t>
+      </w:r>
+      <w:proofErr w:type="spellStart"/>
+      <w:r>
+        <w:rPr>
+          <w:rFonts w:ascii="Arial" w:hAnsi="Arial" w:cs="Arial"/>
+          <w:sz w:val="24"/>
+          <w:szCs w:val="24"/>
+        </w:rPr>
+        <w:t>to_address's</w:t>
+      </w:r>
+      <w:proofErr w:type="spellEnd"/>
+      <w:r>
+        <w:rPr>
+          <w:rFonts w:ascii="Arial" w:hAnsi="Arial" w:cs="Arial"/>
+          <w:sz w:val="24"/>
+          <w:szCs w:val="24"/>
+        </w:rPr>
+        <w:t xml:space="preserve"> index</w:t>
+      </w:r>
+    </w:p>
+    <w:p>
+      <w:pPr>
+        <w:spacing w:line="360" w:lineRule="auto"/>
+        <w:rPr>
+          <w:rFonts w:ascii="Arial" w:hAnsi="Arial" w:cs="Arial"/>
+          <w:sz w:val="24"/>
+          <w:szCs w:val="24"/>
+        </w:rPr>
+      </w:pPr>
+      <w:r>
+        <w:rPr>
+          <w:rFonts w:ascii="Arial" w:hAnsi="Arial" w:cs="Arial"/>
+          <w:sz w:val="24"/>
+          <w:szCs w:val="24"/>
         </w:rPr>
         <w:tab/>
       </w:r>
       <w:r>
         <w:rPr>
           <w:rFonts w:ascii="Arial" w:hAnsi="Arial" w:cs="Arial"/>
-          <w:sz w:val="28"/>
-          <w:szCs w:val="28"/>
-        </w:rPr>
-        <w:t>Distance is</w:t>
-      </w:r>
-      <w:r>
-        <w:rPr>
-          <w:rFonts w:ascii="Arial" w:hAnsi="Arial" w:cs="Arial"/>
-          <w:sz w:val="28"/>
-          <w:szCs w:val="28"/>
-        </w:rPr>
-        <w:t xml:space="preserve"> from_addresses distance at to_addresses index</w:t>
-      </w:r>
-    </w:p>
-    <w:p>
-      <w:pPr>
-        <w:spacing w:line="360" w:lineRule="auto"/>
-        <w:rPr>
-          <w:rFonts w:ascii="Arial" w:hAnsi="Arial" w:cs="Arial"/>
-          <w:sz w:val="28"/>
-          <w:szCs w:val="28"/>
-        </w:rPr>
-      </w:pPr>
-      <w:r>
-        <w:rPr>
-          <w:rFonts w:ascii="Arial" w:hAnsi="Arial" w:cs="Arial"/>
-          <w:sz w:val="28"/>
-          <w:szCs w:val="28"/>
-        </w:rPr>
-        <w:t>Otherwise (to_addresses index is greater then from_addresses)</w:t>
-      </w:r>
-    </w:p>
-    <w:p>
-      <w:pPr>
-        <w:spacing w:line="360" w:lineRule="auto"/>
-        <w:rPr>
-          <w:rFonts w:ascii="Arial" w:hAnsi="Arial" w:cs="Arial"/>
-          <w:sz w:val="28"/>
-          <w:szCs w:val="28"/>
-        </w:rPr>
-      </w:pPr>
-      <w:r>
-        <w:rPr>
-          <w:rFonts w:ascii="Arial" w:hAnsi="Arial" w:cs="Arial"/>
-          <w:sz w:val="28"/>
-          <w:szCs w:val="28"/>
+          <w:sz w:val="24"/>
+          <w:szCs w:val="24"/>
+        </w:rPr>
+        <w:t xml:space="preserve">Distance </w:t>
+      </w:r>
+      <w:r>
+        <w:rPr>
+          <w:rFonts w:ascii="Arial" w:hAnsi="Arial" w:cs="Arial"/>
+          <w:sz w:val="24"/>
+          <w:szCs w:val="24"/>
+        </w:rPr>
+        <w:t>=</w:t>
+      </w:r>
+      <w:r>
+        <w:rPr>
+          <w:rFonts w:ascii="Arial" w:hAnsi="Arial" w:cs="Arial"/>
+          <w:sz w:val="24"/>
+          <w:szCs w:val="24"/>
+        </w:rPr>
+        <w:t xml:space="preserve"> </w:t>
+      </w:r>
+      <w:proofErr w:type="spellStart"/>
+      <w:r>
+        <w:rPr>
+          <w:rFonts w:ascii="Arial" w:hAnsi="Arial" w:cs="Arial"/>
+          <w:sz w:val="24"/>
+          <w:szCs w:val="24"/>
+        </w:rPr>
+        <w:t>from_address</w:t>
+      </w:r>
+      <w:r>
+        <w:rPr>
+          <w:rFonts w:ascii="Arial" w:hAnsi="Arial" w:cs="Arial"/>
+          <w:sz w:val="24"/>
+          <w:szCs w:val="24"/>
+        </w:rPr>
+        <w:t>’</w:t>
+      </w:r>
+      <w:r>
+        <w:rPr>
+          <w:rFonts w:ascii="Arial" w:hAnsi="Arial" w:cs="Arial"/>
+          <w:sz w:val="24"/>
+          <w:szCs w:val="24"/>
+        </w:rPr>
+        <w:t>s</w:t>
+      </w:r>
+      <w:proofErr w:type="spellEnd"/>
+      <w:r>
+        <w:rPr>
+          <w:rFonts w:ascii="Arial" w:hAnsi="Arial" w:cs="Arial"/>
+          <w:sz w:val="24"/>
+          <w:szCs w:val="24"/>
+        </w:rPr>
+        <w:t xml:space="preserve"> distance at </w:t>
+      </w:r>
+      <w:proofErr w:type="spellStart"/>
+      <w:r>
+        <w:rPr>
+          <w:rFonts w:ascii="Arial" w:hAnsi="Arial" w:cs="Arial"/>
+          <w:sz w:val="24"/>
+          <w:szCs w:val="24"/>
+        </w:rPr>
+        <w:t>to_address</w:t>
+      </w:r>
+      <w:r>
+        <w:rPr>
+          <w:rFonts w:ascii="Arial" w:hAnsi="Arial" w:cs="Arial"/>
+          <w:sz w:val="24"/>
+          <w:szCs w:val="24"/>
+        </w:rPr>
+        <w:t>’</w:t>
+      </w:r>
+      <w:r>
+        <w:rPr>
+          <w:rFonts w:ascii="Arial" w:hAnsi="Arial" w:cs="Arial"/>
+          <w:sz w:val="24"/>
+          <w:szCs w:val="24"/>
+        </w:rPr>
+        <w:t>s</w:t>
+      </w:r>
+      <w:proofErr w:type="spellEnd"/>
+      <w:r>
+        <w:rPr>
+          <w:rFonts w:ascii="Arial" w:hAnsi="Arial" w:cs="Arial"/>
+          <w:sz w:val="24"/>
+          <w:szCs w:val="24"/>
+        </w:rPr>
+        <w:t xml:space="preserve"> index</w:t>
+      </w:r>
+    </w:p>
+    <w:p>
+      <w:pPr>
+        <w:spacing w:line="360" w:lineRule="auto"/>
+        <w:rPr>
+          <w:rFonts w:ascii="Arial" w:hAnsi="Arial" w:cs="Arial"/>
+          <w:sz w:val="24"/>
+          <w:szCs w:val="24"/>
+        </w:rPr>
+      </w:pPr>
+      <w:r>
+        <w:rPr>
+          <w:rFonts w:ascii="Arial" w:hAnsi="Arial" w:cs="Arial"/>
+          <w:sz w:val="24"/>
+          <w:szCs w:val="24"/>
+        </w:rPr>
+        <w:t>Otherwise (</w:t>
+      </w:r>
+      <w:proofErr w:type="spellStart"/>
+      <w:r>
+        <w:rPr>
+          <w:rFonts w:ascii="Arial" w:hAnsi="Arial" w:cs="Arial"/>
+          <w:sz w:val="24"/>
+          <w:szCs w:val="24"/>
+        </w:rPr>
+        <w:t>to_address</w:t>
+      </w:r>
+      <w:r>
+        <w:rPr>
+          <w:rFonts w:ascii="Arial" w:hAnsi="Arial" w:cs="Arial"/>
+          <w:sz w:val="24"/>
+          <w:szCs w:val="24"/>
+        </w:rPr>
+        <w:t>’</w:t>
+      </w:r>
+      <w:r>
+        <w:rPr>
+          <w:rFonts w:ascii="Arial" w:hAnsi="Arial" w:cs="Arial"/>
+          <w:sz w:val="24"/>
+          <w:szCs w:val="24"/>
+        </w:rPr>
+        <w:t>s</w:t>
+      </w:r>
+      <w:proofErr w:type="spellEnd"/>
+      <w:r>
+        <w:rPr>
+          <w:rFonts w:ascii="Arial" w:hAnsi="Arial" w:cs="Arial"/>
+          <w:sz w:val="24"/>
+          <w:szCs w:val="24"/>
+        </w:rPr>
+        <w:t xml:space="preserve"> index is greater th</w:t>
+      </w:r>
+      <w:r>
+        <w:rPr>
+          <w:rFonts w:ascii="Arial" w:hAnsi="Arial" w:cs="Arial"/>
+          <w:sz w:val="24"/>
+          <w:szCs w:val="24"/>
+        </w:rPr>
+        <w:t>a</w:t>
+      </w:r>
+      <w:r>
+        <w:rPr>
+          <w:rFonts w:ascii="Arial" w:hAnsi="Arial" w:cs="Arial"/>
+          <w:sz w:val="24"/>
+          <w:szCs w:val="24"/>
+        </w:rPr>
+        <w:t>n f</w:t>
+      </w:r>
+      <w:proofErr w:type="spellStart"/>
+      <w:r>
+        <w:rPr>
+          <w:rFonts w:ascii="Arial" w:hAnsi="Arial" w:cs="Arial"/>
+          <w:sz w:val="24"/>
+          <w:szCs w:val="24"/>
+        </w:rPr>
+        <w:t>rom_address</w:t>
+      </w:r>
+      <w:r>
+        <w:rPr>
+          <w:rFonts w:ascii="Arial" w:hAnsi="Arial" w:cs="Arial"/>
+          <w:sz w:val="24"/>
+          <w:szCs w:val="24"/>
+        </w:rPr>
+        <w:t>’</w:t>
+      </w:r>
+      <w:r>
+        <w:rPr>
+          <w:rFonts w:ascii="Arial" w:hAnsi="Arial" w:cs="Arial"/>
+          <w:sz w:val="24"/>
+          <w:szCs w:val="24"/>
+        </w:rPr>
+        <w:t>s</w:t>
+      </w:r>
+      <w:proofErr w:type="spellEnd"/>
+      <w:r>
+        <w:rPr>
+          <w:rFonts w:ascii="Arial" w:hAnsi="Arial" w:cs="Arial"/>
+          <w:sz w:val="24"/>
+          <w:szCs w:val="24"/>
+        </w:rPr>
+        <w:t>)</w:t>
+      </w:r>
+    </w:p>
+    <w:p>
+      <w:pPr>
+        <w:spacing w:line="360" w:lineRule="auto"/>
+        <w:rPr>
+          <w:rFonts w:ascii="Arial" w:hAnsi="Arial" w:cs="Arial"/>
+          <w:sz w:val="24"/>
+          <w:szCs w:val="24"/>
+        </w:rPr>
+      </w:pPr>
+      <w:r>
+        <w:rPr>
+          <w:rFonts w:ascii="Arial" w:hAnsi="Arial" w:cs="Arial"/>
+          <w:sz w:val="24"/>
+          <w:szCs w:val="24"/>
         </w:rPr>
         <w:tab/>
       </w:r>
       <w:r>
         <w:rPr>
           <w:rFonts w:ascii="Arial" w:hAnsi="Arial" w:cs="Arial"/>
-          <w:sz w:val="28"/>
-          <w:szCs w:val="28"/>
+          <w:sz w:val="24"/>
+          <w:szCs w:val="24"/>
         </w:rPr>
         <w:t>Distance</w:t>
       </w:r>
       <w:r>
         <w:rPr>
           <w:rFonts w:ascii="Arial" w:hAnsi="Arial" w:cs="Arial"/>
-          <w:sz w:val="28"/>
-          <w:szCs w:val="28"/>
-        </w:rPr>
-        <w:t xml:space="preserve"> to_addresses distance at from_addresses index</w:t>
-      </w:r>
-    </w:p>
-    <w:p>
-      <w:pPr>
-        <w:spacing w:line="360" w:lineRule="auto"/>
-        <w:rPr>
-          <w:rFonts w:ascii="Arial" w:hAnsi="Arial" w:cs="Arial"/>
-          <w:sz w:val="28"/>
-          <w:szCs w:val="28"/>
-        </w:rPr>
-      </w:pPr>
-      <w:r>
-        <w:rPr>
-          <w:rFonts w:ascii="Arial" w:hAnsi="Arial" w:cs="Arial"/>
-          <w:sz w:val="28"/>
-          <w:szCs w:val="28"/>
+          <w:sz w:val="24"/>
+          <w:szCs w:val="24"/>
+        </w:rPr>
+        <w:t xml:space="preserve"> =</w:t>
+      </w:r>
+      <w:r>
+        <w:rPr>
+          <w:rFonts w:ascii="Arial" w:hAnsi="Arial" w:cs="Arial"/>
+          <w:sz w:val="24"/>
+          <w:szCs w:val="24"/>
+        </w:rPr>
+        <w:t xml:space="preserve"> </w:t>
+      </w:r>
+      <w:proofErr w:type="spellStart"/>
+      <w:r>
+        <w:rPr>
+          <w:rFonts w:ascii="Arial" w:hAnsi="Arial" w:cs="Arial"/>
+          <w:sz w:val="24"/>
+          <w:szCs w:val="24"/>
+        </w:rPr>
+        <w:t>to_address</w:t>
+      </w:r>
+      <w:r>
+        <w:rPr>
+          <w:rFonts w:ascii="Arial" w:hAnsi="Arial" w:cs="Arial"/>
+          <w:sz w:val="24"/>
+          <w:szCs w:val="24"/>
+        </w:rPr>
+        <w:t>’</w:t>
+      </w:r>
+      <w:r>
+        <w:rPr>
+          <w:rFonts w:ascii="Arial" w:hAnsi="Arial" w:cs="Arial"/>
+          <w:sz w:val="24"/>
+          <w:szCs w:val="24"/>
+        </w:rPr>
+        <w:t>s</w:t>
+      </w:r>
+      <w:proofErr w:type="spellEnd"/>
+      <w:r>
+        <w:rPr>
+          <w:rFonts w:ascii="Arial" w:hAnsi="Arial" w:cs="Arial"/>
+          <w:sz w:val="24"/>
+          <w:szCs w:val="24"/>
+        </w:rPr>
+        <w:t xml:space="preserve"> distance at </w:t>
+      </w:r>
+      <w:proofErr w:type="spellStart"/>
+      <w:r>
+        <w:rPr>
+          <w:rFonts w:ascii="Arial" w:hAnsi="Arial" w:cs="Arial"/>
+          <w:sz w:val="24"/>
+          <w:szCs w:val="24"/>
+        </w:rPr>
+        <w:t>from_address</w:t>
+      </w:r>
+      <w:r>
+        <w:rPr>
+          <w:rFonts w:ascii="Arial" w:hAnsi="Arial" w:cs="Arial"/>
+          <w:sz w:val="24"/>
+          <w:szCs w:val="24"/>
+        </w:rPr>
+        <w:t>’</w:t>
+      </w:r>
+      <w:r>
+        <w:rPr>
+          <w:rFonts w:ascii="Arial" w:hAnsi="Arial" w:cs="Arial"/>
+          <w:sz w:val="24"/>
+          <w:szCs w:val="24"/>
+        </w:rPr>
+        <w:t>s</w:t>
+      </w:r>
+      <w:proofErr w:type="spellEnd"/>
+      <w:r>
+        <w:rPr>
+          <w:rFonts w:ascii="Arial" w:hAnsi="Arial" w:cs="Arial"/>
+          <w:sz w:val="24"/>
+          <w:szCs w:val="24"/>
+        </w:rPr>
+        <w:t xml:space="preserve"> index</w:t>
+      </w:r>
+    </w:p>
+    <w:p>
+      <w:pPr>
+        <w:spacing w:line="360" w:lineRule="auto"/>
+        <w:rPr>
+          <w:rFonts w:ascii="Arial" w:hAnsi="Arial" w:cs="Arial"/>
+          <w:sz w:val="24"/>
+          <w:szCs w:val="24"/>
+        </w:rPr>
+      </w:pPr>
+      <w:r>
+        <w:rPr>
+          <w:rFonts w:ascii="Arial" w:hAnsi="Arial" w:cs="Arial"/>
+          <w:sz w:val="24"/>
+          <w:szCs w:val="24"/>
         </w:rPr>
         <w:t>Return Distance</w:t>
       </w:r>
@@ -1189,16 +1693,1387 @@
           <w:sz w:val="28"/>
           <w:szCs w:val="28"/>
         </w:rPr>
+        <w:t>C</w:t>
+      </w:r>
+      <w:r>
+        <w:rPr>
+          <w:rFonts w:ascii="Arial" w:hAnsi="Arial" w:cs="Arial"/>
+          <w:sz w:val="28"/>
+          <w:szCs w:val="28"/>
+        </w:rPr>
+        <w:t>2</w:t>
+      </w:r>
+      <w:r>
+        <w:rPr>
+          <w:rFonts w:ascii="Arial" w:hAnsi="Arial" w:cs="Arial"/>
+          <w:sz w:val="28"/>
+          <w:szCs w:val="28"/>
+        </w:rPr>
+        <w:t xml:space="preserve">. </w:t>
+      </w:r>
+      <w:r>
+        <w:rPr>
+          <w:rFonts w:ascii="Arial" w:hAnsi="Arial" w:cs="Arial"/>
+          <w:sz w:val="28"/>
+          <w:szCs w:val="28"/>
+        </w:rPr>
+        <w:t>Development Environment</w:t>
+      </w:r>
+    </w:p>
+    <w:p>
+      <w:pPr>
+        <w:spacing w:line="360" w:lineRule="auto"/>
+        <w:rPr>
+          <w:rFonts w:ascii="Arial" w:hAnsi="Arial" w:cs="Arial"/>
+          <w:sz w:val="28"/>
+          <w:szCs w:val="28"/>
+        </w:rPr>
+      </w:pPr>
+      <w:r>
+        <w:rPr>
+          <w:rFonts w:ascii="Arial" w:hAnsi="Arial" w:cs="Arial"/>
+          <w:sz w:val="28"/>
+          <w:szCs w:val="28"/>
+        </w:rPr>
+        <w:t>The programming environment I’ve chosen to use is PyCharm, as</w:t>
+      </w:r>
+      <w:r>
+        <w:rPr>
+          <w:rFonts w:ascii="Arial" w:hAnsi="Arial" w:cs="Arial"/>
+          <w:sz w:val="28"/>
+          <w:szCs w:val="28"/>
+        </w:rPr>
+        <w:t xml:space="preserve"> it ** ha</w:t>
+      </w:r>
+      <w:r>
+        <w:rPr>
+          <w:rFonts w:ascii="Arial" w:hAnsi="Arial" w:cs="Arial"/>
+          <w:sz w:val="28"/>
+          <w:szCs w:val="28"/>
+        </w:rPr>
+        <w:t>s</w:t>
+      </w:r>
+      <w:r>
+        <w:rPr>
+          <w:rFonts w:ascii="Arial" w:hAnsi="Arial" w:cs="Arial"/>
+          <w:sz w:val="28"/>
+          <w:szCs w:val="28"/>
+        </w:rPr>
+        <w:t xml:space="preserve"> a multitude of features specific to Python**. It also includes a built</w:t>
+      </w:r>
+      <w:r>
+        <w:rPr>
+          <w:rFonts w:ascii="Arial" w:hAnsi="Arial" w:cs="Arial"/>
+          <w:sz w:val="28"/>
+          <w:szCs w:val="28"/>
+        </w:rPr>
+        <w:t>-</w:t>
+      </w:r>
+      <w:r>
+        <w:rPr>
+          <w:rFonts w:ascii="Arial" w:hAnsi="Arial" w:cs="Arial"/>
+          <w:sz w:val="28"/>
+          <w:szCs w:val="28"/>
+        </w:rPr>
+        <w:t>in terminal environment</w:t>
+      </w:r>
+      <w:r>
+        <w:rPr>
+          <w:rFonts w:ascii="Arial" w:hAnsi="Arial" w:cs="Arial"/>
+          <w:sz w:val="28"/>
+          <w:szCs w:val="28"/>
+        </w:rPr>
+        <w:t>,</w:t>
+      </w:r>
+      <w:r>
+        <w:rPr>
+          <w:rFonts w:ascii="Arial" w:hAnsi="Arial" w:cs="Arial"/>
+          <w:sz w:val="28"/>
+          <w:szCs w:val="28"/>
+        </w:rPr>
+        <w:t xml:space="preserve"> which </w:t>
+      </w:r>
+      <w:r>
+        <w:rPr>
+          <w:rFonts w:ascii="Arial" w:hAnsi="Arial" w:cs="Arial"/>
+          <w:sz w:val="28"/>
+          <w:szCs w:val="28"/>
+        </w:rPr>
+        <w:t xml:space="preserve">helps with using </w:t>
+      </w:r>
+      <w:r>
+        <w:rPr>
+          <w:rFonts w:ascii="Arial" w:hAnsi="Arial" w:cs="Arial"/>
+          <w:sz w:val="28"/>
+          <w:szCs w:val="28"/>
+        </w:rPr>
+        <w:t>G</w:t>
+      </w:r>
+      <w:r>
+        <w:rPr>
+          <w:rFonts w:ascii="Arial" w:hAnsi="Arial" w:cs="Arial"/>
+          <w:sz w:val="28"/>
+          <w:szCs w:val="28"/>
+        </w:rPr>
+        <w:t xml:space="preserve">it for version control. The </w:t>
+      </w:r>
+      <w:r>
+        <w:rPr>
+          <w:rFonts w:ascii="Arial" w:hAnsi="Arial" w:cs="Arial"/>
+          <w:sz w:val="28"/>
+          <w:szCs w:val="28"/>
+        </w:rPr>
+        <w:t xml:space="preserve">hardware on my laptop consists of an </w:t>
+      </w:r>
+      <w:r>
+        <w:rPr>
+          <w:rFonts w:ascii="Arial" w:hAnsi="Arial" w:cs="Arial"/>
+          <w:sz w:val="28"/>
+          <w:szCs w:val="28"/>
+        </w:rPr>
+        <w:t xml:space="preserve">Intel Core i5-7300U </w:t>
+      </w:r>
+      <w:proofErr w:type="gramStart"/>
+      <w:r>
+        <w:rPr>
+          <w:rFonts w:ascii="Arial" w:hAnsi="Arial" w:cs="Arial"/>
+          <w:sz w:val="28"/>
+          <w:szCs w:val="28"/>
+        </w:rPr>
+        <w:t>CPU @</w:t>
+      </w:r>
+      <w:proofErr w:type="gramEnd"/>
+      <w:r>
+        <w:rPr>
+          <w:rFonts w:ascii="Arial" w:hAnsi="Arial" w:cs="Arial"/>
+          <w:sz w:val="28"/>
+          <w:szCs w:val="28"/>
+        </w:rPr>
+        <w:t xml:space="preserve"> 2.60GHz,</w:t>
+      </w:r>
+      <w:r>
+        <w:rPr>
+          <w:rFonts w:ascii="Arial" w:hAnsi="Arial" w:cs="Arial"/>
+          <w:sz w:val="28"/>
+          <w:szCs w:val="28"/>
+        </w:rPr>
+        <w:t xml:space="preserve"> </w:t>
+      </w:r>
+      <w:r>
+        <w:rPr>
+          <w:rFonts w:ascii="Arial" w:hAnsi="Arial" w:cs="Arial"/>
+          <w:sz w:val="28"/>
+          <w:szCs w:val="28"/>
+        </w:rPr>
+        <w:t>16GB of RAM</w:t>
+      </w:r>
+      <w:r>
+        <w:rPr>
+          <w:rFonts w:ascii="Arial" w:hAnsi="Arial" w:cs="Arial"/>
+          <w:sz w:val="28"/>
+          <w:szCs w:val="28"/>
+        </w:rPr>
+        <w:t>,</w:t>
+      </w:r>
+      <w:r>
+        <w:rPr>
+          <w:rFonts w:ascii="Arial" w:hAnsi="Arial" w:cs="Arial"/>
+          <w:sz w:val="28"/>
+          <w:szCs w:val="28"/>
+        </w:rPr>
+        <w:t xml:space="preserve"> and an Intel HD Graphics 620 graphics card.</w:t>
+      </w:r>
+    </w:p>
+    <w:p>
+      <w:pPr>
+        <w:pStyle w:val="Heading1"/>
+        <w:spacing w:line="360" w:lineRule="auto"/>
+        <w:rPr>
+          <w:rFonts w:ascii="Arial" w:hAnsi="Arial" w:cs="Arial"/>
+          <w:sz w:val="28"/>
+          <w:szCs w:val="28"/>
+        </w:rPr>
+      </w:pPr>
+      <w:r>
+        <w:rPr>
+          <w:rFonts w:ascii="Arial" w:hAnsi="Arial" w:cs="Arial"/>
+          <w:sz w:val="28"/>
+          <w:szCs w:val="28"/>
+        </w:rPr>
+        <w:t>C</w:t>
+      </w:r>
+      <w:r>
+        <w:rPr>
+          <w:rFonts w:ascii="Arial" w:hAnsi="Arial" w:cs="Arial"/>
+          <w:sz w:val="28"/>
+          <w:szCs w:val="28"/>
+        </w:rPr>
+        <w:t>3</w:t>
+      </w:r>
+      <w:r>
+        <w:rPr>
+          <w:rFonts w:ascii="Arial" w:hAnsi="Arial" w:cs="Arial"/>
+          <w:sz w:val="28"/>
+          <w:szCs w:val="28"/>
+        </w:rPr>
+        <w:t xml:space="preserve">. </w:t>
+      </w:r>
+      <w:r>
+        <w:rPr>
+          <w:rFonts w:ascii="Arial" w:hAnsi="Arial" w:cs="Arial"/>
+          <w:sz w:val="28"/>
+          <w:szCs w:val="28"/>
+        </w:rPr>
+        <w:t>Space and Time complexity using Big-O notation</w:t>
+      </w:r>
+    </w:p>
+    <w:p>
+      <w:pPr>
+        <w:spacing w:line="360" w:lineRule="auto"/>
+        <w:rPr>
+          <w:rFonts w:ascii="Arial" w:hAnsi="Arial" w:cs="Arial"/>
+          <w:sz w:val="28"/>
+          <w:szCs w:val="28"/>
+        </w:rPr>
+      </w:pPr>
+      <w:r>
+        <w:rPr>
+          <w:rFonts w:ascii="Arial" w:hAnsi="Arial" w:cs="Arial"/>
+          <w:sz w:val="28"/>
+          <w:szCs w:val="28"/>
+        </w:rPr>
+        <w:t>The HashMap class</w:t>
+      </w:r>
+      <w:r>
+        <w:rPr>
+          <w:rFonts w:ascii="Arial" w:hAnsi="Arial" w:cs="Arial"/>
+          <w:sz w:val="28"/>
+          <w:szCs w:val="28"/>
+        </w:rPr>
+        <w:t xml:space="preserve"> has</w:t>
+      </w:r>
+      <w:r>
+        <w:rPr>
+          <w:rFonts w:ascii="Arial" w:hAnsi="Arial" w:cs="Arial"/>
+          <w:sz w:val="28"/>
+          <w:szCs w:val="28"/>
+        </w:rPr>
+        <w:t xml:space="preserve"> an average</w:t>
+      </w:r>
+      <w:r>
+        <w:rPr>
+          <w:rFonts w:ascii="Arial" w:hAnsi="Arial" w:cs="Arial"/>
+          <w:sz w:val="28"/>
+          <w:szCs w:val="28"/>
+        </w:rPr>
+        <w:t xml:space="preserve"> </w:t>
+      </w:r>
+      <w:proofErr w:type="gramStart"/>
+      <w:r>
+        <w:rPr>
+          <w:rFonts w:ascii="Arial" w:hAnsi="Arial" w:cs="Arial"/>
+          <w:sz w:val="28"/>
+          <w:szCs w:val="28"/>
+        </w:rPr>
+        <w:t>O(</w:t>
+      </w:r>
+      <w:proofErr w:type="gramEnd"/>
+      <w:r>
+        <w:rPr>
+          <w:rFonts w:ascii="Arial" w:hAnsi="Arial" w:cs="Arial"/>
+          <w:sz w:val="28"/>
+          <w:szCs w:val="28"/>
+        </w:rPr>
+        <w:t xml:space="preserve">1) time </w:t>
+      </w:r>
+      <w:r>
+        <w:rPr>
+          <w:rFonts w:ascii="Arial" w:hAnsi="Arial" w:cs="Arial"/>
+          <w:sz w:val="28"/>
+          <w:szCs w:val="28"/>
+        </w:rPr>
+        <w:t xml:space="preserve">and space </w:t>
+      </w:r>
+      <w:r>
+        <w:rPr>
+          <w:rFonts w:ascii="Arial" w:hAnsi="Arial" w:cs="Arial"/>
+          <w:sz w:val="28"/>
+          <w:szCs w:val="28"/>
+        </w:rPr>
+        <w:t>complexity</w:t>
+      </w:r>
+      <w:r>
+        <w:rPr>
+          <w:rFonts w:ascii="Arial" w:hAnsi="Arial" w:cs="Arial"/>
+          <w:sz w:val="28"/>
+          <w:szCs w:val="28"/>
+        </w:rPr>
+        <w:t>,</w:t>
+      </w:r>
+      <w:r>
+        <w:rPr>
+          <w:rFonts w:ascii="Arial" w:hAnsi="Arial" w:cs="Arial"/>
+          <w:sz w:val="28"/>
+          <w:szCs w:val="28"/>
+        </w:rPr>
+        <w:t xml:space="preserve"> and</w:t>
+      </w:r>
+      <w:r>
+        <w:rPr>
+          <w:rFonts w:ascii="Arial" w:hAnsi="Arial" w:cs="Arial"/>
+          <w:sz w:val="28"/>
+          <w:szCs w:val="28"/>
+        </w:rPr>
+        <w:t xml:space="preserve"> O(n) </w:t>
+      </w:r>
+      <w:r>
+        <w:rPr>
+          <w:rFonts w:ascii="Arial" w:hAnsi="Arial" w:cs="Arial"/>
+          <w:sz w:val="28"/>
+          <w:szCs w:val="28"/>
+        </w:rPr>
+        <w:t>worst-case</w:t>
+      </w:r>
+      <w:r>
+        <w:rPr>
+          <w:rFonts w:ascii="Arial" w:hAnsi="Arial" w:cs="Arial"/>
+          <w:sz w:val="28"/>
+          <w:szCs w:val="28"/>
+        </w:rPr>
+        <w:t xml:space="preserve">, where </w:t>
+      </w:r>
+      <w:r>
+        <w:rPr>
+          <w:rFonts w:ascii="Arial" w:hAnsi="Arial" w:cs="Arial"/>
+          <w:sz w:val="28"/>
+          <w:szCs w:val="28"/>
+        </w:rPr>
+        <w:t>‘</w:t>
+      </w:r>
+      <w:r>
+        <w:rPr>
+          <w:rFonts w:ascii="Arial" w:hAnsi="Arial" w:cs="Arial"/>
+          <w:sz w:val="28"/>
+          <w:szCs w:val="28"/>
+        </w:rPr>
+        <w:t>n</w:t>
+      </w:r>
+      <w:r>
+        <w:rPr>
+          <w:rFonts w:ascii="Arial" w:hAnsi="Arial" w:cs="Arial"/>
+          <w:sz w:val="28"/>
+          <w:szCs w:val="28"/>
+        </w:rPr>
+        <w:t>’</w:t>
+      </w:r>
+      <w:r>
+        <w:rPr>
+          <w:rFonts w:ascii="Arial" w:hAnsi="Arial" w:cs="Arial"/>
+          <w:sz w:val="28"/>
+          <w:szCs w:val="28"/>
+        </w:rPr>
+        <w:t xml:space="preserve"> is the number of packages.</w:t>
+      </w:r>
+      <w:r>
+        <w:rPr>
+          <w:rFonts w:ascii="Arial" w:hAnsi="Arial" w:cs="Arial"/>
+          <w:sz w:val="28"/>
+          <w:szCs w:val="28"/>
+        </w:rPr>
+        <w:t xml:space="preserve"> </w:t>
+      </w:r>
+      <w:r>
+        <w:rPr>
+          <w:rFonts w:ascii="Arial" w:hAnsi="Arial" w:cs="Arial"/>
+          <w:sz w:val="28"/>
+          <w:szCs w:val="28"/>
+        </w:rPr>
+        <w:t xml:space="preserve">The Package class also has </w:t>
+      </w:r>
+      <w:proofErr w:type="gramStart"/>
+      <w:r>
+        <w:rPr>
+          <w:rFonts w:ascii="Arial" w:hAnsi="Arial" w:cs="Arial"/>
+          <w:sz w:val="28"/>
+          <w:szCs w:val="28"/>
+        </w:rPr>
+        <w:t>O(</w:t>
+      </w:r>
+      <w:proofErr w:type="gramEnd"/>
+      <w:r>
+        <w:rPr>
+          <w:rFonts w:ascii="Arial" w:hAnsi="Arial" w:cs="Arial"/>
+          <w:sz w:val="28"/>
+          <w:szCs w:val="28"/>
+        </w:rPr>
+        <w:t xml:space="preserve">1) time and space complexity. </w:t>
+      </w:r>
+      <w:r>
+        <w:rPr>
+          <w:rFonts w:ascii="Arial" w:hAnsi="Arial" w:cs="Arial"/>
+          <w:sz w:val="28"/>
+          <w:szCs w:val="28"/>
+        </w:rPr>
+        <w:t xml:space="preserve">The </w:t>
+      </w:r>
+      <w:proofErr w:type="spellStart"/>
+      <w:r>
+        <w:rPr>
+          <w:rFonts w:ascii="Arial" w:hAnsi="Arial" w:cs="Arial"/>
+          <w:sz w:val="28"/>
+          <w:szCs w:val="28"/>
+        </w:rPr>
+        <w:t>PackageReader</w:t>
+      </w:r>
+      <w:proofErr w:type="spellEnd"/>
+      <w:r>
+        <w:rPr>
+          <w:rFonts w:ascii="Arial" w:hAnsi="Arial" w:cs="Arial"/>
+          <w:sz w:val="28"/>
+          <w:szCs w:val="28"/>
+        </w:rPr>
+        <w:t xml:space="preserve"> class, which reads in and handles the package data</w:t>
+      </w:r>
+      <w:r>
+        <w:rPr>
+          <w:rFonts w:ascii="Arial" w:hAnsi="Arial" w:cs="Arial"/>
+          <w:sz w:val="28"/>
+          <w:szCs w:val="28"/>
+        </w:rPr>
+        <w:t>,</w:t>
+      </w:r>
+      <w:r>
+        <w:rPr>
+          <w:rFonts w:ascii="Arial" w:hAnsi="Arial" w:cs="Arial"/>
+          <w:sz w:val="28"/>
+          <w:szCs w:val="28"/>
+        </w:rPr>
+        <w:t xml:space="preserve"> </w:t>
+      </w:r>
+      <w:r>
+        <w:rPr>
+          <w:rFonts w:ascii="Arial" w:hAnsi="Arial" w:cs="Arial"/>
+          <w:sz w:val="28"/>
+          <w:szCs w:val="28"/>
+        </w:rPr>
+        <w:t>has</w:t>
+      </w:r>
+      <w:r>
+        <w:rPr>
+          <w:rFonts w:ascii="Arial" w:hAnsi="Arial" w:cs="Arial"/>
+          <w:sz w:val="28"/>
+          <w:szCs w:val="28"/>
+        </w:rPr>
+        <w:t xml:space="preserve"> O(n) time and space complexity, where </w:t>
+      </w:r>
+      <w:r>
+        <w:rPr>
+          <w:rFonts w:ascii="Arial" w:hAnsi="Arial" w:cs="Arial"/>
+          <w:sz w:val="28"/>
+          <w:szCs w:val="28"/>
+        </w:rPr>
+        <w:t>‘</w:t>
+      </w:r>
+      <w:r>
+        <w:rPr>
+          <w:rFonts w:ascii="Arial" w:hAnsi="Arial" w:cs="Arial"/>
+          <w:sz w:val="28"/>
+          <w:szCs w:val="28"/>
+        </w:rPr>
+        <w:t>n</w:t>
+      </w:r>
+      <w:r>
+        <w:rPr>
+          <w:rFonts w:ascii="Arial" w:hAnsi="Arial" w:cs="Arial"/>
+          <w:sz w:val="28"/>
+          <w:szCs w:val="28"/>
+        </w:rPr>
+        <w:t>’</w:t>
+      </w:r>
+      <w:r>
+        <w:rPr>
+          <w:rFonts w:ascii="Arial" w:hAnsi="Arial" w:cs="Arial"/>
+          <w:sz w:val="28"/>
+          <w:szCs w:val="28"/>
+        </w:rPr>
+        <w:t xml:space="preserve"> is the number of packages.</w:t>
+      </w:r>
+      <w:r>
+        <w:rPr>
+          <w:rFonts w:ascii="Arial" w:hAnsi="Arial" w:cs="Arial"/>
+          <w:sz w:val="28"/>
+          <w:szCs w:val="28"/>
+        </w:rPr>
+        <w:t xml:space="preserve"> The </w:t>
+      </w:r>
+      <w:r>
+        <w:rPr>
+          <w:rFonts w:ascii="Arial" w:hAnsi="Arial" w:cs="Arial"/>
+          <w:sz w:val="28"/>
+          <w:szCs w:val="28"/>
+        </w:rPr>
+        <w:t>nearest nei</w:t>
+      </w:r>
+      <w:r>
+        <w:rPr>
+          <w:rFonts w:ascii="Arial" w:hAnsi="Arial" w:cs="Arial"/>
+          <w:sz w:val="28"/>
+          <w:szCs w:val="28"/>
+        </w:rPr>
+        <w:t>ghbor algorithm</w:t>
+      </w:r>
+      <w:r>
+        <w:rPr>
+          <w:rFonts w:ascii="Arial" w:hAnsi="Arial" w:cs="Arial"/>
+          <w:sz w:val="28"/>
+          <w:szCs w:val="28"/>
+        </w:rPr>
+        <w:t xml:space="preserve"> has a runtime efficiency of </w:t>
+      </w:r>
+      <w:proofErr w:type="gramStart"/>
+      <w:r>
+        <w:rPr>
+          <w:rFonts w:ascii="Arial" w:hAnsi="Arial" w:cs="Arial"/>
+          <w:sz w:val="28"/>
+          <w:szCs w:val="28"/>
+        </w:rPr>
+        <w:t>O(</w:t>
+      </w:r>
+      <w:proofErr w:type="gramEnd"/>
+      <w:r>
+        <w:rPr>
+          <w:rFonts w:ascii="Arial" w:hAnsi="Arial" w:cs="Arial"/>
+          <w:sz w:val="28"/>
+          <w:szCs w:val="28"/>
+        </w:rPr>
+        <w:t>p</w:t>
+      </w:r>
+      <w:r>
+        <w:rPr>
+          <w:rFonts w:ascii="Arial" w:hAnsi="Arial" w:cs="Arial"/>
+          <w:sz w:val="28"/>
+          <w:szCs w:val="28"/>
+        </w:rPr>
+        <w:t xml:space="preserve"> x</w:t>
+      </w:r>
+      <w:r>
+        <w:rPr>
+          <w:rFonts w:ascii="Arial" w:hAnsi="Arial" w:cs="Arial"/>
+          <w:sz w:val="28"/>
+          <w:szCs w:val="28"/>
+        </w:rPr>
+        <w:t xml:space="preserve"> d</w:t>
+      </w:r>
+      <w:r>
+        <w:rPr>
+          <w:rFonts w:ascii="Arial" w:hAnsi="Arial" w:cs="Arial"/>
+          <w:sz w:val="28"/>
+          <w:szCs w:val="28"/>
+        </w:rPr>
+        <w:t xml:space="preserve">), where </w:t>
+      </w:r>
+      <w:r>
+        <w:rPr>
+          <w:rFonts w:ascii="Arial" w:hAnsi="Arial" w:cs="Arial"/>
+          <w:sz w:val="28"/>
+          <w:szCs w:val="28"/>
+        </w:rPr>
+        <w:t>‘</w:t>
+      </w:r>
+      <w:r>
+        <w:rPr>
+          <w:rFonts w:ascii="Arial" w:hAnsi="Arial" w:cs="Arial"/>
+          <w:sz w:val="28"/>
+          <w:szCs w:val="28"/>
+        </w:rPr>
+        <w:t>p</w:t>
+      </w:r>
+      <w:r>
+        <w:rPr>
+          <w:rFonts w:ascii="Arial" w:hAnsi="Arial" w:cs="Arial"/>
+          <w:sz w:val="28"/>
+          <w:szCs w:val="28"/>
+        </w:rPr>
+        <w:t>’</w:t>
+      </w:r>
+      <w:r>
+        <w:rPr>
+          <w:rFonts w:ascii="Arial" w:hAnsi="Arial" w:cs="Arial"/>
+          <w:sz w:val="28"/>
+          <w:szCs w:val="28"/>
+        </w:rPr>
+        <w:t xml:space="preserve"> is the number of packages</w:t>
+      </w:r>
+      <w:r>
+        <w:rPr>
+          <w:rFonts w:ascii="Arial" w:hAnsi="Arial" w:cs="Arial"/>
+          <w:sz w:val="28"/>
+          <w:szCs w:val="28"/>
+        </w:rPr>
+        <w:t xml:space="preserve"> </w:t>
+      </w:r>
+      <w:r>
+        <w:rPr>
+          <w:rFonts w:ascii="Arial" w:hAnsi="Arial" w:cs="Arial"/>
+          <w:sz w:val="28"/>
+          <w:szCs w:val="28"/>
+        </w:rPr>
+        <w:t xml:space="preserve">and </w:t>
+      </w:r>
+      <w:r>
+        <w:rPr>
+          <w:rFonts w:ascii="Arial" w:hAnsi="Arial" w:cs="Arial"/>
+          <w:sz w:val="28"/>
+          <w:szCs w:val="28"/>
+        </w:rPr>
+        <w:t>‘</w:t>
+      </w:r>
+      <w:r>
+        <w:rPr>
+          <w:rFonts w:ascii="Arial" w:hAnsi="Arial" w:cs="Arial"/>
+          <w:sz w:val="28"/>
+          <w:szCs w:val="28"/>
+        </w:rPr>
+        <w:t>d</w:t>
+      </w:r>
+      <w:r>
+        <w:rPr>
+          <w:rFonts w:ascii="Arial" w:hAnsi="Arial" w:cs="Arial"/>
+          <w:sz w:val="28"/>
+          <w:szCs w:val="28"/>
+        </w:rPr>
+        <w:t>’</w:t>
+      </w:r>
+      <w:r>
+        <w:rPr>
+          <w:rFonts w:ascii="Arial" w:hAnsi="Arial" w:cs="Arial"/>
+          <w:sz w:val="28"/>
+          <w:szCs w:val="28"/>
+        </w:rPr>
+        <w:t xml:space="preserve"> is </w:t>
+      </w:r>
+      <w:r>
+        <w:rPr>
+          <w:rFonts w:ascii="Arial" w:hAnsi="Arial" w:cs="Arial"/>
+          <w:sz w:val="28"/>
+          <w:szCs w:val="28"/>
+        </w:rPr>
+        <w:t xml:space="preserve">getting </w:t>
+      </w:r>
+      <w:proofErr w:type="gramStart"/>
+      <w:r>
+        <w:rPr>
+          <w:rFonts w:ascii="Arial" w:hAnsi="Arial" w:cs="Arial"/>
+          <w:sz w:val="28"/>
+          <w:szCs w:val="28"/>
+        </w:rPr>
+        <w:t>the</w:t>
+      </w:r>
+      <w:r>
+        <w:rPr>
+          <w:rFonts w:ascii="Arial" w:hAnsi="Arial" w:cs="Arial"/>
+          <w:sz w:val="28"/>
+          <w:szCs w:val="28"/>
+        </w:rPr>
+        <w:t xml:space="preserve"> distances</w:t>
+      </w:r>
+      <w:proofErr w:type="gramEnd"/>
+      <w:r>
+        <w:rPr>
+          <w:rFonts w:ascii="Arial" w:hAnsi="Arial" w:cs="Arial"/>
+          <w:sz w:val="28"/>
+          <w:szCs w:val="28"/>
+        </w:rPr>
+        <w:t xml:space="preserve"> from each location</w:t>
+      </w:r>
+      <w:r>
+        <w:rPr>
+          <w:rFonts w:ascii="Arial" w:hAnsi="Arial" w:cs="Arial"/>
+          <w:sz w:val="28"/>
+          <w:szCs w:val="28"/>
+        </w:rPr>
+        <w:t>. This</w:t>
+      </w:r>
+      <w:r>
+        <w:rPr>
+          <w:rFonts w:ascii="Arial" w:hAnsi="Arial" w:cs="Arial"/>
+          <w:sz w:val="28"/>
+          <w:szCs w:val="28"/>
+        </w:rPr>
+        <w:t xml:space="preserve"> is a product of linear factors, which create</w:t>
+      </w:r>
+      <w:r>
+        <w:rPr>
+          <w:rFonts w:ascii="Arial" w:hAnsi="Arial" w:cs="Arial"/>
+          <w:sz w:val="28"/>
+          <w:szCs w:val="28"/>
+        </w:rPr>
+        <w:t>s</w:t>
+      </w:r>
+      <w:r>
+        <w:rPr>
+          <w:rFonts w:ascii="Arial" w:hAnsi="Arial" w:cs="Arial"/>
+          <w:sz w:val="28"/>
+          <w:szCs w:val="28"/>
+        </w:rPr>
+        <w:t xml:space="preserve"> </w:t>
+      </w:r>
+      <w:r>
+        <w:rPr>
+          <w:rFonts w:ascii="Arial" w:hAnsi="Arial" w:cs="Arial"/>
+          <w:sz w:val="28"/>
+          <w:szCs w:val="28"/>
+        </w:rPr>
+        <w:t>the required</w:t>
+      </w:r>
+      <w:r>
+        <w:rPr>
+          <w:rFonts w:ascii="Arial" w:hAnsi="Arial" w:cs="Arial"/>
+          <w:sz w:val="28"/>
+          <w:szCs w:val="28"/>
+        </w:rPr>
+        <w:t xml:space="preserve"> polynomial runtime</w:t>
+      </w:r>
+      <w:r>
+        <w:rPr>
+          <w:rFonts w:ascii="Arial" w:hAnsi="Arial" w:cs="Arial"/>
+          <w:sz w:val="28"/>
+          <w:szCs w:val="28"/>
+        </w:rPr>
+        <w:t>.</w:t>
+      </w:r>
+      <w:r>
+        <w:rPr>
+          <w:rFonts w:ascii="Arial" w:hAnsi="Arial" w:cs="Arial"/>
+          <w:sz w:val="28"/>
+          <w:szCs w:val="28"/>
+        </w:rPr>
+        <w:t xml:space="preserve"> </w:t>
+      </w:r>
+      <w:r>
+        <w:rPr>
+          <w:rFonts w:ascii="Arial" w:hAnsi="Arial" w:cs="Arial"/>
+          <w:sz w:val="28"/>
+          <w:szCs w:val="28"/>
+        </w:rPr>
+        <w:t xml:space="preserve">The space complexity </w:t>
+      </w:r>
+      <w:r>
+        <w:rPr>
+          <w:rFonts w:ascii="Arial" w:hAnsi="Arial" w:cs="Arial"/>
+          <w:sz w:val="28"/>
+          <w:szCs w:val="28"/>
+        </w:rPr>
+        <w:t xml:space="preserve">is </w:t>
+      </w:r>
+      <w:proofErr w:type="gramStart"/>
+      <w:r>
+        <w:rPr>
+          <w:rFonts w:ascii="Arial" w:hAnsi="Arial" w:cs="Arial"/>
+          <w:sz w:val="28"/>
+          <w:szCs w:val="28"/>
+        </w:rPr>
+        <w:t>O(</w:t>
+      </w:r>
+      <w:proofErr w:type="gramEnd"/>
+      <w:r>
+        <w:rPr>
+          <w:rFonts w:ascii="Arial" w:hAnsi="Arial" w:cs="Arial"/>
+          <w:sz w:val="28"/>
+          <w:szCs w:val="28"/>
+        </w:rPr>
+        <w:t>1).</w:t>
+      </w:r>
+    </w:p>
+    <w:p/>
+    <w:p>
+      <w:pPr>
+        <w:pStyle w:val="Heading1"/>
+        <w:spacing w:line="360" w:lineRule="auto"/>
+        <w:rPr>
+          <w:rFonts w:ascii="Arial" w:hAnsi="Arial" w:cs="Arial"/>
+          <w:sz w:val="28"/>
+          <w:szCs w:val="28"/>
+        </w:rPr>
+      </w:pPr>
+      <w:r>
+        <w:rPr>
+          <w:rFonts w:ascii="Arial" w:hAnsi="Arial" w:cs="Arial"/>
+          <w:sz w:val="28"/>
+          <w:szCs w:val="28"/>
+        </w:rPr>
+        <w:t>C4. Scalability and Adaptability</w:t>
+      </w:r>
+    </w:p>
+    <w:p>
+      <w:pPr>
+        <w:spacing w:line="360" w:lineRule="auto"/>
+        <w:rPr>
+          <w:rFonts w:ascii="Arial" w:hAnsi="Arial" w:cs="Arial"/>
+          <w:sz w:val="28"/>
+          <w:szCs w:val="28"/>
+        </w:rPr>
+      </w:pPr>
+      <w:r>
+        <w:rPr>
+          <w:rFonts w:ascii="Arial" w:hAnsi="Arial" w:cs="Arial"/>
+          <w:sz w:val="28"/>
+          <w:szCs w:val="28"/>
+        </w:rPr>
+        <w:t xml:space="preserve">Because of the use of </w:t>
+      </w:r>
+      <w:proofErr w:type="gramStart"/>
+      <w:r>
+        <w:rPr>
+          <w:rFonts w:ascii="Arial" w:hAnsi="Arial" w:cs="Arial"/>
+          <w:sz w:val="28"/>
+          <w:szCs w:val="28"/>
+        </w:rPr>
+        <w:t xml:space="preserve">a </w:t>
+      </w:r>
+      <w:r>
+        <w:rPr>
+          <w:rFonts w:ascii="Arial" w:hAnsi="Arial" w:cs="Arial"/>
+          <w:sz w:val="28"/>
+          <w:szCs w:val="28"/>
+        </w:rPr>
+        <w:t>self</w:t>
+      </w:r>
+      <w:proofErr w:type="gramEnd"/>
+      <w:r>
+        <w:rPr>
+          <w:rFonts w:ascii="Arial" w:hAnsi="Arial" w:cs="Arial"/>
+          <w:sz w:val="28"/>
+          <w:szCs w:val="28"/>
+        </w:rPr>
+        <w:t xml:space="preserve">-adjusting </w:t>
+      </w:r>
+      <w:r>
+        <w:rPr>
+          <w:rFonts w:ascii="Arial" w:hAnsi="Arial" w:cs="Arial"/>
+          <w:sz w:val="28"/>
+          <w:szCs w:val="28"/>
+        </w:rPr>
+        <w:t>hash table</w:t>
+      </w:r>
+      <w:r>
+        <w:rPr>
+          <w:rFonts w:ascii="Arial" w:hAnsi="Arial" w:cs="Arial"/>
+          <w:sz w:val="28"/>
+          <w:szCs w:val="28"/>
+        </w:rPr>
+        <w:t xml:space="preserve"> data structure, the ability to adapt to a larger number of packages is quite easy. </w:t>
+      </w:r>
+      <w:r>
+        <w:rPr>
+          <w:rFonts w:ascii="Arial" w:hAnsi="Arial" w:cs="Arial"/>
+          <w:sz w:val="28"/>
+          <w:szCs w:val="28"/>
+        </w:rPr>
+        <w:t xml:space="preserve">The current </w:t>
+      </w:r>
+      <w:r>
+        <w:rPr>
+          <w:rFonts w:ascii="Arial" w:hAnsi="Arial" w:cs="Arial"/>
+          <w:sz w:val="28"/>
+          <w:szCs w:val="28"/>
+        </w:rPr>
+        <w:t>10-bucket</w:t>
+      </w:r>
+      <w:r>
+        <w:rPr>
+          <w:rFonts w:ascii="Arial" w:hAnsi="Arial" w:cs="Arial"/>
+          <w:sz w:val="28"/>
+          <w:szCs w:val="28"/>
+        </w:rPr>
+        <w:t xml:space="preserve"> hash map </w:t>
+      </w:r>
+      <w:r>
+        <w:rPr>
+          <w:rFonts w:ascii="Arial" w:hAnsi="Arial" w:cs="Arial"/>
+          <w:sz w:val="28"/>
+          <w:szCs w:val="28"/>
+        </w:rPr>
+        <w:t>uses the modulo function to distribute the packages based on their remainder</w:t>
+      </w:r>
+      <w:r>
+        <w:rPr>
+          <w:rFonts w:ascii="Arial" w:hAnsi="Arial" w:cs="Arial"/>
+          <w:sz w:val="28"/>
+          <w:szCs w:val="28"/>
+        </w:rPr>
+        <w:t>, with multiple packages in each bucket.</w:t>
+      </w:r>
+      <w:r>
+        <w:rPr>
+          <w:rFonts w:ascii="Arial" w:hAnsi="Arial" w:cs="Arial"/>
+          <w:sz w:val="28"/>
+          <w:szCs w:val="28"/>
+        </w:rPr>
+        <w:t xml:space="preserve"> If needed</w:t>
+      </w:r>
+      <w:r>
+        <w:rPr>
+          <w:rFonts w:ascii="Arial" w:hAnsi="Arial" w:cs="Arial"/>
+          <w:sz w:val="28"/>
+          <w:szCs w:val="28"/>
+        </w:rPr>
+        <w:t>,</w:t>
+      </w:r>
+      <w:r>
+        <w:rPr>
+          <w:rFonts w:ascii="Arial" w:hAnsi="Arial" w:cs="Arial"/>
+          <w:sz w:val="28"/>
+          <w:szCs w:val="28"/>
+        </w:rPr>
+        <w:t xml:space="preserve"> the </w:t>
+      </w:r>
+      <w:r>
+        <w:rPr>
+          <w:rFonts w:ascii="Arial" w:hAnsi="Arial" w:cs="Arial"/>
+          <w:sz w:val="28"/>
+          <w:szCs w:val="28"/>
+        </w:rPr>
+        <w:t>number</w:t>
+      </w:r>
+      <w:r>
+        <w:rPr>
+          <w:rFonts w:ascii="Arial" w:hAnsi="Arial" w:cs="Arial"/>
+          <w:sz w:val="28"/>
+          <w:szCs w:val="28"/>
+        </w:rPr>
+        <w:t xml:space="preserve"> of buckets could be increased to accommodate more packages</w:t>
+      </w:r>
+      <w:r>
+        <w:rPr>
+          <w:rFonts w:ascii="Arial" w:hAnsi="Arial" w:cs="Arial"/>
+          <w:sz w:val="28"/>
+          <w:szCs w:val="28"/>
+        </w:rPr>
+        <w:t>, and the table can be rehashed accordingly.</w:t>
+      </w:r>
+    </w:p>
+    <w:p>
+      <w:pPr>
+        <w:pStyle w:val="Heading1"/>
+        <w:spacing w:line="360" w:lineRule="auto"/>
+        <w:rPr>
+          <w:rFonts w:ascii="Arial" w:hAnsi="Arial" w:cs="Arial"/>
+          <w:sz w:val="28"/>
+          <w:szCs w:val="28"/>
+        </w:rPr>
+      </w:pPr>
+      <w:r>
+        <w:rPr>
+          <w:rFonts w:ascii="Arial" w:hAnsi="Arial" w:cs="Arial"/>
+          <w:sz w:val="28"/>
+          <w:szCs w:val="28"/>
+        </w:rPr>
         <w:lastRenderedPageBreak/>
-        <w:t>C</w:t>
-      </w:r>
-      <w:r>
-        <w:rPr>
-          <w:rFonts w:ascii="Arial" w:hAnsi="Arial" w:cs="Arial"/>
-          <w:sz w:val="28"/>
-          <w:szCs w:val="28"/>
-        </w:rPr>
-        <w:t>2</w:t>
+        <w:t xml:space="preserve">C5. Software Efficiency and Maintainability </w:t>
+      </w:r>
+    </w:p>
+    <w:p>
+      <w:pPr>
+        <w:spacing w:line="360" w:lineRule="auto"/>
+        <w:rPr>
+          <w:rFonts w:ascii="Arial" w:hAnsi="Arial" w:cs="Arial"/>
+          <w:sz w:val="28"/>
+          <w:szCs w:val="28"/>
+        </w:rPr>
+      </w:pPr>
+      <w:r>
+        <w:rPr>
+          <w:rFonts w:ascii="Arial" w:hAnsi="Arial" w:cs="Arial"/>
+          <w:sz w:val="28"/>
+          <w:szCs w:val="28"/>
+        </w:rPr>
+        <w:t xml:space="preserve">The software design </w:t>
+      </w:r>
+      <w:r>
+        <w:rPr>
+          <w:rFonts w:ascii="Arial" w:hAnsi="Arial" w:cs="Arial"/>
+          <w:sz w:val="28"/>
+          <w:szCs w:val="28"/>
+        </w:rPr>
+        <w:t>has</w:t>
+      </w:r>
+      <w:r>
+        <w:rPr>
+          <w:rFonts w:ascii="Arial" w:hAnsi="Arial" w:cs="Arial"/>
+          <w:sz w:val="28"/>
+          <w:szCs w:val="28"/>
+        </w:rPr>
+        <w:t xml:space="preserve"> a polynomial runtime</w:t>
+      </w:r>
+      <w:r>
+        <w:rPr>
+          <w:rFonts w:ascii="Arial" w:hAnsi="Arial" w:cs="Arial"/>
+          <w:sz w:val="28"/>
+          <w:szCs w:val="28"/>
+        </w:rPr>
+        <w:t xml:space="preserve"> or better</w:t>
+      </w:r>
+      <w:r>
+        <w:rPr>
+          <w:rFonts w:ascii="Arial" w:hAnsi="Arial" w:cs="Arial"/>
+          <w:sz w:val="28"/>
+          <w:szCs w:val="28"/>
+        </w:rPr>
+        <w:t>, which</w:t>
+      </w:r>
+      <w:r>
+        <w:rPr>
+          <w:rFonts w:ascii="Arial" w:hAnsi="Arial" w:cs="Arial"/>
+          <w:sz w:val="28"/>
+          <w:szCs w:val="28"/>
+        </w:rPr>
+        <w:t xml:space="preserve"> maintain</w:t>
+      </w:r>
+      <w:r>
+        <w:rPr>
+          <w:rFonts w:ascii="Arial" w:hAnsi="Arial" w:cs="Arial"/>
+          <w:sz w:val="28"/>
+          <w:szCs w:val="28"/>
+        </w:rPr>
+        <w:t xml:space="preserve">s runtime </w:t>
+      </w:r>
+      <w:r>
+        <w:rPr>
+          <w:rFonts w:ascii="Arial" w:hAnsi="Arial" w:cs="Arial"/>
+          <w:sz w:val="28"/>
+          <w:szCs w:val="28"/>
+        </w:rPr>
+        <w:t xml:space="preserve">efficiency. </w:t>
+      </w:r>
+      <w:r>
+        <w:rPr>
+          <w:rFonts w:ascii="Arial" w:hAnsi="Arial" w:cs="Arial"/>
+          <w:sz w:val="28"/>
+          <w:szCs w:val="28"/>
+        </w:rPr>
+        <w:t>Variables use</w:t>
+      </w:r>
+      <w:r>
+        <w:rPr>
+          <w:rFonts w:ascii="Arial" w:hAnsi="Arial" w:cs="Arial"/>
+          <w:sz w:val="28"/>
+          <w:szCs w:val="28"/>
+        </w:rPr>
+        <w:t xml:space="preserve"> straightforward naming conventions</w:t>
+      </w:r>
+      <w:r>
+        <w:rPr>
+          <w:rFonts w:ascii="Arial" w:hAnsi="Arial" w:cs="Arial"/>
+          <w:sz w:val="28"/>
+          <w:szCs w:val="28"/>
+        </w:rPr>
+        <w:t xml:space="preserve"> for</w:t>
+      </w:r>
+      <w:r>
+        <w:rPr>
+          <w:rFonts w:ascii="Arial" w:hAnsi="Arial" w:cs="Arial"/>
+          <w:sz w:val="28"/>
+          <w:szCs w:val="28"/>
+        </w:rPr>
+        <w:t xml:space="preserve"> easy readability </w:t>
+      </w:r>
+      <w:r>
+        <w:rPr>
+          <w:rFonts w:ascii="Arial" w:hAnsi="Arial" w:cs="Arial"/>
+          <w:sz w:val="28"/>
+          <w:szCs w:val="28"/>
+        </w:rPr>
+        <w:t>for</w:t>
+      </w:r>
+      <w:r>
+        <w:rPr>
+          <w:rFonts w:ascii="Arial" w:hAnsi="Arial" w:cs="Arial"/>
+          <w:sz w:val="28"/>
+          <w:szCs w:val="28"/>
+        </w:rPr>
+        <w:t xml:space="preserve"> others. The use of </w:t>
+      </w:r>
+      <w:r>
+        <w:rPr>
+          <w:rFonts w:ascii="Arial" w:hAnsi="Arial" w:cs="Arial"/>
+          <w:sz w:val="28"/>
+          <w:szCs w:val="28"/>
+        </w:rPr>
+        <w:t>function</w:t>
+      </w:r>
+      <w:r>
+        <w:rPr>
+          <w:rFonts w:ascii="Arial" w:hAnsi="Arial" w:cs="Arial"/>
+          <w:sz w:val="28"/>
+          <w:szCs w:val="28"/>
+        </w:rPr>
+        <w:t>s for printing various information</w:t>
+      </w:r>
+      <w:r>
+        <w:rPr>
+          <w:rFonts w:ascii="Arial" w:hAnsi="Arial" w:cs="Arial"/>
+          <w:sz w:val="28"/>
+          <w:szCs w:val="28"/>
+        </w:rPr>
+        <w:t>, calculating routes, etc.,</w:t>
+      </w:r>
+      <w:r>
+        <w:rPr>
+          <w:rFonts w:ascii="Arial" w:hAnsi="Arial" w:cs="Arial"/>
+          <w:sz w:val="28"/>
+          <w:szCs w:val="28"/>
+        </w:rPr>
+        <w:t xml:space="preserve"> </w:t>
+      </w:r>
+      <w:r>
+        <w:rPr>
+          <w:rFonts w:ascii="Arial" w:hAnsi="Arial" w:cs="Arial"/>
+          <w:sz w:val="28"/>
+          <w:szCs w:val="28"/>
+        </w:rPr>
+        <w:t>allows</w:t>
+      </w:r>
+      <w:r>
+        <w:rPr>
+          <w:rFonts w:ascii="Arial" w:hAnsi="Arial" w:cs="Arial"/>
+          <w:sz w:val="28"/>
+          <w:szCs w:val="28"/>
+        </w:rPr>
+        <w:t xml:space="preserve"> for reusability of code segments elsewhere</w:t>
+      </w:r>
+      <w:r>
+        <w:rPr>
+          <w:rFonts w:ascii="Arial" w:hAnsi="Arial" w:cs="Arial"/>
+          <w:sz w:val="28"/>
+          <w:szCs w:val="28"/>
+        </w:rPr>
+        <w:t xml:space="preserve"> when needed</w:t>
+      </w:r>
+      <w:r>
+        <w:rPr>
+          <w:rFonts w:ascii="Arial" w:hAnsi="Arial" w:cs="Arial"/>
+          <w:sz w:val="28"/>
+          <w:szCs w:val="28"/>
+        </w:rPr>
+        <w:t>.</w:t>
+      </w:r>
+      <w:r>
+        <w:rPr>
+          <w:rFonts w:ascii="Arial" w:hAnsi="Arial" w:cs="Arial"/>
+          <w:sz w:val="28"/>
+          <w:szCs w:val="28"/>
+        </w:rPr>
+        <w:t xml:space="preserve"> There are many parts of the program which can be “recycled” for later use.</w:t>
+      </w:r>
+    </w:p>
+    <w:p>
+      <w:pPr>
+        <w:pStyle w:val="Heading1"/>
+        <w:spacing w:line="360" w:lineRule="auto"/>
+        <w:rPr>
+          <w:rFonts w:ascii="Arial" w:hAnsi="Arial" w:cs="Arial"/>
+          <w:sz w:val="28"/>
+          <w:szCs w:val="28"/>
+        </w:rPr>
+      </w:pPr>
+      <w:r>
+        <w:rPr>
+          <w:rFonts w:ascii="Arial" w:hAnsi="Arial" w:cs="Arial"/>
+          <w:sz w:val="28"/>
+          <w:szCs w:val="28"/>
+        </w:rPr>
+        <w:t xml:space="preserve">C6. Self-Adjusting Data Structures </w:t>
+      </w:r>
+    </w:p>
+    <w:p>
+      <w:pPr>
+        <w:spacing w:line="360" w:lineRule="auto"/>
+        <w:rPr>
+          <w:rFonts w:ascii="Arial" w:hAnsi="Arial" w:cs="Arial"/>
+          <w:sz w:val="28"/>
+          <w:szCs w:val="28"/>
+        </w:rPr>
+      </w:pPr>
+      <w:r>
+        <w:rPr>
+          <w:rFonts w:ascii="Arial" w:hAnsi="Arial" w:cs="Arial"/>
+          <w:sz w:val="28"/>
+          <w:szCs w:val="28"/>
+        </w:rPr>
+        <w:t xml:space="preserve">The versatility of using various data types as the assigned key in a hash table instead of only </w:t>
+      </w:r>
+      <w:proofErr w:type="gramStart"/>
+      <w:r>
+        <w:rPr>
+          <w:rFonts w:ascii="Arial" w:hAnsi="Arial" w:cs="Arial"/>
+          <w:sz w:val="28"/>
+          <w:szCs w:val="28"/>
+        </w:rPr>
+        <w:t>an</w:t>
+      </w:r>
+      <w:proofErr w:type="gramEnd"/>
+      <w:r>
+        <w:rPr>
+          <w:rFonts w:ascii="Arial" w:hAnsi="Arial" w:cs="Arial"/>
+          <w:sz w:val="28"/>
+          <w:szCs w:val="28"/>
+        </w:rPr>
+        <w:t xml:space="preserve"> integer can be considered a strength. </w:t>
+      </w:r>
+      <w:r>
+        <w:rPr>
+          <w:rFonts w:ascii="Arial" w:hAnsi="Arial" w:cs="Arial"/>
+          <w:sz w:val="28"/>
+          <w:szCs w:val="28"/>
+        </w:rPr>
+        <w:t xml:space="preserve">A name, email, or other information can be used as a key to directly link to </w:t>
+      </w:r>
+      <w:r>
+        <w:rPr>
+          <w:rFonts w:ascii="Arial" w:hAnsi="Arial" w:cs="Arial"/>
+          <w:sz w:val="28"/>
+          <w:szCs w:val="28"/>
+        </w:rPr>
+        <w:t xml:space="preserve">its value pair. </w:t>
+      </w:r>
+      <w:r>
+        <w:rPr>
+          <w:rFonts w:ascii="Arial" w:hAnsi="Arial" w:cs="Arial"/>
+          <w:sz w:val="28"/>
+          <w:szCs w:val="28"/>
+        </w:rPr>
+        <w:t>A</w:t>
+      </w:r>
+      <w:r>
+        <w:rPr>
+          <w:rFonts w:ascii="Arial" w:hAnsi="Arial" w:cs="Arial"/>
+          <w:sz w:val="28"/>
+          <w:szCs w:val="28"/>
+        </w:rPr>
+        <w:t>nother</w:t>
+      </w:r>
+      <w:r>
+        <w:rPr>
+          <w:rFonts w:ascii="Arial" w:hAnsi="Arial" w:cs="Arial"/>
+          <w:sz w:val="28"/>
+          <w:szCs w:val="28"/>
+        </w:rPr>
+        <w:t xml:space="preserve"> strength</w:t>
+      </w:r>
+      <w:r>
+        <w:rPr>
+          <w:rFonts w:ascii="Arial" w:hAnsi="Arial" w:cs="Arial"/>
+          <w:sz w:val="28"/>
+          <w:szCs w:val="28"/>
+        </w:rPr>
+        <w:t xml:space="preserve"> of using a hash table</w:t>
+      </w:r>
+      <w:r>
+        <w:rPr>
+          <w:rFonts w:ascii="Arial" w:hAnsi="Arial" w:cs="Arial"/>
+          <w:sz w:val="28"/>
+          <w:szCs w:val="28"/>
+        </w:rPr>
+        <w:t xml:space="preserve"> as a self-adjusting data structure is the efficiency of </w:t>
+      </w:r>
+      <w:r>
+        <w:rPr>
+          <w:rFonts w:ascii="Arial" w:hAnsi="Arial" w:cs="Arial"/>
+          <w:sz w:val="28"/>
+          <w:szCs w:val="28"/>
+        </w:rPr>
+        <w:t>changing/removing elements</w:t>
+      </w:r>
+      <w:r>
+        <w:rPr>
+          <w:rFonts w:ascii="Arial" w:hAnsi="Arial" w:cs="Arial"/>
+          <w:sz w:val="28"/>
+          <w:szCs w:val="28"/>
+        </w:rPr>
+        <w:t xml:space="preserve">. The time complexity of </w:t>
+      </w:r>
+      <w:r>
+        <w:rPr>
+          <w:rFonts w:ascii="Arial" w:hAnsi="Arial" w:cs="Arial"/>
+          <w:sz w:val="28"/>
+          <w:szCs w:val="28"/>
+        </w:rPr>
+        <w:t xml:space="preserve">searching, </w:t>
+      </w:r>
+      <w:r>
+        <w:rPr>
+          <w:rFonts w:ascii="Arial" w:hAnsi="Arial" w:cs="Arial"/>
+          <w:sz w:val="28"/>
+          <w:szCs w:val="28"/>
+        </w:rPr>
+        <w:t xml:space="preserve">adding, </w:t>
+      </w:r>
+      <w:r>
+        <w:rPr>
+          <w:rFonts w:ascii="Arial" w:hAnsi="Arial" w:cs="Arial"/>
+          <w:sz w:val="28"/>
+          <w:szCs w:val="28"/>
+        </w:rPr>
+        <w:t>modifying</w:t>
+      </w:r>
+      <w:r>
+        <w:rPr>
+          <w:rFonts w:ascii="Arial" w:hAnsi="Arial" w:cs="Arial"/>
+          <w:sz w:val="28"/>
+          <w:szCs w:val="28"/>
+        </w:rPr>
+        <w:t>,</w:t>
+      </w:r>
+      <w:r>
+        <w:rPr>
+          <w:rFonts w:ascii="Arial" w:hAnsi="Arial" w:cs="Arial"/>
+          <w:sz w:val="28"/>
+          <w:szCs w:val="28"/>
+        </w:rPr>
+        <w:t xml:space="preserve"> or removing</w:t>
+      </w:r>
+      <w:r>
+        <w:rPr>
+          <w:rFonts w:ascii="Arial" w:hAnsi="Arial" w:cs="Arial"/>
+          <w:sz w:val="28"/>
+          <w:szCs w:val="28"/>
+        </w:rPr>
+        <w:t xml:space="preserve"> a value is </w:t>
+      </w:r>
+      <w:r>
+        <w:rPr>
+          <w:rFonts w:ascii="Arial" w:hAnsi="Arial" w:cs="Arial"/>
+          <w:sz w:val="28"/>
+          <w:szCs w:val="28"/>
+        </w:rPr>
+        <w:t xml:space="preserve">on </w:t>
+      </w:r>
+      <w:r>
+        <w:rPr>
+          <w:rFonts w:ascii="Arial" w:hAnsi="Arial" w:cs="Arial"/>
+          <w:sz w:val="28"/>
+          <w:szCs w:val="28"/>
+        </w:rPr>
+        <w:t xml:space="preserve">average </w:t>
+      </w:r>
+      <w:proofErr w:type="gramStart"/>
+      <w:r>
+        <w:rPr>
+          <w:rFonts w:ascii="Arial" w:hAnsi="Arial" w:cs="Arial"/>
+          <w:sz w:val="28"/>
+          <w:szCs w:val="28"/>
+        </w:rPr>
+        <w:t>O(</w:t>
+      </w:r>
+      <w:proofErr w:type="gramEnd"/>
+      <w:r>
+        <w:rPr>
+          <w:rFonts w:ascii="Arial" w:hAnsi="Arial" w:cs="Arial"/>
+          <w:sz w:val="28"/>
+          <w:szCs w:val="28"/>
+        </w:rPr>
+        <w:t>1)</w:t>
       </w:r>
       <w:r>
         <w:rPr>
@@ -1214,121 +3089,191 @@
           <w:sz w:val="28"/>
           <w:szCs w:val="28"/>
         </w:rPr>
-        <w:t>Development Environment</w:t>
-      </w:r>
-    </w:p>
-    <w:p>
-      <w:pPr>
-        <w:spacing w:line="360" w:lineRule="auto"/>
-        <w:rPr>
-          <w:rFonts w:ascii="Arial" w:hAnsi="Arial" w:cs="Arial"/>
-          <w:sz w:val="28"/>
-          <w:szCs w:val="28"/>
-        </w:rPr>
-      </w:pPr>
-      <w:r>
-        <w:rPr>
-          <w:rFonts w:ascii="Arial" w:hAnsi="Arial" w:cs="Arial"/>
-          <w:sz w:val="28"/>
-          <w:szCs w:val="28"/>
-        </w:rPr>
-        <w:t>The programming environment I’ve chosen to use is PyCharm, as</w:t>
-      </w:r>
-      <w:r>
-        <w:rPr>
-          <w:rFonts w:ascii="Arial" w:hAnsi="Arial" w:cs="Arial"/>
-          <w:sz w:val="28"/>
-          <w:szCs w:val="28"/>
-        </w:rPr>
-        <w:t xml:space="preserve"> it ** ha</w:t>
-      </w:r>
-      <w:r>
-        <w:rPr>
-          <w:rFonts w:ascii="Arial" w:hAnsi="Arial" w:cs="Arial"/>
-          <w:sz w:val="28"/>
-          <w:szCs w:val="28"/>
-        </w:rPr>
-        <w:t>s</w:t>
-      </w:r>
-      <w:r>
-        <w:rPr>
-          <w:rFonts w:ascii="Arial" w:hAnsi="Arial" w:cs="Arial"/>
-          <w:sz w:val="28"/>
-          <w:szCs w:val="28"/>
-        </w:rPr>
-        <w:t xml:space="preserve"> a multitude of features specific to Python**. It also includes a built</w:t>
-      </w:r>
-      <w:r>
-        <w:rPr>
-          <w:rFonts w:ascii="Arial" w:hAnsi="Arial" w:cs="Arial"/>
-          <w:sz w:val="28"/>
-          <w:szCs w:val="28"/>
-        </w:rPr>
-        <w:t>-</w:t>
-      </w:r>
-      <w:r>
-        <w:rPr>
-          <w:rFonts w:ascii="Arial" w:hAnsi="Arial" w:cs="Arial"/>
-          <w:sz w:val="28"/>
-          <w:szCs w:val="28"/>
-        </w:rPr>
-        <w:t>in terminal environment</w:t>
-      </w:r>
-      <w:r>
-        <w:rPr>
-          <w:rFonts w:ascii="Arial" w:hAnsi="Arial" w:cs="Arial"/>
-          <w:sz w:val="28"/>
-          <w:szCs w:val="28"/>
-        </w:rPr>
-        <w:t>,</w:t>
-      </w:r>
-      <w:r>
-        <w:rPr>
-          <w:rFonts w:ascii="Arial" w:hAnsi="Arial" w:cs="Arial"/>
-          <w:sz w:val="28"/>
-          <w:szCs w:val="28"/>
-        </w:rPr>
-        <w:t xml:space="preserve"> which </w:t>
-      </w:r>
-      <w:r>
-        <w:rPr>
-          <w:rFonts w:ascii="Arial" w:hAnsi="Arial" w:cs="Arial"/>
-          <w:sz w:val="28"/>
-          <w:szCs w:val="28"/>
-        </w:rPr>
-        <w:t xml:space="preserve">helps with using </w:t>
-      </w:r>
-      <w:r>
-        <w:rPr>
-          <w:rFonts w:ascii="Arial" w:hAnsi="Arial" w:cs="Arial"/>
-          <w:sz w:val="28"/>
-          <w:szCs w:val="28"/>
-        </w:rPr>
-        <w:t>G</w:t>
-      </w:r>
-      <w:r>
-        <w:rPr>
-          <w:rFonts w:ascii="Arial" w:hAnsi="Arial" w:cs="Arial"/>
-          <w:sz w:val="28"/>
-          <w:szCs w:val="28"/>
-        </w:rPr>
-        <w:t>it for version control. The hardware of my</w:t>
-      </w:r>
-      <w:r>
-        <w:rPr>
-          <w:rFonts w:ascii="Arial" w:hAnsi="Arial" w:cs="Arial"/>
-          <w:sz w:val="28"/>
-          <w:szCs w:val="28"/>
-        </w:rPr>
-        <w:t xml:space="preserve"> device (laptop) is ********</w:t>
-      </w:r>
-      <w:r>
-        <w:rPr>
-          <w:rFonts w:ascii="Arial" w:hAnsi="Arial" w:cs="Arial"/>
-          <w:sz w:val="28"/>
-          <w:szCs w:val="28"/>
-        </w:rPr>
-        <w:t xml:space="preserve"> </w:t>
+        <w:t>However</w:t>
+      </w:r>
+      <w:r>
+        <w:rPr>
+          <w:rFonts w:ascii="Arial" w:hAnsi="Arial" w:cs="Arial"/>
+          <w:sz w:val="28"/>
+          <w:szCs w:val="28"/>
+        </w:rPr>
+        <w:t xml:space="preserve">, the </w:t>
+      </w:r>
+      <w:r>
+        <w:rPr>
+          <w:rFonts w:ascii="Arial" w:hAnsi="Arial" w:cs="Arial"/>
+          <w:sz w:val="28"/>
+          <w:szCs w:val="28"/>
+        </w:rPr>
+        <w:t xml:space="preserve">time complexity can reach linear O(n) time </w:t>
+      </w:r>
+      <w:r>
+        <w:rPr>
+          <w:rFonts w:ascii="Arial" w:hAnsi="Arial" w:cs="Arial"/>
+          <w:sz w:val="28"/>
+          <w:szCs w:val="28"/>
+        </w:rPr>
+        <w:t xml:space="preserve">depending on the </w:t>
+      </w:r>
+      <w:r>
+        <w:rPr>
+          <w:rFonts w:ascii="Arial" w:hAnsi="Arial" w:cs="Arial"/>
+          <w:sz w:val="28"/>
+          <w:szCs w:val="28"/>
+        </w:rPr>
+        <w:t>number</w:t>
+      </w:r>
+      <w:r>
+        <w:rPr>
+          <w:rFonts w:ascii="Arial" w:hAnsi="Arial" w:cs="Arial"/>
+          <w:sz w:val="28"/>
+          <w:szCs w:val="28"/>
+        </w:rPr>
+        <w:t xml:space="preserve"> of collisions, or </w:t>
+      </w:r>
+      <w:r>
+        <w:rPr>
+          <w:rFonts w:ascii="Arial" w:hAnsi="Arial" w:cs="Arial"/>
+          <w:sz w:val="28"/>
+          <w:szCs w:val="28"/>
+        </w:rPr>
+        <w:t>elements in the same bucket</w:t>
+      </w:r>
+      <w:r>
+        <w:rPr>
+          <w:rFonts w:ascii="Arial" w:hAnsi="Arial" w:cs="Arial"/>
+          <w:sz w:val="28"/>
+          <w:szCs w:val="28"/>
+        </w:rPr>
+        <w:t>, which ca</w:t>
+      </w:r>
+      <w:r>
+        <w:rPr>
+          <w:rFonts w:ascii="Arial" w:hAnsi="Arial" w:cs="Arial"/>
+          <w:sz w:val="28"/>
+          <w:szCs w:val="28"/>
+        </w:rPr>
+        <w:t>n</w:t>
+      </w:r>
+      <w:r>
+        <w:rPr>
+          <w:rFonts w:ascii="Arial" w:hAnsi="Arial" w:cs="Arial"/>
+          <w:sz w:val="28"/>
+          <w:szCs w:val="28"/>
+        </w:rPr>
+        <w:t xml:space="preserve"> be a weakness</w:t>
+      </w:r>
+      <w:r>
+        <w:rPr>
+          <w:rFonts w:ascii="Arial" w:hAnsi="Arial" w:cs="Arial"/>
+          <w:sz w:val="28"/>
+          <w:szCs w:val="28"/>
+        </w:rPr>
+        <w:t xml:space="preserve"> in a poorly designed system</w:t>
+      </w:r>
+      <w:r>
+        <w:rPr>
+          <w:rFonts w:ascii="Arial" w:hAnsi="Arial" w:cs="Arial"/>
+          <w:sz w:val="28"/>
+          <w:szCs w:val="28"/>
+        </w:rPr>
+        <w:t>.</w:t>
+      </w:r>
+      <w:r>
+        <w:rPr>
+          <w:rFonts w:ascii="Arial" w:hAnsi="Arial" w:cs="Arial"/>
+          <w:sz w:val="28"/>
+          <w:szCs w:val="28"/>
+        </w:rPr>
+        <w:t xml:space="preserve"> Another weakness of a hash table/hash map could be the load factor</w:t>
+      </w:r>
+      <w:r>
+        <w:rPr>
+          <w:rFonts w:ascii="Arial" w:hAnsi="Arial" w:cs="Arial"/>
+          <w:sz w:val="28"/>
+          <w:szCs w:val="28"/>
+        </w:rPr>
+        <w:t xml:space="preserve"> and unused allocated memory. A hash table m</w:t>
+      </w:r>
+      <w:r>
+        <w:rPr>
+          <w:rFonts w:ascii="Arial" w:hAnsi="Arial" w:cs="Arial"/>
+          <w:sz w:val="28"/>
+          <w:szCs w:val="28"/>
+        </w:rPr>
+        <w:t xml:space="preserve">ight not </w:t>
+      </w:r>
+      <w:r>
+        <w:rPr>
+          <w:rFonts w:ascii="Arial" w:hAnsi="Arial" w:cs="Arial"/>
+          <w:sz w:val="28"/>
+          <w:szCs w:val="28"/>
+        </w:rPr>
+        <w:t>fill</w:t>
+      </w:r>
+      <w:r>
+        <w:rPr>
+          <w:rFonts w:ascii="Arial" w:hAnsi="Arial" w:cs="Arial"/>
+          <w:sz w:val="28"/>
+          <w:szCs w:val="28"/>
+        </w:rPr>
+        <w:t xml:space="preserve"> every single bucket</w:t>
+      </w:r>
+      <w:r>
+        <w:rPr>
+          <w:rFonts w:ascii="Arial" w:hAnsi="Arial" w:cs="Arial"/>
+          <w:sz w:val="28"/>
+          <w:szCs w:val="28"/>
+        </w:rPr>
+        <w:t xml:space="preserve"> with elements</w:t>
+      </w:r>
+      <w:r>
+        <w:rPr>
+          <w:rFonts w:ascii="Arial" w:hAnsi="Arial" w:cs="Arial"/>
+          <w:sz w:val="28"/>
+          <w:szCs w:val="28"/>
+        </w:rPr>
+        <w:t xml:space="preserve">, </w:t>
+      </w:r>
+      <w:r>
+        <w:rPr>
+          <w:rFonts w:ascii="Arial" w:hAnsi="Arial" w:cs="Arial"/>
+          <w:sz w:val="28"/>
+          <w:szCs w:val="28"/>
+        </w:rPr>
+        <w:t>wasting</w:t>
+      </w:r>
+      <w:r>
+        <w:rPr>
+          <w:rFonts w:ascii="Arial" w:hAnsi="Arial" w:cs="Arial"/>
+          <w:sz w:val="28"/>
+          <w:szCs w:val="28"/>
+        </w:rPr>
+        <w:t xml:space="preserve"> memory. The hash table may also need to reallocate</w:t>
+      </w:r>
+      <w:r>
+        <w:rPr>
+          <w:rFonts w:ascii="Arial" w:hAnsi="Arial" w:cs="Arial"/>
+          <w:sz w:val="28"/>
+          <w:szCs w:val="28"/>
+        </w:rPr>
+        <w:t xml:space="preserve"> to a new array if the load factor is exceeded, requiring every element in the array to be rehashed</w:t>
+      </w:r>
+      <w:r>
+        <w:rPr>
+          <w:rFonts w:ascii="Arial" w:hAnsi="Arial" w:cs="Arial"/>
+          <w:sz w:val="28"/>
+          <w:szCs w:val="28"/>
+        </w:rPr>
+        <w:t>/reindexed</w:t>
+      </w:r>
+      <w:r>
+        <w:rPr>
+          <w:rFonts w:ascii="Arial" w:hAnsi="Arial" w:cs="Arial"/>
+          <w:sz w:val="28"/>
+          <w:szCs w:val="28"/>
+        </w:rPr>
+        <w:t>.</w:t>
       </w:r>
     </w:p>
     <w:p>
@@ -1347,532 +3292,6 @@
           <w:sz w:val="28"/>
           <w:szCs w:val="28"/>
         </w:rPr>
-        <w:t>C</w:t>
-      </w:r>
-      <w:r>
-        <w:rPr>
-          <w:rFonts w:ascii="Arial" w:hAnsi="Arial" w:cs="Arial"/>
-          <w:sz w:val="28"/>
-          <w:szCs w:val="28"/>
-        </w:rPr>
-        <w:t>3</w:t>
-      </w:r>
-      <w:r>
-        <w:rPr>
-          <w:rFonts w:ascii="Arial" w:hAnsi="Arial" w:cs="Arial"/>
-          <w:sz w:val="28"/>
-          <w:szCs w:val="28"/>
-        </w:rPr>
-        <w:t xml:space="preserve">. </w:t>
-      </w:r>
-      <w:r>
-        <w:rPr>
-          <w:rFonts w:ascii="Arial" w:hAnsi="Arial" w:cs="Arial"/>
-          <w:sz w:val="28"/>
-          <w:szCs w:val="28"/>
-        </w:rPr>
-        <w:t>Space and Time complexity using Big-O notation</w:t>
-      </w:r>
-    </w:p>
-    <w:p>
-      <w:pPr>
-        <w:spacing w:line="360" w:lineRule="auto"/>
-        <w:rPr>
-          <w:rFonts w:ascii="Arial" w:hAnsi="Arial" w:cs="Arial"/>
-          <w:sz w:val="28"/>
-          <w:szCs w:val="28"/>
-        </w:rPr>
-      </w:pPr>
-      <w:r>
-        <w:rPr>
-          <w:rFonts w:ascii="Arial" w:hAnsi="Arial" w:cs="Arial"/>
-          <w:sz w:val="28"/>
-          <w:szCs w:val="28"/>
-        </w:rPr>
-        <w:t>Evaluate the space-time complexity of each major segment of the program and the entire program using big-O notation.</w:t>
-      </w:r>
-    </w:p>
-    <w:p/>
-    <w:p>
-      <w:pPr>
-        <w:pStyle w:val="Heading1"/>
-        <w:spacing w:line="360" w:lineRule="auto"/>
-        <w:rPr>
-          <w:rFonts w:ascii="Arial" w:hAnsi="Arial" w:cs="Arial"/>
-          <w:sz w:val="28"/>
-          <w:szCs w:val="28"/>
-        </w:rPr>
-      </w:pPr>
-      <w:r>
-        <w:rPr>
-          <w:rFonts w:ascii="Arial" w:hAnsi="Arial" w:cs="Arial"/>
-          <w:sz w:val="28"/>
-          <w:szCs w:val="28"/>
-        </w:rPr>
-        <w:t>C4. Scalability and Adaptability</w:t>
-      </w:r>
-    </w:p>
-    <w:p>
-      <w:pPr>
-        <w:spacing w:line="360" w:lineRule="auto"/>
-        <w:rPr>
-          <w:rFonts w:ascii="Arial" w:hAnsi="Arial" w:cs="Arial"/>
-          <w:sz w:val="28"/>
-          <w:szCs w:val="28"/>
-        </w:rPr>
-      </w:pPr>
-      <w:r>
-        <w:rPr>
-          <w:rFonts w:ascii="Arial" w:hAnsi="Arial" w:cs="Arial"/>
-          <w:sz w:val="28"/>
-          <w:szCs w:val="28"/>
-        </w:rPr>
-        <w:t>Explain the capability of your solution to scale and adapt to a growing number of packages.</w:t>
-      </w:r>
-    </w:p>
-    <w:p>
-      <w:pPr>
-        <w:pStyle w:val="Heading1"/>
-        <w:spacing w:line="360" w:lineRule="auto"/>
-        <w:rPr>
-          <w:rFonts w:ascii="Arial" w:hAnsi="Arial" w:cs="Arial"/>
-          <w:sz w:val="28"/>
-          <w:szCs w:val="28"/>
-        </w:rPr>
-      </w:pPr>
-      <w:r>
-        <w:rPr>
-          <w:rFonts w:ascii="Arial" w:hAnsi="Arial" w:cs="Arial"/>
-          <w:sz w:val="28"/>
-          <w:szCs w:val="28"/>
-        </w:rPr>
-        <w:t xml:space="preserve">C5. Software Efficiency and Maintainability </w:t>
-      </w:r>
-    </w:p>
-    <w:p>
-      <w:pPr>
-        <w:spacing w:line="360" w:lineRule="auto"/>
-        <w:rPr>
-          <w:rFonts w:ascii="Arial" w:hAnsi="Arial" w:cs="Arial"/>
-          <w:sz w:val="28"/>
-          <w:szCs w:val="28"/>
-        </w:rPr>
-      </w:pPr>
-      <w:r>
-        <w:rPr>
-          <w:rFonts w:ascii="Arial" w:hAnsi="Arial" w:cs="Arial"/>
-          <w:sz w:val="28"/>
-          <w:szCs w:val="28"/>
-        </w:rPr>
-        <w:t>Discuss why the software design would be efficient and easy to maintain.</w:t>
-      </w:r>
-    </w:p>
-    <w:p>
-      <w:pPr>
-        <w:pStyle w:val="Heading1"/>
-        <w:spacing w:line="360" w:lineRule="auto"/>
-        <w:rPr>
-          <w:rFonts w:ascii="Arial" w:hAnsi="Arial" w:cs="Arial"/>
-          <w:sz w:val="28"/>
-          <w:szCs w:val="28"/>
-        </w:rPr>
-      </w:pPr>
-      <w:r>
-        <w:rPr>
-          <w:rFonts w:ascii="Arial" w:hAnsi="Arial" w:cs="Arial"/>
-          <w:sz w:val="28"/>
-          <w:szCs w:val="28"/>
-        </w:rPr>
-        <w:t xml:space="preserve">C6. Self-Adjusting Data Structures </w:t>
-      </w:r>
-    </w:p>
-    <w:p>
-      <w:pPr>
-        <w:spacing w:line="360" w:lineRule="auto"/>
-        <w:rPr>
-          <w:rFonts w:ascii="Arial" w:hAnsi="Arial" w:cs="Arial"/>
-          <w:sz w:val="28"/>
-          <w:szCs w:val="28"/>
-        </w:rPr>
-      </w:pPr>
-      <w:r>
-        <w:rPr>
-          <w:rFonts w:ascii="Arial" w:hAnsi="Arial" w:cs="Arial"/>
-          <w:sz w:val="28"/>
-          <w:szCs w:val="28"/>
-        </w:rPr>
-        <w:t xml:space="preserve">The versatility of using various data types as the assigned key in a hash table instead of only an integer can be considered a strength. </w:t>
-      </w:r>
-      <w:r>
-        <w:rPr>
-          <w:rFonts w:ascii="Arial" w:hAnsi="Arial" w:cs="Arial"/>
-          <w:sz w:val="28"/>
-          <w:szCs w:val="28"/>
-        </w:rPr>
-        <w:t xml:space="preserve">A name, email, or other information can be used as a key to directly link to </w:t>
-      </w:r>
-      <w:r>
-        <w:rPr>
-          <w:rFonts w:ascii="Arial" w:hAnsi="Arial" w:cs="Arial"/>
-          <w:sz w:val="28"/>
-          <w:szCs w:val="28"/>
-        </w:rPr>
-        <w:t xml:space="preserve">its value pair. </w:t>
-      </w:r>
-      <w:r>
-        <w:rPr>
-          <w:rFonts w:ascii="Arial" w:hAnsi="Arial" w:cs="Arial"/>
-          <w:sz w:val="28"/>
-          <w:szCs w:val="28"/>
-        </w:rPr>
-        <w:t>A</w:t>
-      </w:r>
-      <w:r>
-        <w:rPr>
-          <w:rFonts w:ascii="Arial" w:hAnsi="Arial" w:cs="Arial"/>
-          <w:sz w:val="28"/>
-          <w:szCs w:val="28"/>
-        </w:rPr>
-        <w:t>nother</w:t>
-      </w:r>
-      <w:r>
-        <w:rPr>
-          <w:rFonts w:ascii="Arial" w:hAnsi="Arial" w:cs="Arial"/>
-          <w:sz w:val="28"/>
-          <w:szCs w:val="28"/>
-        </w:rPr>
-        <w:t xml:space="preserve"> strength</w:t>
-      </w:r>
-      <w:r>
-        <w:rPr>
-          <w:rFonts w:ascii="Arial" w:hAnsi="Arial" w:cs="Arial"/>
-          <w:sz w:val="28"/>
-          <w:szCs w:val="28"/>
-        </w:rPr>
-        <w:t xml:space="preserve"> of using a hash table</w:t>
-      </w:r>
-      <w:r>
-        <w:rPr>
-          <w:rFonts w:ascii="Arial" w:hAnsi="Arial" w:cs="Arial"/>
-          <w:sz w:val="28"/>
-          <w:szCs w:val="28"/>
-        </w:rPr>
-        <w:t xml:space="preserve"> as a self-adjusting data structure is the efficiency of </w:t>
-      </w:r>
-      <w:r>
-        <w:rPr>
-          <w:rFonts w:ascii="Arial" w:hAnsi="Arial" w:cs="Arial"/>
-          <w:sz w:val="28"/>
-          <w:szCs w:val="28"/>
-        </w:rPr>
-        <w:t>changing/removing elements</w:t>
-      </w:r>
-      <w:r>
-        <w:rPr>
-          <w:rFonts w:ascii="Arial" w:hAnsi="Arial" w:cs="Arial"/>
-          <w:sz w:val="28"/>
-          <w:szCs w:val="28"/>
-        </w:rPr>
-        <w:t xml:space="preserve">. The time complexity of </w:t>
-      </w:r>
-      <w:r>
-        <w:rPr>
-          <w:rFonts w:ascii="Arial" w:hAnsi="Arial" w:cs="Arial"/>
-          <w:sz w:val="28"/>
-          <w:szCs w:val="28"/>
-        </w:rPr>
-        <w:t xml:space="preserve">searching, </w:t>
-      </w:r>
-      <w:r>
-        <w:rPr>
-          <w:rFonts w:ascii="Arial" w:hAnsi="Arial" w:cs="Arial"/>
-          <w:sz w:val="28"/>
-          <w:szCs w:val="28"/>
-        </w:rPr>
-        <w:t xml:space="preserve">adding, </w:t>
-      </w:r>
-      <w:r>
-        <w:rPr>
-          <w:rFonts w:ascii="Arial" w:hAnsi="Arial" w:cs="Arial"/>
-          <w:sz w:val="28"/>
-          <w:szCs w:val="28"/>
-        </w:rPr>
-        <w:t>modifying</w:t>
-      </w:r>
-      <w:r>
-        <w:rPr>
-          <w:rFonts w:ascii="Arial" w:hAnsi="Arial" w:cs="Arial"/>
-          <w:sz w:val="28"/>
-          <w:szCs w:val="28"/>
-        </w:rPr>
-        <w:t>,</w:t>
-      </w:r>
-      <w:r>
-        <w:rPr>
-          <w:rFonts w:ascii="Arial" w:hAnsi="Arial" w:cs="Arial"/>
-          <w:sz w:val="28"/>
-          <w:szCs w:val="28"/>
-        </w:rPr>
-        <w:t xml:space="preserve"> or removing</w:t>
-      </w:r>
-      <w:r>
-        <w:rPr>
-          <w:rFonts w:ascii="Arial" w:hAnsi="Arial" w:cs="Arial"/>
-          <w:sz w:val="28"/>
-          <w:szCs w:val="28"/>
-        </w:rPr>
-        <w:t xml:space="preserve"> a value is </w:t>
-      </w:r>
-      <w:r>
-        <w:rPr>
-          <w:rFonts w:ascii="Arial" w:hAnsi="Arial" w:cs="Arial"/>
-          <w:sz w:val="28"/>
-          <w:szCs w:val="28"/>
-        </w:rPr>
-        <w:t xml:space="preserve">on </w:t>
-      </w:r>
-      <w:r>
-        <w:rPr>
-          <w:rFonts w:ascii="Arial" w:hAnsi="Arial" w:cs="Arial"/>
-          <w:sz w:val="28"/>
-          <w:szCs w:val="28"/>
-        </w:rPr>
-        <w:t xml:space="preserve">average </w:t>
-      </w:r>
-      <w:r>
-        <w:rPr>
-          <w:rFonts w:ascii="Arial" w:hAnsi="Arial" w:cs="Arial"/>
-          <w:sz w:val="28"/>
-          <w:szCs w:val="28"/>
-        </w:rPr>
-        <w:t>O(1)</w:t>
-      </w:r>
-      <w:r>
-        <w:rPr>
-          <w:rFonts w:ascii="Arial" w:hAnsi="Arial" w:cs="Arial"/>
-          <w:sz w:val="28"/>
-          <w:szCs w:val="28"/>
-        </w:rPr>
-        <w:t xml:space="preserve">. </w:t>
-      </w:r>
-      <w:r>
-        <w:rPr>
-          <w:rFonts w:ascii="Arial" w:hAnsi="Arial" w:cs="Arial"/>
-          <w:sz w:val="28"/>
-          <w:szCs w:val="28"/>
-        </w:rPr>
-        <w:t>However</w:t>
-      </w:r>
-      <w:r>
-        <w:rPr>
-          <w:rFonts w:ascii="Arial" w:hAnsi="Arial" w:cs="Arial"/>
-          <w:sz w:val="28"/>
-          <w:szCs w:val="28"/>
-        </w:rPr>
-        <w:t xml:space="preserve">, the </w:t>
-      </w:r>
-      <w:r>
-        <w:rPr>
-          <w:rFonts w:ascii="Arial" w:hAnsi="Arial" w:cs="Arial"/>
-          <w:sz w:val="28"/>
-          <w:szCs w:val="28"/>
-        </w:rPr>
-        <w:t xml:space="preserve">time complexity can reach linear O(n) time </w:t>
-      </w:r>
-      <w:r>
-        <w:rPr>
-          <w:rFonts w:ascii="Arial" w:hAnsi="Arial" w:cs="Arial"/>
-          <w:sz w:val="28"/>
-          <w:szCs w:val="28"/>
-        </w:rPr>
-        <w:t xml:space="preserve">depending on the </w:t>
-      </w:r>
-      <w:r>
-        <w:rPr>
-          <w:rFonts w:ascii="Arial" w:hAnsi="Arial" w:cs="Arial"/>
-          <w:sz w:val="28"/>
-          <w:szCs w:val="28"/>
-        </w:rPr>
-        <w:t>number</w:t>
-      </w:r>
-      <w:r>
-        <w:rPr>
-          <w:rFonts w:ascii="Arial" w:hAnsi="Arial" w:cs="Arial"/>
-          <w:sz w:val="28"/>
-          <w:szCs w:val="28"/>
-        </w:rPr>
-        <w:t xml:space="preserve"> of collisions, or </w:t>
-      </w:r>
-      <w:r>
-        <w:rPr>
-          <w:rFonts w:ascii="Arial" w:hAnsi="Arial" w:cs="Arial"/>
-          <w:sz w:val="28"/>
-          <w:szCs w:val="28"/>
-        </w:rPr>
-        <w:t>elements in the same bucket</w:t>
-      </w:r>
-      <w:r>
-        <w:rPr>
-          <w:rFonts w:ascii="Arial" w:hAnsi="Arial" w:cs="Arial"/>
-          <w:sz w:val="28"/>
-          <w:szCs w:val="28"/>
-        </w:rPr>
-        <w:t xml:space="preserve">, </w:t>
-      </w:r>
-      <w:r>
-        <w:rPr>
-          <w:rFonts w:ascii="Arial" w:hAnsi="Arial" w:cs="Arial"/>
-          <w:sz w:val="28"/>
-          <w:szCs w:val="28"/>
-        </w:rPr>
-        <w:lastRenderedPageBreak/>
-        <w:t>which ca</w:t>
-      </w:r>
-      <w:r>
-        <w:rPr>
-          <w:rFonts w:ascii="Arial" w:hAnsi="Arial" w:cs="Arial"/>
-          <w:sz w:val="28"/>
-          <w:szCs w:val="28"/>
-        </w:rPr>
-        <w:t>n</w:t>
-      </w:r>
-      <w:r>
-        <w:rPr>
-          <w:rFonts w:ascii="Arial" w:hAnsi="Arial" w:cs="Arial"/>
-          <w:sz w:val="28"/>
-          <w:szCs w:val="28"/>
-        </w:rPr>
-        <w:t xml:space="preserve"> be a weakness</w:t>
-      </w:r>
-      <w:r>
-        <w:rPr>
-          <w:rFonts w:ascii="Arial" w:hAnsi="Arial" w:cs="Arial"/>
-          <w:sz w:val="28"/>
-          <w:szCs w:val="28"/>
-        </w:rPr>
-        <w:t xml:space="preserve"> in a poorly designed system</w:t>
-      </w:r>
-      <w:r>
-        <w:rPr>
-          <w:rFonts w:ascii="Arial" w:hAnsi="Arial" w:cs="Arial"/>
-          <w:sz w:val="28"/>
-          <w:szCs w:val="28"/>
-        </w:rPr>
-        <w:t>.</w:t>
-      </w:r>
-      <w:r>
-        <w:rPr>
-          <w:rFonts w:ascii="Arial" w:hAnsi="Arial" w:cs="Arial"/>
-          <w:sz w:val="28"/>
-          <w:szCs w:val="28"/>
-        </w:rPr>
-        <w:t xml:space="preserve"> Another weakness of a hash table/hash map could be the load factor</w:t>
-      </w:r>
-      <w:r>
-        <w:rPr>
-          <w:rFonts w:ascii="Arial" w:hAnsi="Arial" w:cs="Arial"/>
-          <w:sz w:val="28"/>
-          <w:szCs w:val="28"/>
-        </w:rPr>
-        <w:t xml:space="preserve"> and unused allocated memory. A hash table m</w:t>
-      </w:r>
-      <w:r>
-        <w:rPr>
-          <w:rFonts w:ascii="Arial" w:hAnsi="Arial" w:cs="Arial"/>
-          <w:sz w:val="28"/>
-          <w:szCs w:val="28"/>
-        </w:rPr>
-        <w:t xml:space="preserve">ight not </w:t>
-      </w:r>
-      <w:r>
-        <w:rPr>
-          <w:rFonts w:ascii="Arial" w:hAnsi="Arial" w:cs="Arial"/>
-          <w:sz w:val="28"/>
-          <w:szCs w:val="28"/>
-        </w:rPr>
-        <w:t>fill</w:t>
-      </w:r>
-      <w:r>
-        <w:rPr>
-          <w:rFonts w:ascii="Arial" w:hAnsi="Arial" w:cs="Arial"/>
-          <w:sz w:val="28"/>
-          <w:szCs w:val="28"/>
-        </w:rPr>
-        <w:t xml:space="preserve"> every single bucket</w:t>
-      </w:r>
-      <w:r>
-        <w:rPr>
-          <w:rFonts w:ascii="Arial" w:hAnsi="Arial" w:cs="Arial"/>
-          <w:sz w:val="28"/>
-          <w:szCs w:val="28"/>
-        </w:rPr>
-        <w:t xml:space="preserve"> with elements</w:t>
-      </w:r>
-      <w:r>
-        <w:rPr>
-          <w:rFonts w:ascii="Arial" w:hAnsi="Arial" w:cs="Arial"/>
-          <w:sz w:val="28"/>
-          <w:szCs w:val="28"/>
-        </w:rPr>
-        <w:t xml:space="preserve">, </w:t>
-      </w:r>
-      <w:r>
-        <w:rPr>
-          <w:rFonts w:ascii="Arial" w:hAnsi="Arial" w:cs="Arial"/>
-          <w:sz w:val="28"/>
-          <w:szCs w:val="28"/>
-        </w:rPr>
-        <w:t>wasting</w:t>
-      </w:r>
-      <w:r>
-        <w:rPr>
-          <w:rFonts w:ascii="Arial" w:hAnsi="Arial" w:cs="Arial"/>
-          <w:sz w:val="28"/>
-          <w:szCs w:val="28"/>
-        </w:rPr>
-        <w:t xml:space="preserve"> memory. The hash table may also need to reallocate</w:t>
-      </w:r>
-      <w:r>
-        <w:rPr>
-          <w:rFonts w:ascii="Arial" w:hAnsi="Arial" w:cs="Arial"/>
-          <w:sz w:val="28"/>
-          <w:szCs w:val="28"/>
-        </w:rPr>
-        <w:t xml:space="preserve"> to a new array if the load factor is exceeded, requiring every element in the array to be rehashed</w:t>
-      </w:r>
-      <w:r>
-        <w:rPr>
-          <w:rFonts w:ascii="Arial" w:hAnsi="Arial" w:cs="Arial"/>
-          <w:sz w:val="28"/>
-          <w:szCs w:val="28"/>
-        </w:rPr>
-        <w:t>/reindexed</w:t>
-      </w:r>
-      <w:r>
-        <w:rPr>
-          <w:rFonts w:ascii="Arial" w:hAnsi="Arial" w:cs="Arial"/>
-          <w:sz w:val="28"/>
-          <w:szCs w:val="28"/>
-        </w:rPr>
-        <w:t>.</w:t>
-      </w:r>
-    </w:p>
-    <w:p>
-      <w:pPr>
-        <w:pStyle w:val="Heading1"/>
-        <w:spacing w:line="360" w:lineRule="auto"/>
-        <w:rPr>
-          <w:rFonts w:ascii="Arial" w:hAnsi="Arial" w:cs="Arial"/>
-          <w:sz w:val="28"/>
-          <w:szCs w:val="28"/>
-        </w:rPr>
-      </w:pPr>
-      <w:r>
-        <w:rPr>
-          <w:rFonts w:ascii="Arial" w:hAnsi="Arial" w:cs="Arial"/>
-          <w:sz w:val="28"/>
-          <w:szCs w:val="28"/>
-        </w:rPr>
         <w:t>C7. Data Key</w:t>
       </w:r>
     </w:p>
@@ -1899,157 +3318,15 @@
           <w:sz w:val="28"/>
           <w:szCs w:val="28"/>
         </w:rPr>
-        <w:t xml:space="preserve"> the key for the package data components. The IDs could utilize a modulo function to sort each ID number into a bucket based on its remainder.</w:t>
-      </w:r>
-      <w:r>
-        <w:rPr>
-          <w:rFonts w:ascii="Arial" w:hAnsi="Arial" w:cs="Arial"/>
-          <w:sz w:val="28"/>
-          <w:szCs w:val="28"/>
-        </w:rPr>
-        <w:t xml:space="preserve"> This allows for a hash table of up to 100 elements, more than enough for the 40 required packages.</w:t>
-      </w:r>
-      <w:r>
-        <w:rPr>
-          <w:rFonts w:ascii="Arial" w:hAnsi="Arial" w:cs="Arial"/>
-          <w:sz w:val="28"/>
-          <w:szCs w:val="28"/>
-        </w:rPr>
-        <w:t xml:space="preserve"> </w:t>
-      </w:r>
-    </w:p>
-    <w:p>
-      <w:pPr>
-        <w:pStyle w:val="Heading1"/>
-        <w:spacing w:line="360" w:lineRule="auto"/>
-        <w:rPr>
-          <w:rFonts w:ascii="Arial" w:hAnsi="Arial" w:cs="Arial"/>
-          <w:sz w:val="28"/>
-          <w:szCs w:val="28"/>
-        </w:rPr>
-      </w:pPr>
-      <w:r>
-        <w:rPr>
-          <w:rFonts w:ascii="Arial" w:hAnsi="Arial" w:cs="Arial"/>
-          <w:sz w:val="28"/>
-          <w:szCs w:val="28"/>
-        </w:rPr>
-        <w:t>D. Sources</w:t>
-      </w:r>
-    </w:p>
-    <w:p>
-      <w:pPr>
-        <w:spacing w:line="360" w:lineRule="auto"/>
-        <w:rPr>
-          <w:rFonts w:ascii="Arial" w:hAnsi="Arial" w:cs="Arial"/>
-          <w:sz w:val="28"/>
-          <w:szCs w:val="28"/>
-        </w:rPr>
-      </w:pPr>
-      <w:r>
-        <w:rPr>
-          <w:rFonts w:ascii="Arial" w:hAnsi="Arial" w:cs="Arial"/>
-          <w:sz w:val="28"/>
-          <w:szCs w:val="28"/>
-        </w:rPr>
-        <w:t>Acknowledge sources, using in-text citations and references, for content that is quoted, paraphrased, or summarized.</w:t>
-      </w:r>
-    </w:p>
-    <w:p>
-      <w:pPr>
-        <w:spacing w:line="360" w:lineRule="auto"/>
-        <w:rPr>
-          <w:rFonts w:ascii="Arial" w:hAnsi="Arial" w:cs="Arial"/>
-          <w:sz w:val="28"/>
-          <w:szCs w:val="28"/>
-        </w:rPr>
-      </w:pPr>
-      <w:r>
-        <w:rPr>
-          <w:rFonts w:ascii="Arial" w:hAnsi="Arial" w:cs="Arial"/>
-          <w:sz w:val="28"/>
-          <w:szCs w:val="28"/>
-        </w:rPr>
-        <w:t>SOURCES: w3 schools hash table, graph, DSA time complexity</w:t>
-      </w:r>
-    </w:p>
-    <w:p>
-      <w:pPr>
-        <w:spacing w:line="360" w:lineRule="auto"/>
-        <w:rPr>
-          <w:rFonts w:ascii="Arial" w:hAnsi="Arial" w:cs="Arial"/>
-          <w:sz w:val="28"/>
-          <w:szCs w:val="28"/>
-        </w:rPr>
-      </w:pPr>
-      <w:r>
-        <w:rPr>
-          <w:rFonts w:ascii="Arial" w:hAnsi="Arial" w:cs="Arial"/>
-          <w:sz w:val="28"/>
-          <w:szCs w:val="28"/>
-        </w:rPr>
-        <w:t>YouTube video for graph/BFS DFS SPAs</w:t>
-      </w:r>
-    </w:p>
-    <w:p>
-      <w:pPr>
-        <w:spacing w:line="360" w:lineRule="auto"/>
-        <w:rPr>
-          <w:rFonts w:ascii="Arial" w:hAnsi="Arial" w:cs="Arial"/>
-          <w:sz w:val="28"/>
-          <w:szCs w:val="28"/>
-        </w:rPr>
-      </w:pPr>
-      <w:r>
-        <w:rPr>
-          <w:rFonts w:ascii="Arial" w:hAnsi="Arial" w:cs="Arial"/>
-          <w:sz w:val="28"/>
-          <w:szCs w:val="28"/>
-        </w:rPr>
-        <w:t>An example:</w:t>
-      </w:r>
-      <w:r>
-        <w:rPr>
-          <w:rFonts w:ascii="Arial" w:hAnsi="Arial" w:cs="Arial"/>
-          <w:sz w:val="28"/>
-          <w:szCs w:val="28"/>
-        </w:rPr>
-        <w:t xml:space="preserve"> (this is APA 7</w:t>
-      </w:r>
-      <w:r>
-        <w:rPr>
-          <w:rFonts w:ascii="Arial" w:hAnsi="Arial" w:cs="Arial"/>
-          <w:sz w:val="28"/>
-          <w:szCs w:val="28"/>
-          <w:vertAlign w:val="superscript"/>
-        </w:rPr>
-        <w:t>th</w:t>
-      </w:r>
-      <w:r>
-        <w:rPr>
-          <w:rFonts w:ascii="Arial" w:hAnsi="Arial" w:cs="Arial"/>
-          <w:sz w:val="28"/>
-          <w:szCs w:val="28"/>
-        </w:rPr>
-        <w:t xml:space="preserve"> edition but requirements may be different)</w:t>
-      </w:r>
-    </w:p>
-    <w:p>
-      <w:pPr>
-        <w:spacing w:line="360" w:lineRule="auto"/>
-        <w:rPr>
-          <w:rFonts w:ascii="Arial" w:hAnsi="Arial" w:cs="Arial"/>
-          <w:sz w:val="28"/>
-          <w:szCs w:val="28"/>
-        </w:rPr>
-      </w:pPr>
-      <w:r>
-        <w:rPr>
-          <w:rFonts w:ascii="Arial" w:hAnsi="Arial" w:cs="Arial"/>
-          <w:sz w:val="28"/>
-          <w:szCs w:val="28"/>
-        </w:rPr>
-        <w:t xml:space="preserve">Lysecky, R., &amp; Vahid, F. (2018, June). </w:t>
+        <w:t xml:space="preserve"> the key for the package data components</w:t>
+      </w:r>
+      <w:r>
+        <w:rPr>
+          <w:rFonts w:ascii="Arial" w:hAnsi="Arial" w:cs="Arial"/>
+          <w:sz w:val="28"/>
+          <w:szCs w:val="28"/>
+        </w:rPr>
+        <w:t xml:space="preserve">, as each package has a </w:t>
       </w:r>
       <w:r>
         <w:rPr>
@@ -2059,6 +3336,320 @@
           <w:sz w:val="28"/>
           <w:szCs w:val="28"/>
         </w:rPr>
+        <w:t>unique</w:t>
+      </w:r>
+      <w:r>
+        <w:rPr>
+          <w:rFonts w:ascii="Arial" w:hAnsi="Arial" w:cs="Arial"/>
+          <w:sz w:val="28"/>
+          <w:szCs w:val="28"/>
+        </w:rPr>
+        <w:t xml:space="preserve"> ID</w:t>
+      </w:r>
+      <w:r>
+        <w:rPr>
+          <w:rFonts w:ascii="Arial" w:hAnsi="Arial" w:cs="Arial"/>
+          <w:sz w:val="28"/>
+          <w:szCs w:val="28"/>
+        </w:rPr>
+        <w:t xml:space="preserve">. The IDs could utilize a modulo function </w:t>
+      </w:r>
+      <w:r>
+        <w:rPr>
+          <w:rFonts w:ascii="Arial" w:hAnsi="Arial" w:cs="Arial"/>
+          <w:sz w:val="28"/>
+          <w:szCs w:val="28"/>
+        </w:rPr>
+        <w:lastRenderedPageBreak/>
+        <w:t xml:space="preserve">to sort each </w:t>
+      </w:r>
+      <w:r>
+        <w:rPr>
+          <w:rFonts w:ascii="Arial" w:hAnsi="Arial" w:cs="Arial"/>
+          <w:sz w:val="28"/>
+          <w:szCs w:val="28"/>
+        </w:rPr>
+        <w:t>package</w:t>
+      </w:r>
+      <w:r>
+        <w:rPr>
+          <w:rFonts w:ascii="Arial" w:hAnsi="Arial" w:cs="Arial"/>
+          <w:sz w:val="28"/>
+          <w:szCs w:val="28"/>
+        </w:rPr>
+        <w:t xml:space="preserve"> into a bucket based on its remainder.</w:t>
+      </w:r>
+      <w:r>
+        <w:rPr>
+          <w:rFonts w:ascii="Arial" w:hAnsi="Arial" w:cs="Arial"/>
+          <w:sz w:val="28"/>
+          <w:szCs w:val="28"/>
+        </w:rPr>
+        <w:t xml:space="preserve"> </w:t>
+      </w:r>
+      <w:r>
+        <w:rPr>
+          <w:rFonts w:ascii="Arial" w:hAnsi="Arial" w:cs="Arial"/>
+          <w:sz w:val="28"/>
+          <w:szCs w:val="28"/>
+        </w:rPr>
+        <w:t xml:space="preserve">With 10 buckets available, there is </w:t>
+      </w:r>
+      <w:r>
+        <w:rPr>
+          <w:rFonts w:ascii="Arial" w:hAnsi="Arial" w:cs="Arial"/>
+          <w:sz w:val="28"/>
+          <w:szCs w:val="28"/>
+        </w:rPr>
+        <w:t xml:space="preserve">more than enough </w:t>
+      </w:r>
+      <w:r>
+        <w:rPr>
+          <w:rFonts w:ascii="Arial" w:hAnsi="Arial" w:cs="Arial"/>
+          <w:sz w:val="28"/>
+          <w:szCs w:val="28"/>
+        </w:rPr>
+        <w:t>space f</w:t>
+      </w:r>
+      <w:r>
+        <w:rPr>
+          <w:rFonts w:ascii="Arial" w:hAnsi="Arial" w:cs="Arial"/>
+          <w:sz w:val="28"/>
+          <w:szCs w:val="28"/>
+        </w:rPr>
+        <w:t>or the 40 required packages.</w:t>
+      </w:r>
+      <w:r>
+        <w:rPr>
+          <w:rFonts w:ascii="Arial" w:hAnsi="Arial" w:cs="Arial"/>
+          <w:sz w:val="28"/>
+          <w:szCs w:val="28"/>
+        </w:rPr>
+        <w:t xml:space="preserve"> </w:t>
+      </w:r>
+    </w:p>
+    <w:p>
+      <w:pPr>
+        <w:pStyle w:val="Heading1"/>
+        <w:spacing w:line="360" w:lineRule="auto"/>
+        <w:rPr>
+          <w:rFonts w:ascii="Arial" w:hAnsi="Arial" w:cs="Arial"/>
+          <w:sz w:val="28"/>
+          <w:szCs w:val="28"/>
+        </w:rPr>
+      </w:pPr>
+      <w:r>
+        <w:rPr>
+          <w:rFonts w:ascii="Arial" w:hAnsi="Arial" w:cs="Arial"/>
+          <w:sz w:val="28"/>
+          <w:szCs w:val="28"/>
+        </w:rPr>
+        <w:t>D. Sources</w:t>
+      </w:r>
+    </w:p>
+    <w:p>
+      <w:pPr>
+        <w:spacing w:line="360" w:lineRule="auto"/>
+        <w:rPr>
+          <w:rFonts w:ascii="Arial" w:hAnsi="Arial" w:cs="Arial"/>
+          <w:sz w:val="28"/>
+          <w:szCs w:val="28"/>
+        </w:rPr>
+      </w:pPr>
+      <w:r>
+        <w:rPr>
+          <w:rFonts w:ascii="Arial" w:hAnsi="Arial" w:cs="Arial"/>
+          <w:sz w:val="28"/>
+          <w:szCs w:val="28"/>
+        </w:rPr>
+        <w:t xml:space="preserve">Traveling Salesman Problem Visualizer. (n.d.). </w:t>
+      </w:r>
+      <w:r>
+        <w:rPr>
+          <w:rFonts w:ascii="Arial" w:hAnsi="Arial" w:cs="Arial"/>
+          <w:i/>
+          <w:iCs/>
+          <w:sz w:val="28"/>
+          <w:szCs w:val="28"/>
+        </w:rPr>
+        <w:t>Traveling salesman problem</w:t>
+      </w:r>
+      <w:r>
+        <w:rPr>
+          <w:rFonts w:ascii="Arial" w:hAnsi="Arial" w:cs="Arial"/>
+          <w:sz w:val="28"/>
+          <w:szCs w:val="28"/>
+        </w:rPr>
+        <w:t xml:space="preserve">. </w:t>
+      </w:r>
+      <w:hyperlink r:id="rId7" w:tgtFrame="_new" w:history="1">
+        <w:r>
+          <w:rPr>
+            <w:rStyle w:val="Hyperlink"/>
+            <w:rFonts w:ascii="Arial" w:hAnsi="Arial" w:cs="Arial"/>
+            <w:sz w:val="28"/>
+            <w:szCs w:val="28"/>
+          </w:rPr>
+          <w:t>https://tspvis.com/</w:t>
+        </w:r>
+      </w:hyperlink>
+      <w:r>
+        <w:rPr>
+          <w:rFonts w:ascii="Arial" w:hAnsi="Arial" w:cs="Arial"/>
+          <w:sz w:val="28"/>
+          <w:szCs w:val="28"/>
+        </w:rPr>
+        <w:t xml:space="preserve"> </w:t>
+      </w:r>
+    </w:p>
+    <w:p>
+      <w:pPr>
+        <w:spacing w:line="360" w:lineRule="auto"/>
+        <w:rPr>
+          <w:rFonts w:ascii="Arial" w:hAnsi="Arial" w:cs="Arial"/>
+          <w:sz w:val="28"/>
+          <w:szCs w:val="28"/>
+        </w:rPr>
+      </w:pPr>
+    </w:p>
+    <w:p>
+      <w:pPr>
+        <w:spacing w:line="360" w:lineRule="auto"/>
+        <w:rPr>
+          <w:rFonts w:ascii="Arial" w:hAnsi="Arial" w:cs="Arial"/>
+          <w:sz w:val="28"/>
+          <w:szCs w:val="28"/>
+        </w:rPr>
+      </w:pPr>
+      <w:r>
+        <w:rPr>
+          <w:rFonts w:ascii="Arial" w:hAnsi="Arial" w:cs="Arial"/>
+          <w:sz w:val="28"/>
+          <w:szCs w:val="28"/>
+        </w:rPr>
+        <w:t xml:space="preserve">W3Schools. (n.d.). </w:t>
+      </w:r>
+      <w:r>
+        <w:rPr>
+          <w:rFonts w:ascii="Arial" w:hAnsi="Arial" w:cs="Arial"/>
+          <w:i/>
+          <w:iCs/>
+          <w:sz w:val="28"/>
+          <w:szCs w:val="28"/>
+        </w:rPr>
+        <w:t>Data structures: Hash maps</w:t>
+      </w:r>
+      <w:r>
+        <w:rPr>
+          <w:rFonts w:ascii="Arial" w:hAnsi="Arial" w:cs="Arial"/>
+          <w:sz w:val="28"/>
+          <w:szCs w:val="28"/>
+        </w:rPr>
+        <w:t xml:space="preserve">. </w:t>
+      </w:r>
+      <w:hyperlink r:id="rId8" w:tgtFrame="_new" w:history="1">
+        <w:r>
+          <w:rPr>
+            <w:rStyle w:val="Hyperlink"/>
+            <w:rFonts w:ascii="Arial" w:hAnsi="Arial" w:cs="Arial"/>
+            <w:sz w:val="28"/>
+            <w:szCs w:val="28"/>
+          </w:rPr>
+          <w:t>https://www.w3schools.com/dsa/dsa_data_hashmaps.php</w:t>
+        </w:r>
+      </w:hyperlink>
+    </w:p>
+    <w:p>
+      <w:pPr>
+        <w:spacing w:line="360" w:lineRule="auto"/>
+        <w:rPr>
+          <w:rFonts w:ascii="Arial" w:hAnsi="Arial" w:cs="Arial"/>
+          <w:sz w:val="28"/>
+          <w:szCs w:val="28"/>
+        </w:rPr>
+      </w:pPr>
+    </w:p>
+    <w:p>
+      <w:pPr>
+        <w:spacing w:line="360" w:lineRule="auto"/>
+        <w:rPr>
+          <w:rFonts w:ascii="Arial" w:hAnsi="Arial" w:cs="Arial"/>
+          <w:sz w:val="28"/>
+          <w:szCs w:val="28"/>
+        </w:rPr>
+      </w:pPr>
+      <w:proofErr w:type="spellStart"/>
+      <w:r>
+        <w:rPr>
+          <w:rFonts w:ascii="Arial" w:hAnsi="Arial" w:cs="Arial"/>
+          <w:sz w:val="28"/>
+          <w:szCs w:val="28"/>
+        </w:rPr>
+        <w:t>Wengrow</w:t>
+      </w:r>
+      <w:proofErr w:type="spellEnd"/>
+      <w:r>
+        <w:rPr>
+          <w:rFonts w:ascii="Arial" w:hAnsi="Arial" w:cs="Arial"/>
+          <w:sz w:val="28"/>
+          <w:szCs w:val="28"/>
+        </w:rPr>
+        <w:t xml:space="preserve">, J. (2017). </w:t>
+      </w:r>
+      <w:r>
+        <w:rPr>
+          <w:rFonts w:ascii="Arial" w:hAnsi="Arial" w:cs="Arial"/>
+          <w:i/>
+          <w:iCs/>
+          <w:sz w:val="28"/>
+          <w:szCs w:val="28"/>
+        </w:rPr>
+        <w:t>A common-sense guide to data structures and algorithms: Level up your core programming skills</w:t>
+      </w:r>
+      <w:r>
+        <w:rPr>
+          <w:rFonts w:ascii="Arial" w:hAnsi="Arial" w:cs="Arial"/>
+          <w:sz w:val="28"/>
+          <w:szCs w:val="28"/>
+        </w:rPr>
+        <w:t>. Pragmatic Bookshelf.</w:t>
+      </w:r>
+    </w:p>
+    <w:p>
+      <w:pPr>
+        <w:spacing w:line="360" w:lineRule="auto"/>
+        <w:rPr>
+          <w:rFonts w:ascii="Arial" w:hAnsi="Arial" w:cs="Arial"/>
+          <w:sz w:val="28"/>
+          <w:szCs w:val="28"/>
+        </w:rPr>
+      </w:pPr>
+    </w:p>
+    <w:p>
+      <w:pPr>
+        <w:spacing w:line="360" w:lineRule="auto"/>
+        <w:rPr>
+          <w:rFonts w:ascii="Arial" w:hAnsi="Arial" w:cs="Arial"/>
+          <w:sz w:val="28"/>
+          <w:szCs w:val="28"/>
+        </w:rPr>
+      </w:pPr>
+      <w:r>
+        <w:rPr>
+          <w:rFonts w:ascii="Arial" w:hAnsi="Arial" w:cs="Arial"/>
+          <w:sz w:val="28"/>
+          <w:szCs w:val="28"/>
+        </w:rPr>
+        <w:t xml:space="preserve">Lysecky, R., &amp; Vahid, F. (2018, June). </w:t>
+      </w:r>
+      <w:r>
+        <w:rPr>
+          <w:rFonts w:ascii="Arial" w:hAnsi="Arial" w:cs="Arial"/>
+          <w:i/>
+          <w:iCs/>
+          <w:sz w:val="28"/>
+          <w:szCs w:val="28"/>
+        </w:rPr>
         <w:t>C950: Data Structures and Algorithms II</w:t>
       </w:r>
       <w:r>
@@ -2067,20 +3658,31 @@
           <w:sz w:val="28"/>
           <w:szCs w:val="28"/>
         </w:rPr>
-        <w:t>. zyBooks.</w:t>
+        <w:t xml:space="preserve">. </w:t>
+      </w:r>
+      <w:proofErr w:type="spellStart"/>
+      <w:r>
+        <w:rPr>
+          <w:rFonts w:ascii="Arial" w:hAnsi="Arial" w:cs="Arial"/>
+          <w:sz w:val="28"/>
+          <w:szCs w:val="28"/>
+        </w:rPr>
+        <w:t>zyBooks</w:t>
+      </w:r>
+      <w:proofErr w:type="spellEnd"/>
+      <w:r>
+        <w:rPr>
+          <w:rFonts w:ascii="Arial" w:hAnsi="Arial" w:cs="Arial"/>
+          <w:sz w:val="28"/>
+          <w:szCs w:val="28"/>
+        </w:rPr>
+        <w:t>.</w:t>
       </w:r>
     </w:p>
     <w:p>
       <w:pPr>
         <w:spacing w:line="360" w:lineRule="auto"/>
         <w:ind w:left="360" w:firstLine="360"/>
-        <w:rPr>
-          <w:rFonts w:ascii="Arial" w:hAnsi="Arial" w:cs="Arial"/>
-          <w:b/>
-          <w:bCs/>
-          <w:sz w:val="28"/>
-          <w:szCs w:val="28"/>
-        </w:rPr>
       </w:pPr>
       <w:r>
         <w:rPr>
@@ -2090,7 +3692,7 @@
         </w:rPr>
         <w:t xml:space="preserve">Retrieved March 22, 2021, from  </w:t>
       </w:r>
-      <w:hyperlink r:id="rId7" w:history="1">
+      <w:hyperlink r:id="rId9" w:history="1">
         <w:r>
           <w:rPr>
             <w:rStyle w:val="Hyperlink"/>
@@ -2104,6 +3706,18 @@
     </w:p>
     <w:p>
       <w:pPr>
+        <w:spacing w:line="360" w:lineRule="auto"/>
+        <w:rPr>
+          <w:rFonts w:ascii="Arial" w:hAnsi="Arial" w:cs="Arial"/>
+          <w:b/>
+          <w:bCs/>
+          <w:sz w:val="28"/>
+          <w:szCs w:val="28"/>
+        </w:rPr>
+      </w:pPr>
+    </w:p>
+    <w:p>
+      <w:pPr>
         <w:pStyle w:val="Heading1"/>
         <w:spacing w:line="360" w:lineRule="auto"/>
         <w:rPr>
@@ -2138,7 +3752,7 @@
         </w:rPr>
         <w:t xml:space="preserve">Nothing to write. Run your document through </w:t>
       </w:r>
-      <w:hyperlink r:id="rId8" w:history="1">
+      <w:hyperlink r:id="rId10" w:history="1">
         <w:r>
           <w:rPr>
             <w:rStyle w:val="Hyperlink"/>
@@ -2169,12 +3783,12 @@
       </w:pPr>
     </w:p>
     <w:sectPr>
-      <w:headerReference w:type="even" r:id="rId9"/>
-      <w:headerReference w:type="default" r:id="rId10"/>
-      <w:footerReference w:type="even" r:id="rId11"/>
-      <w:footerReference w:type="default" r:id="rId12"/>
-      <w:headerReference w:type="first" r:id="rId13"/>
-      <w:footerReference w:type="first" r:id="rId14"/>
+      <w:headerReference w:type="even" r:id="rId11"/>
+      <w:headerReference w:type="default" r:id="rId12"/>
+      <w:footerReference w:type="even" r:id="rId13"/>
+      <w:footerReference w:type="default" r:id="rId14"/>
+      <w:headerReference w:type="first" r:id="rId15"/>
+      <w:footerReference w:type="first" r:id="rId16"/>
       <w:pgSz w:w="12240" w:h="15840"/>
       <w:pgMar w:top="1440" w:right="1440" w:bottom="1440" w:left="1440" w:header="720" w:footer="720" w:gutter="0"/>
       <w:cols w:space="720"/>
@@ -2229,7 +3843,6 @@
         <w:docPartUnique/>
       </w:docPartObj>
     </w:sdtPr>
-    <w:sdtEndPr/>
     <w:sdtContent>
       <w:sdt>
         <w:sdtPr>
@@ -2239,7 +3852,6 @@
             <w:docPartUnique/>
           </w:docPartObj>
         </w:sdtPr>
-        <w:sdtEndPr/>
         <w:sdtContent>
           <w:p>
             <w:pPr>
@@ -2287,14 +3899,27 @@
             <w:r>
               <w:t xml:space="preserve"> of </w:t>
             </w:r>
-            <w:fldSimple w:instr=" NUMPAGES  ">
-              <w:r>
-                <w:rPr>
-                  <w:noProof/>
-                </w:rPr>
-                <w:t>2</w:t>
-              </w:r>
-            </w:fldSimple>
+            <w:r>
+              <w:fldChar w:fldCharType="begin"/>
+            </w:r>
+            <w:r>
+              <w:instrText xml:space="preserve"> NUMPAGES  </w:instrText>
+            </w:r>
+            <w:r>
+              <w:fldChar w:fldCharType="separate"/>
+            </w:r>
+            <w:r>
+              <w:rPr>
+                <w:noProof/>
+              </w:rPr>
+              <w:t>2</w:t>
+            </w:r>
+            <w:r>
+              <w:rPr>
+                <w:noProof/>
+              </w:rPr>
+              <w:fldChar w:fldCharType="end"/>
+            </w:r>
           </w:p>
         </w:sdtContent>
       </w:sdt>
@@ -3540,7 +5165,6 @@
   <w:style w:type="character" w:default="1" w:styleId="DefaultParagraphFont">
     <w:name w:val="Default Paragraph Font"/>
     <w:uiPriority w:val="1"/>
-    <w:semiHidden/>
     <w:unhideWhenUsed/>
   </w:style>
   <w:style w:type="table" w:default="1" w:styleId="TableNormal">

</xml_diff>